<commit_message>
Summary doc: switch font to Leelawadee UI (modern Thai)
</commit_message>
<xml_diff>
--- a/RSC-Connect-สรุประบบ.docx
+++ b/RSC-Connect-สรุประบบ.docx
@@ -55,7 +55,7 @@
       </w:pPr>
       <w:r>
         <w:rPr>
-          <w:rFonts w:ascii="Tahoma" w:cs="Tahoma" w:eastAsia="Tahoma" w:hAnsi="Tahoma"/>
+          <w:rFonts w:ascii="Leelawadee UI" w:cs="Leelawadee UI" w:eastAsia="Leelawadee UI" w:hAnsi="Leelawadee UI"/>
           <w:b/>
           <w:bCs/>
           <w:color w:val="E85D04"/>
@@ -72,7 +72,7 @@
       </w:pPr>
       <w:r>
         <w:rPr>
-          <w:rFonts w:ascii="Tahoma" w:cs="Tahoma" w:eastAsia="Tahoma" w:hAnsi="Tahoma"/>
+          <w:rFonts w:ascii="Leelawadee UI" w:cs="Leelawadee UI" w:eastAsia="Leelawadee UI" w:hAnsi="Leelawadee UI"/>
           <w:color w:val="1A1A1A"/>
           <w:sz w:val="26"/>
           <w:szCs w:val="26"/>
@@ -87,7 +87,7 @@
       </w:pPr>
       <w:r>
         <w:rPr>
-          <w:rFonts w:ascii="Tahoma" w:cs="Tahoma" w:eastAsia="Tahoma" w:hAnsi="Tahoma"/>
+          <w:rFonts w:ascii="Leelawadee UI" w:cs="Leelawadee UI" w:eastAsia="Leelawadee UI" w:hAnsi="Leelawadee UI"/>
           <w:color w:val="666666"/>
           <w:sz w:val="22"/>
           <w:szCs w:val="22"/>
@@ -102,7 +102,7 @@
       </w:pPr>
       <w:r>
         <w:rPr>
-          <w:rFonts w:ascii="Tahoma" w:cs="Tahoma" w:eastAsia="Tahoma" w:hAnsi="Tahoma"/>
+          <w:rFonts w:ascii="Leelawadee UI" w:cs="Leelawadee UI" w:eastAsia="Leelawadee UI" w:hAnsi="Leelawadee UI"/>
           <w:i/>
           <w:iCs/>
           <w:color w:val="888888"/>
@@ -124,7 +124,7 @@
       </w:pPr>
       <w:r>
         <w:rPr>
-          <w:rFonts w:ascii="Tahoma" w:cs="Tahoma" w:eastAsia="Tahoma" w:hAnsi="Tahoma"/>
+          <w:rFonts w:ascii="Leelawadee UI" w:cs="Leelawadee UI" w:eastAsia="Leelawadee UI" w:hAnsi="Leelawadee UI"/>
           <w:b/>
           <w:bCs/>
           <w:color w:val="E85D04"/>
@@ -140,7 +140,7 @@
       </w:pPr>
       <w:r>
         <w:rPr>
-          <w:rFonts w:ascii="Tahoma" w:cs="Tahoma" w:eastAsia="Tahoma" w:hAnsi="Tahoma"/>
+          <w:rFonts w:ascii="Leelawadee UI" w:cs="Leelawadee UI" w:eastAsia="Leelawadee UI" w:hAnsi="Leelawadee UI"/>
           <w:b/>
           <w:bCs/>
           <w:sz w:val="20"/>
@@ -150,7 +150,7 @@
       </w:r>
       <w:r>
         <w:rPr>
-          <w:rFonts w:ascii="Tahoma" w:cs="Tahoma" w:eastAsia="Tahoma" w:hAnsi="Tahoma"/>
+          <w:rFonts w:ascii="Leelawadee UI" w:cs="Leelawadee UI" w:eastAsia="Leelawadee UI" w:hAnsi="Leelawadee UI"/>
           <w:sz w:val="20"/>
           <w:szCs w:val="20"/>
         </w:rPr>
@@ -163,7 +163,7 @@
       </w:pPr>
       <w:r>
         <w:rPr>
-          <w:rFonts w:ascii="Tahoma" w:cs="Tahoma" w:eastAsia="Tahoma" w:hAnsi="Tahoma"/>
+          <w:rFonts w:ascii="Leelawadee UI" w:cs="Leelawadee UI" w:eastAsia="Leelawadee UI" w:hAnsi="Leelawadee UI"/>
           <w:sz w:val="20"/>
           <w:szCs w:val="20"/>
         </w:rPr>
@@ -181,7 +181,7 @@
       </w:pPr>
       <w:r>
         <w:rPr>
-          <w:rFonts w:ascii="Tahoma" w:cs="Tahoma" w:eastAsia="Tahoma" w:hAnsi="Tahoma"/>
+          <w:rFonts w:ascii="Leelawadee UI" w:cs="Leelawadee UI" w:eastAsia="Leelawadee UI" w:hAnsi="Leelawadee UI"/>
           <w:b/>
           <w:bCs/>
           <w:sz w:val="20"/>
@@ -191,7 +191,7 @@
       </w:r>
       <w:r>
         <w:rPr>
-          <w:rFonts w:ascii="Tahoma" w:cs="Tahoma" w:eastAsia="Tahoma" w:hAnsi="Tahoma"/>
+          <w:rFonts w:ascii="Leelawadee UI" w:cs="Leelawadee UI" w:eastAsia="Leelawadee UI" w:hAnsi="Leelawadee UI"/>
           <w:sz w:val="20"/>
           <w:szCs w:val="20"/>
         </w:rPr>
@@ -209,7 +209,7 @@
       </w:pPr>
       <w:r>
         <w:rPr>
-          <w:rFonts w:ascii="Tahoma" w:cs="Tahoma" w:eastAsia="Tahoma" w:hAnsi="Tahoma"/>
+          <w:rFonts w:ascii="Leelawadee UI" w:cs="Leelawadee UI" w:eastAsia="Leelawadee UI" w:hAnsi="Leelawadee UI"/>
           <w:b/>
           <w:bCs/>
           <w:sz w:val="20"/>
@@ -219,7 +219,7 @@
       </w:r>
       <w:r>
         <w:rPr>
-          <w:rFonts w:ascii="Tahoma" w:cs="Tahoma" w:eastAsia="Tahoma" w:hAnsi="Tahoma"/>
+          <w:rFonts w:ascii="Leelawadee UI" w:cs="Leelawadee UI" w:eastAsia="Leelawadee UI" w:hAnsi="Leelawadee UI"/>
           <w:sz w:val="20"/>
           <w:szCs w:val="20"/>
         </w:rPr>
@@ -232,7 +232,7 @@
       </w:pPr>
       <w:r>
         <w:rPr>
-          <w:rFonts w:ascii="Tahoma" w:cs="Tahoma" w:eastAsia="Tahoma" w:hAnsi="Tahoma"/>
+          <w:rFonts w:ascii="Leelawadee UI" w:cs="Leelawadee UI" w:eastAsia="Leelawadee UI" w:hAnsi="Leelawadee UI"/>
           <w:sz w:val="20"/>
           <w:szCs w:val="20"/>
         </w:rPr>
@@ -246,7 +246,7 @@
       </w:pPr>
       <w:r>
         <w:rPr>
-          <w:rFonts w:ascii="Tahoma" w:cs="Tahoma" w:eastAsia="Tahoma" w:hAnsi="Tahoma"/>
+          <w:rFonts w:ascii="Leelawadee UI" w:cs="Leelawadee UI" w:eastAsia="Leelawadee UI" w:hAnsi="Leelawadee UI"/>
           <w:b/>
           <w:bCs/>
           <w:color w:val="E85D04"/>
@@ -262,7 +262,7 @@
       </w:pPr>
       <w:r>
         <w:rPr>
-          <w:rFonts w:ascii="Tahoma" w:cs="Tahoma" w:eastAsia="Tahoma" w:hAnsi="Tahoma"/>
+          <w:rFonts w:ascii="Leelawadee UI" w:cs="Leelawadee UI" w:eastAsia="Leelawadee UI" w:hAnsi="Leelawadee UI"/>
           <w:sz w:val="20"/>
           <w:szCs w:val="20"/>
         </w:rPr>
@@ -275,7 +275,7 @@
       </w:pPr>
       <w:r>
         <w:rPr>
-          <w:rFonts w:ascii="Tahoma" w:cs="Tahoma" w:eastAsia="Tahoma" w:hAnsi="Tahoma"/>
+          <w:rFonts w:ascii="Leelawadee UI" w:cs="Leelawadee UI" w:eastAsia="Leelawadee UI" w:hAnsi="Leelawadee UI"/>
           <w:b/>
           <w:bCs/>
           <w:sz w:val="20"/>
@@ -285,7 +285,7 @@
       </w:r>
       <w:r>
         <w:rPr>
-          <w:rFonts w:ascii="Tahoma" w:cs="Tahoma" w:eastAsia="Tahoma" w:hAnsi="Tahoma"/>
+          <w:rFonts w:ascii="Leelawadee UI" w:cs="Leelawadee UI" w:eastAsia="Leelawadee UI" w:hAnsi="Leelawadee UI"/>
           <w:sz w:val="20"/>
           <w:szCs w:val="20"/>
         </w:rPr>
@@ -293,7 +293,7 @@
       </w:r>
       <w:r>
         <w:rPr>
-          <w:rFonts w:ascii="Tahoma" w:cs="Tahoma" w:eastAsia="Tahoma" w:hAnsi="Tahoma"/>
+          <w:rFonts w:ascii="Leelawadee UI" w:cs="Leelawadee UI" w:eastAsia="Leelawadee UI" w:hAnsi="Leelawadee UI"/>
           <w:b/>
           <w:bCs/>
           <w:sz w:val="20"/>
@@ -303,7 +303,7 @@
       </w:r>
       <w:r>
         <w:rPr>
-          <w:rFonts w:ascii="Tahoma" w:cs="Tahoma" w:eastAsia="Tahoma" w:hAnsi="Tahoma"/>
+          <w:rFonts w:ascii="Leelawadee UI" w:cs="Leelawadee UI" w:eastAsia="Leelawadee UI" w:hAnsi="Leelawadee UI"/>
           <w:sz w:val="20"/>
           <w:szCs w:val="20"/>
         </w:rPr>
@@ -311,7 +311,7 @@
       </w:r>
       <w:r>
         <w:rPr>
-          <w:rFonts w:ascii="Tahoma" w:cs="Tahoma" w:eastAsia="Tahoma" w:hAnsi="Tahoma"/>
+          <w:rFonts w:ascii="Leelawadee UI" w:cs="Leelawadee UI" w:eastAsia="Leelawadee UI" w:hAnsi="Leelawadee UI"/>
           <w:b/>
           <w:bCs/>
           <w:sz w:val="20"/>
@@ -321,7 +321,7 @@
       </w:r>
       <w:r>
         <w:rPr>
-          <w:rFonts w:ascii="Tahoma" w:cs="Tahoma" w:eastAsia="Tahoma" w:hAnsi="Tahoma"/>
+          <w:rFonts w:ascii="Leelawadee UI" w:cs="Leelawadee UI" w:eastAsia="Leelawadee UI" w:hAnsi="Leelawadee UI"/>
           <w:sz w:val="20"/>
           <w:szCs w:val="20"/>
         </w:rPr>
@@ -329,7 +329,7 @@
       </w:r>
       <w:r>
         <w:rPr>
-          <w:rFonts w:ascii="Tahoma" w:cs="Tahoma" w:eastAsia="Tahoma" w:hAnsi="Tahoma"/>
+          <w:rFonts w:ascii="Leelawadee UI" w:cs="Leelawadee UI" w:eastAsia="Leelawadee UI" w:hAnsi="Leelawadee UI"/>
           <w:b/>
           <w:bCs/>
           <w:sz w:val="20"/>
@@ -339,7 +339,7 @@
       </w:r>
       <w:r>
         <w:rPr>
-          <w:rFonts w:ascii="Tahoma" w:cs="Tahoma" w:eastAsia="Tahoma" w:hAnsi="Tahoma"/>
+          <w:rFonts w:ascii="Leelawadee UI" w:cs="Leelawadee UI" w:eastAsia="Leelawadee UI" w:hAnsi="Leelawadee UI"/>
           <w:sz w:val="20"/>
           <w:szCs w:val="20"/>
         </w:rPr>
@@ -347,7 +347,7 @@
       </w:r>
       <w:r>
         <w:rPr>
-          <w:rFonts w:ascii="Tahoma" w:cs="Tahoma" w:eastAsia="Tahoma" w:hAnsi="Tahoma"/>
+          <w:rFonts w:ascii="Leelawadee UI" w:cs="Leelawadee UI" w:eastAsia="Leelawadee UI" w:hAnsi="Leelawadee UI"/>
           <w:b/>
           <w:bCs/>
           <w:sz w:val="20"/>
@@ -357,7 +357,7 @@
       </w:r>
       <w:r>
         <w:rPr>
-          <w:rFonts w:ascii="Tahoma" w:cs="Tahoma" w:eastAsia="Tahoma" w:hAnsi="Tahoma"/>
+          <w:rFonts w:ascii="Leelawadee UI" w:cs="Leelawadee UI" w:eastAsia="Leelawadee UI" w:hAnsi="Leelawadee UI"/>
           <w:sz w:val="20"/>
           <w:szCs w:val="20"/>
         </w:rPr>
@@ -365,7 +365,7 @@
       </w:r>
       <w:r>
         <w:rPr>
-          <w:rFonts w:ascii="Tahoma" w:cs="Tahoma" w:eastAsia="Tahoma" w:hAnsi="Tahoma"/>
+          <w:rFonts w:ascii="Leelawadee UI" w:cs="Leelawadee UI" w:eastAsia="Leelawadee UI" w:hAnsi="Leelawadee UI"/>
           <w:b/>
           <w:bCs/>
           <w:sz w:val="20"/>
@@ -381,7 +381,7 @@
       </w:pPr>
       <w:r>
         <w:rPr>
-          <w:rFonts w:ascii="Tahoma" w:cs="Tahoma" w:eastAsia="Tahoma" w:hAnsi="Tahoma"/>
+          <w:rFonts w:ascii="Leelawadee UI" w:cs="Leelawadee UI" w:eastAsia="Leelawadee UI" w:hAnsi="Leelawadee UI"/>
           <w:b/>
           <w:bCs/>
           <w:color w:val="1A1A1A"/>
@@ -429,7 +429,7 @@
             </w:pPr>
             <w:r>
               <w:rPr>
-                <w:rFonts w:ascii="Tahoma" w:cs="Tahoma" w:eastAsia="Tahoma" w:hAnsi="Tahoma"/>
+                <w:rFonts w:ascii="Leelawadee UI" w:cs="Leelawadee UI" w:eastAsia="Leelawadee UI" w:hAnsi="Leelawadee UI"/>
                 <w:b/>
                 <w:bCs/>
                 <w:color w:val="FFFFFF"/>
@@ -457,7 +457,7 @@
             </w:pPr>
             <w:r>
               <w:rPr>
-                <w:rFonts w:ascii="Tahoma" w:cs="Tahoma" w:eastAsia="Tahoma" w:hAnsi="Tahoma"/>
+                <w:rFonts w:ascii="Leelawadee UI" w:cs="Leelawadee UI" w:eastAsia="Leelawadee UI" w:hAnsi="Leelawadee UI"/>
                 <w:b/>
                 <w:bCs/>
                 <w:color w:val="FFFFFF"/>
@@ -485,7 +485,7 @@
             </w:pPr>
             <w:r>
               <w:rPr>
-                <w:rFonts w:ascii="Tahoma" w:cs="Tahoma" w:eastAsia="Tahoma" w:hAnsi="Tahoma"/>
+                <w:rFonts w:ascii="Leelawadee UI" w:cs="Leelawadee UI" w:eastAsia="Leelawadee UI" w:hAnsi="Leelawadee UI"/>
                 <w:b/>
                 <w:bCs/>
                 <w:color w:val="FFFFFF"/>
@@ -517,7 +517,7 @@
             </w:pPr>
             <w:r>
               <w:rPr>
-                <w:rFonts w:ascii="Tahoma" w:cs="Tahoma" w:eastAsia="Tahoma" w:hAnsi="Tahoma"/>
+                <w:rFonts w:ascii="Leelawadee UI" w:cs="Leelawadee UI" w:eastAsia="Leelawadee UI" w:hAnsi="Leelawadee UI"/>
                 <w:b w:val="false"/>
                 <w:bCs w:val="false"/>
                 <w:color w:val="1A1A1A"/>
@@ -544,7 +544,7 @@
             </w:pPr>
             <w:r>
               <w:rPr>
-                <w:rFonts w:ascii="Tahoma" w:cs="Tahoma" w:eastAsia="Tahoma" w:hAnsi="Tahoma"/>
+                <w:rFonts w:ascii="Leelawadee UI" w:cs="Leelawadee UI" w:eastAsia="Leelawadee UI" w:hAnsi="Leelawadee UI"/>
                 <w:b w:val="false"/>
                 <w:bCs w:val="false"/>
                 <w:color w:val="1A1A1A"/>
@@ -571,7 +571,7 @@
             </w:pPr>
             <w:r>
               <w:rPr>
-                <w:rFonts w:ascii="Tahoma" w:cs="Tahoma" w:eastAsia="Tahoma" w:hAnsi="Tahoma"/>
+                <w:rFonts w:ascii="Leelawadee UI" w:cs="Leelawadee UI" w:eastAsia="Leelawadee UI" w:hAnsi="Leelawadee UI"/>
                 <w:b w:val="false"/>
                 <w:bCs w:val="false"/>
                 <w:color w:val="1A1A1A"/>
@@ -604,7 +604,7 @@
             </w:pPr>
             <w:r>
               <w:rPr>
-                <w:rFonts w:ascii="Tahoma" w:cs="Tahoma" w:eastAsia="Tahoma" w:hAnsi="Tahoma"/>
+                <w:rFonts w:ascii="Leelawadee UI" w:cs="Leelawadee UI" w:eastAsia="Leelawadee UI" w:hAnsi="Leelawadee UI"/>
                 <w:b w:val="false"/>
                 <w:bCs w:val="false"/>
                 <w:color w:val="1A1A1A"/>
@@ -632,7 +632,7 @@
             </w:pPr>
             <w:r>
               <w:rPr>
-                <w:rFonts w:ascii="Tahoma" w:cs="Tahoma" w:eastAsia="Tahoma" w:hAnsi="Tahoma"/>
+                <w:rFonts w:ascii="Leelawadee UI" w:cs="Leelawadee UI" w:eastAsia="Leelawadee UI" w:hAnsi="Leelawadee UI"/>
                 <w:b w:val="false"/>
                 <w:bCs w:val="false"/>
                 <w:color w:val="1A1A1A"/>
@@ -660,7 +660,7 @@
             </w:pPr>
             <w:r>
               <w:rPr>
-                <w:rFonts w:ascii="Tahoma" w:cs="Tahoma" w:eastAsia="Tahoma" w:hAnsi="Tahoma"/>
+                <w:rFonts w:ascii="Leelawadee UI" w:cs="Leelawadee UI" w:eastAsia="Leelawadee UI" w:hAnsi="Leelawadee UI"/>
                 <w:b w:val="false"/>
                 <w:bCs w:val="false"/>
                 <w:color w:val="1A1A1A"/>
@@ -692,7 +692,7 @@
             </w:pPr>
             <w:r>
               <w:rPr>
-                <w:rFonts w:ascii="Tahoma" w:cs="Tahoma" w:eastAsia="Tahoma" w:hAnsi="Tahoma"/>
+                <w:rFonts w:ascii="Leelawadee UI" w:cs="Leelawadee UI" w:eastAsia="Leelawadee UI" w:hAnsi="Leelawadee UI"/>
                 <w:b w:val="false"/>
                 <w:bCs w:val="false"/>
                 <w:color w:val="1A1A1A"/>
@@ -719,7 +719,7 @@
             </w:pPr>
             <w:r>
               <w:rPr>
-                <w:rFonts w:ascii="Tahoma" w:cs="Tahoma" w:eastAsia="Tahoma" w:hAnsi="Tahoma"/>
+                <w:rFonts w:ascii="Leelawadee UI" w:cs="Leelawadee UI" w:eastAsia="Leelawadee UI" w:hAnsi="Leelawadee UI"/>
                 <w:b w:val="false"/>
                 <w:bCs w:val="false"/>
                 <w:color w:val="1A1A1A"/>
@@ -746,7 +746,7 @@
             </w:pPr>
             <w:r>
               <w:rPr>
-                <w:rFonts w:ascii="Tahoma" w:cs="Tahoma" w:eastAsia="Tahoma" w:hAnsi="Tahoma"/>
+                <w:rFonts w:ascii="Leelawadee UI" w:cs="Leelawadee UI" w:eastAsia="Leelawadee UI" w:hAnsi="Leelawadee UI"/>
                 <w:b w:val="false"/>
                 <w:bCs w:val="false"/>
                 <w:color w:val="1A1A1A"/>
@@ -779,7 +779,7 @@
             </w:pPr>
             <w:r>
               <w:rPr>
-                <w:rFonts w:ascii="Tahoma" w:cs="Tahoma" w:eastAsia="Tahoma" w:hAnsi="Tahoma"/>
+                <w:rFonts w:ascii="Leelawadee UI" w:cs="Leelawadee UI" w:eastAsia="Leelawadee UI" w:hAnsi="Leelawadee UI"/>
                 <w:b w:val="false"/>
                 <w:bCs w:val="false"/>
                 <w:color w:val="1A1A1A"/>
@@ -807,7 +807,7 @@
             </w:pPr>
             <w:r>
               <w:rPr>
-                <w:rFonts w:ascii="Tahoma" w:cs="Tahoma" w:eastAsia="Tahoma" w:hAnsi="Tahoma"/>
+                <w:rFonts w:ascii="Leelawadee UI" w:cs="Leelawadee UI" w:eastAsia="Leelawadee UI" w:hAnsi="Leelawadee UI"/>
                 <w:b w:val="false"/>
                 <w:bCs w:val="false"/>
                 <w:color w:val="1A1A1A"/>
@@ -835,7 +835,7 @@
             </w:pPr>
             <w:r>
               <w:rPr>
-                <w:rFonts w:ascii="Tahoma" w:cs="Tahoma" w:eastAsia="Tahoma" w:hAnsi="Tahoma"/>
+                <w:rFonts w:ascii="Leelawadee UI" w:cs="Leelawadee UI" w:eastAsia="Leelawadee UI" w:hAnsi="Leelawadee UI"/>
                 <w:b w:val="false"/>
                 <w:bCs w:val="false"/>
                 <w:color w:val="1A1A1A"/>
@@ -867,7 +867,7 @@
             </w:pPr>
             <w:r>
               <w:rPr>
-                <w:rFonts w:ascii="Tahoma" w:cs="Tahoma" w:eastAsia="Tahoma" w:hAnsi="Tahoma"/>
+                <w:rFonts w:ascii="Leelawadee UI" w:cs="Leelawadee UI" w:eastAsia="Leelawadee UI" w:hAnsi="Leelawadee UI"/>
                 <w:b w:val="false"/>
                 <w:bCs w:val="false"/>
                 <w:color w:val="1A1A1A"/>
@@ -894,7 +894,7 @@
             </w:pPr>
             <w:r>
               <w:rPr>
-                <w:rFonts w:ascii="Tahoma" w:cs="Tahoma" w:eastAsia="Tahoma" w:hAnsi="Tahoma"/>
+                <w:rFonts w:ascii="Leelawadee UI" w:cs="Leelawadee UI" w:eastAsia="Leelawadee UI" w:hAnsi="Leelawadee UI"/>
                 <w:b w:val="false"/>
                 <w:bCs w:val="false"/>
                 <w:color w:val="1A1A1A"/>
@@ -921,7 +921,7 @@
             </w:pPr>
             <w:r>
               <w:rPr>
-                <w:rFonts w:ascii="Tahoma" w:cs="Tahoma" w:eastAsia="Tahoma" w:hAnsi="Tahoma"/>
+                <w:rFonts w:ascii="Leelawadee UI" w:cs="Leelawadee UI" w:eastAsia="Leelawadee UI" w:hAnsi="Leelawadee UI"/>
                 <w:b w:val="false"/>
                 <w:bCs w:val="false"/>
                 <w:color w:val="1A1A1A"/>
@@ -954,7 +954,7 @@
             </w:pPr>
             <w:r>
               <w:rPr>
-                <w:rFonts w:ascii="Tahoma" w:cs="Tahoma" w:eastAsia="Tahoma" w:hAnsi="Tahoma"/>
+                <w:rFonts w:ascii="Leelawadee UI" w:cs="Leelawadee UI" w:eastAsia="Leelawadee UI" w:hAnsi="Leelawadee UI"/>
                 <w:b w:val="false"/>
                 <w:bCs w:val="false"/>
                 <w:color w:val="1A1A1A"/>
@@ -982,7 +982,7 @@
             </w:pPr>
             <w:r>
               <w:rPr>
-                <w:rFonts w:ascii="Tahoma" w:cs="Tahoma" w:eastAsia="Tahoma" w:hAnsi="Tahoma"/>
+                <w:rFonts w:ascii="Leelawadee UI" w:cs="Leelawadee UI" w:eastAsia="Leelawadee UI" w:hAnsi="Leelawadee UI"/>
                 <w:b w:val="false"/>
                 <w:bCs w:val="false"/>
                 <w:color w:val="1A1A1A"/>
@@ -1010,7 +1010,7 @@
             </w:pPr>
             <w:r>
               <w:rPr>
-                <w:rFonts w:ascii="Tahoma" w:cs="Tahoma" w:eastAsia="Tahoma" w:hAnsi="Tahoma"/>
+                <w:rFonts w:ascii="Leelawadee UI" w:cs="Leelawadee UI" w:eastAsia="Leelawadee UI" w:hAnsi="Leelawadee UI"/>
                 <w:b w:val="false"/>
                 <w:bCs w:val="false"/>
                 <w:color w:val="1A1A1A"/>
@@ -1042,7 +1042,7 @@
             </w:pPr>
             <w:r>
               <w:rPr>
-                <w:rFonts w:ascii="Tahoma" w:cs="Tahoma" w:eastAsia="Tahoma" w:hAnsi="Tahoma"/>
+                <w:rFonts w:ascii="Leelawadee UI" w:cs="Leelawadee UI" w:eastAsia="Leelawadee UI" w:hAnsi="Leelawadee UI"/>
                 <w:b w:val="false"/>
                 <w:bCs w:val="false"/>
                 <w:color w:val="1A1A1A"/>
@@ -1069,7 +1069,7 @@
             </w:pPr>
             <w:r>
               <w:rPr>
-                <w:rFonts w:ascii="Tahoma" w:cs="Tahoma" w:eastAsia="Tahoma" w:hAnsi="Tahoma"/>
+                <w:rFonts w:ascii="Leelawadee UI" w:cs="Leelawadee UI" w:eastAsia="Leelawadee UI" w:hAnsi="Leelawadee UI"/>
                 <w:b w:val="false"/>
                 <w:bCs w:val="false"/>
                 <w:color w:val="1A1A1A"/>
@@ -1096,7 +1096,7 @@
             </w:pPr>
             <w:r>
               <w:rPr>
-                <w:rFonts w:ascii="Tahoma" w:cs="Tahoma" w:eastAsia="Tahoma" w:hAnsi="Tahoma"/>
+                <w:rFonts w:ascii="Leelawadee UI" w:cs="Leelawadee UI" w:eastAsia="Leelawadee UI" w:hAnsi="Leelawadee UI"/>
                 <w:b w:val="false"/>
                 <w:bCs w:val="false"/>
                 <w:color w:val="1A1A1A"/>
@@ -1121,7 +1121,7 @@
       </w:pPr>
       <w:r>
         <w:rPr>
-          <w:rFonts w:ascii="Tahoma" w:cs="Tahoma" w:eastAsia="Tahoma" w:hAnsi="Tahoma"/>
+          <w:rFonts w:ascii="Leelawadee UI" w:cs="Leelawadee UI" w:eastAsia="Leelawadee UI" w:hAnsi="Leelawadee UI"/>
           <w:b/>
           <w:bCs/>
           <w:color w:val="E85D04"/>
@@ -1138,7 +1138,7 @@
       </w:pPr>
       <w:r>
         <w:rPr>
-          <w:rFonts w:ascii="Tahoma" w:cs="Tahoma" w:eastAsia="Tahoma" w:hAnsi="Tahoma"/>
+          <w:rFonts w:ascii="Leelawadee UI" w:cs="Leelawadee UI" w:eastAsia="Leelawadee UI" w:hAnsi="Leelawadee UI"/>
           <w:b/>
           <w:bCs/>
           <w:color w:val="1A1A1A"/>
@@ -1154,7 +1154,7 @@
       </w:pPr>
       <w:r>
         <w:rPr>
-          <w:rFonts w:ascii="Tahoma" w:cs="Tahoma" w:eastAsia="Tahoma" w:hAnsi="Tahoma"/>
+          <w:rFonts w:ascii="Leelawadee UI" w:cs="Leelawadee UI" w:eastAsia="Leelawadee UI" w:hAnsi="Leelawadee UI"/>
           <w:sz w:val="20"/>
           <w:szCs w:val="20"/>
         </w:rPr>
@@ -1214,7 +1214,7 @@
       </w:pPr>
       <w:r>
         <w:rPr>
-          <w:rFonts w:ascii="Tahoma" w:cs="Tahoma" w:eastAsia="Tahoma" w:hAnsi="Tahoma"/>
+          <w:rFonts w:ascii="Leelawadee UI" w:cs="Leelawadee UI" w:eastAsia="Leelawadee UI" w:hAnsi="Leelawadee UI"/>
           <w:i/>
           <w:iCs/>
           <w:color w:val="666666"/>
@@ -1236,7 +1236,7 @@
       </w:pPr>
       <w:r>
         <w:rPr>
-          <w:rFonts w:ascii="Tahoma" w:cs="Tahoma" w:eastAsia="Tahoma" w:hAnsi="Tahoma"/>
+          <w:rFonts w:ascii="Leelawadee UI" w:cs="Leelawadee UI" w:eastAsia="Leelawadee UI" w:hAnsi="Leelawadee UI"/>
           <w:b/>
           <w:bCs/>
           <w:color w:val="1A1A1A"/>
@@ -1252,7 +1252,7 @@
       </w:pPr>
       <w:r>
         <w:rPr>
-          <w:rFonts w:ascii="Tahoma" w:cs="Tahoma" w:eastAsia="Tahoma" w:hAnsi="Tahoma"/>
+          <w:rFonts w:ascii="Leelawadee UI" w:cs="Leelawadee UI" w:eastAsia="Leelawadee UI" w:hAnsi="Leelawadee UI"/>
           <w:sz w:val="20"/>
           <w:szCs w:val="20"/>
         </w:rPr>
@@ -1312,7 +1312,7 @@
       </w:pPr>
       <w:r>
         <w:rPr>
-          <w:rFonts w:ascii="Tahoma" w:cs="Tahoma" w:eastAsia="Tahoma" w:hAnsi="Tahoma"/>
+          <w:rFonts w:ascii="Leelawadee UI" w:cs="Leelawadee UI" w:eastAsia="Leelawadee UI" w:hAnsi="Leelawadee UI"/>
           <w:i/>
           <w:iCs/>
           <w:color w:val="666666"/>
@@ -1334,7 +1334,7 @@
       </w:pPr>
       <w:r>
         <w:rPr>
-          <w:rFonts w:ascii="Tahoma" w:cs="Tahoma" w:eastAsia="Tahoma" w:hAnsi="Tahoma"/>
+          <w:rFonts w:ascii="Leelawadee UI" w:cs="Leelawadee UI" w:eastAsia="Leelawadee UI" w:hAnsi="Leelawadee UI"/>
           <w:b/>
           <w:bCs/>
           <w:color w:val="1A1A1A"/>
@@ -1397,7 +1397,7 @@
       </w:pPr>
       <w:r>
         <w:rPr>
-          <w:rFonts w:ascii="Tahoma" w:cs="Tahoma" w:eastAsia="Tahoma" w:hAnsi="Tahoma"/>
+          <w:rFonts w:ascii="Leelawadee UI" w:cs="Leelawadee UI" w:eastAsia="Leelawadee UI" w:hAnsi="Leelawadee UI"/>
           <w:i/>
           <w:iCs/>
           <w:color w:val="666666"/>
@@ -1419,7 +1419,7 @@
       </w:pPr>
       <w:r>
         <w:rPr>
-          <w:rFonts w:ascii="Tahoma" w:cs="Tahoma" w:eastAsia="Tahoma" w:hAnsi="Tahoma"/>
+          <w:rFonts w:ascii="Leelawadee UI" w:cs="Leelawadee UI" w:eastAsia="Leelawadee UI" w:hAnsi="Leelawadee UI"/>
           <w:b/>
           <w:bCs/>
           <w:color w:val="1A1A1A"/>
@@ -1482,7 +1482,7 @@
       </w:pPr>
       <w:r>
         <w:rPr>
-          <w:rFonts w:ascii="Tahoma" w:cs="Tahoma" w:eastAsia="Tahoma" w:hAnsi="Tahoma"/>
+          <w:rFonts w:ascii="Leelawadee UI" w:cs="Leelawadee UI" w:eastAsia="Leelawadee UI" w:hAnsi="Leelawadee UI"/>
           <w:i/>
           <w:iCs/>
           <w:color w:val="666666"/>
@@ -1504,7 +1504,7 @@
       </w:pPr>
       <w:r>
         <w:rPr>
-          <w:rFonts w:ascii="Tahoma" w:cs="Tahoma" w:eastAsia="Tahoma" w:hAnsi="Tahoma"/>
+          <w:rFonts w:ascii="Leelawadee UI" w:cs="Leelawadee UI" w:eastAsia="Leelawadee UI" w:hAnsi="Leelawadee UI"/>
           <w:b/>
           <w:bCs/>
           <w:color w:val="1A1A1A"/>
@@ -1567,7 +1567,7 @@
       </w:pPr>
       <w:r>
         <w:rPr>
-          <w:rFonts w:ascii="Tahoma" w:cs="Tahoma" w:eastAsia="Tahoma" w:hAnsi="Tahoma"/>
+          <w:rFonts w:ascii="Leelawadee UI" w:cs="Leelawadee UI" w:eastAsia="Leelawadee UI" w:hAnsi="Leelawadee UI"/>
           <w:i/>
           <w:iCs/>
           <w:color w:val="666666"/>
@@ -1589,7 +1589,7 @@
       </w:pPr>
       <w:r>
         <w:rPr>
-          <w:rFonts w:ascii="Tahoma" w:cs="Tahoma" w:eastAsia="Tahoma" w:hAnsi="Tahoma"/>
+          <w:rFonts w:ascii="Leelawadee UI" w:cs="Leelawadee UI" w:eastAsia="Leelawadee UI" w:hAnsi="Leelawadee UI"/>
           <w:b/>
           <w:bCs/>
           <w:color w:val="1A1A1A"/>
@@ -1652,7 +1652,7 @@
       </w:pPr>
       <w:r>
         <w:rPr>
-          <w:rFonts w:ascii="Tahoma" w:cs="Tahoma" w:eastAsia="Tahoma" w:hAnsi="Tahoma"/>
+          <w:rFonts w:ascii="Leelawadee UI" w:cs="Leelawadee UI" w:eastAsia="Leelawadee UI" w:hAnsi="Leelawadee UI"/>
           <w:i/>
           <w:iCs/>
           <w:color w:val="666666"/>
@@ -1715,7 +1715,7 @@
       </w:pPr>
       <w:r>
         <w:rPr>
-          <w:rFonts w:ascii="Tahoma" w:cs="Tahoma" w:eastAsia="Tahoma" w:hAnsi="Tahoma"/>
+          <w:rFonts w:ascii="Leelawadee UI" w:cs="Leelawadee UI" w:eastAsia="Leelawadee UI" w:hAnsi="Leelawadee UI"/>
           <w:i/>
           <w:iCs/>
           <w:color w:val="666666"/>
@@ -1737,7 +1737,7 @@
       </w:pPr>
       <w:r>
         <w:rPr>
-          <w:rFonts w:ascii="Tahoma" w:cs="Tahoma" w:eastAsia="Tahoma" w:hAnsi="Tahoma"/>
+          <w:rFonts w:ascii="Leelawadee UI" w:cs="Leelawadee UI" w:eastAsia="Leelawadee UI" w:hAnsi="Leelawadee UI"/>
           <w:b/>
           <w:bCs/>
           <w:color w:val="E85D04"/>
@@ -1785,7 +1785,7 @@
             </w:pPr>
             <w:r>
               <w:rPr>
-                <w:rFonts w:ascii="Tahoma" w:cs="Tahoma" w:eastAsia="Tahoma" w:hAnsi="Tahoma"/>
+                <w:rFonts w:ascii="Leelawadee UI" w:cs="Leelawadee UI" w:eastAsia="Leelawadee UI" w:hAnsi="Leelawadee UI"/>
                 <w:b/>
                 <w:bCs/>
                 <w:color w:val="FFFFFF"/>
@@ -1813,7 +1813,7 @@
             </w:pPr>
             <w:r>
               <w:rPr>
-                <w:rFonts w:ascii="Tahoma" w:cs="Tahoma" w:eastAsia="Tahoma" w:hAnsi="Tahoma"/>
+                <w:rFonts w:ascii="Leelawadee UI" w:cs="Leelawadee UI" w:eastAsia="Leelawadee UI" w:hAnsi="Leelawadee UI"/>
                 <w:b/>
                 <w:bCs/>
                 <w:color w:val="FFFFFF"/>
@@ -1841,7 +1841,7 @@
             </w:pPr>
             <w:r>
               <w:rPr>
-                <w:rFonts w:ascii="Tahoma" w:cs="Tahoma" w:eastAsia="Tahoma" w:hAnsi="Tahoma"/>
+                <w:rFonts w:ascii="Leelawadee UI" w:cs="Leelawadee UI" w:eastAsia="Leelawadee UI" w:hAnsi="Leelawadee UI"/>
                 <w:b/>
                 <w:bCs/>
                 <w:color w:val="FFFFFF"/>
@@ -1873,7 +1873,7 @@
             </w:pPr>
             <w:r>
               <w:rPr>
-                <w:rFonts w:ascii="Tahoma" w:cs="Tahoma" w:eastAsia="Tahoma" w:hAnsi="Tahoma"/>
+                <w:rFonts w:ascii="Leelawadee UI" w:cs="Leelawadee UI" w:eastAsia="Leelawadee UI" w:hAnsi="Leelawadee UI"/>
                 <w:b w:val="false"/>
                 <w:bCs w:val="false"/>
                 <w:color w:val="1A1A1A"/>
@@ -1900,7 +1900,7 @@
             </w:pPr>
             <w:r>
               <w:rPr>
-                <w:rFonts w:ascii="Tahoma" w:cs="Tahoma" w:eastAsia="Tahoma" w:hAnsi="Tahoma"/>
+                <w:rFonts w:ascii="Leelawadee UI" w:cs="Leelawadee UI" w:eastAsia="Leelawadee UI" w:hAnsi="Leelawadee UI"/>
                 <w:b w:val="false"/>
                 <w:bCs w:val="false"/>
                 <w:color w:val="1A1A1A"/>
@@ -1927,7 +1927,7 @@
             </w:pPr>
             <w:r>
               <w:rPr>
-                <w:rFonts w:ascii="Tahoma" w:cs="Tahoma" w:eastAsia="Tahoma" w:hAnsi="Tahoma"/>
+                <w:rFonts w:ascii="Leelawadee UI" w:cs="Leelawadee UI" w:eastAsia="Leelawadee UI" w:hAnsi="Leelawadee UI"/>
                 <w:b w:val="false"/>
                 <w:bCs w:val="false"/>
                 <w:color w:val="1A1A1A"/>
@@ -1960,7 +1960,7 @@
             </w:pPr>
             <w:r>
               <w:rPr>
-                <w:rFonts w:ascii="Tahoma" w:cs="Tahoma" w:eastAsia="Tahoma" w:hAnsi="Tahoma"/>
+                <w:rFonts w:ascii="Leelawadee UI" w:cs="Leelawadee UI" w:eastAsia="Leelawadee UI" w:hAnsi="Leelawadee UI"/>
                 <w:b w:val="false"/>
                 <w:bCs w:val="false"/>
                 <w:color w:val="1A1A1A"/>
@@ -1988,7 +1988,7 @@
             </w:pPr>
             <w:r>
               <w:rPr>
-                <w:rFonts w:ascii="Tahoma" w:cs="Tahoma" w:eastAsia="Tahoma" w:hAnsi="Tahoma"/>
+                <w:rFonts w:ascii="Leelawadee UI" w:cs="Leelawadee UI" w:eastAsia="Leelawadee UI" w:hAnsi="Leelawadee UI"/>
                 <w:b w:val="false"/>
                 <w:bCs w:val="false"/>
                 <w:color w:val="1A1A1A"/>
@@ -2016,7 +2016,7 @@
             </w:pPr>
             <w:r>
               <w:rPr>
-                <w:rFonts w:ascii="Tahoma" w:cs="Tahoma" w:eastAsia="Tahoma" w:hAnsi="Tahoma"/>
+                <w:rFonts w:ascii="Leelawadee UI" w:cs="Leelawadee UI" w:eastAsia="Leelawadee UI" w:hAnsi="Leelawadee UI"/>
                 <w:b w:val="false"/>
                 <w:bCs w:val="false"/>
                 <w:color w:val="1A1A1A"/>
@@ -2048,7 +2048,7 @@
             </w:pPr>
             <w:r>
               <w:rPr>
-                <w:rFonts w:ascii="Tahoma" w:cs="Tahoma" w:eastAsia="Tahoma" w:hAnsi="Tahoma"/>
+                <w:rFonts w:ascii="Leelawadee UI" w:cs="Leelawadee UI" w:eastAsia="Leelawadee UI" w:hAnsi="Leelawadee UI"/>
                 <w:b w:val="false"/>
                 <w:bCs w:val="false"/>
                 <w:color w:val="1A1A1A"/>
@@ -2075,7 +2075,7 @@
             </w:pPr>
             <w:r>
               <w:rPr>
-                <w:rFonts w:ascii="Tahoma" w:cs="Tahoma" w:eastAsia="Tahoma" w:hAnsi="Tahoma"/>
+                <w:rFonts w:ascii="Leelawadee UI" w:cs="Leelawadee UI" w:eastAsia="Leelawadee UI" w:hAnsi="Leelawadee UI"/>
                 <w:b w:val="false"/>
                 <w:bCs w:val="false"/>
                 <w:color w:val="1A1A1A"/>
@@ -2102,7 +2102,7 @@
             </w:pPr>
             <w:r>
               <w:rPr>
-                <w:rFonts w:ascii="Tahoma" w:cs="Tahoma" w:eastAsia="Tahoma" w:hAnsi="Tahoma"/>
+                <w:rFonts w:ascii="Leelawadee UI" w:cs="Leelawadee UI" w:eastAsia="Leelawadee UI" w:hAnsi="Leelawadee UI"/>
                 <w:b w:val="false"/>
                 <w:bCs w:val="false"/>
                 <w:color w:val="1A1A1A"/>
@@ -2135,7 +2135,7 @@
             </w:pPr>
             <w:r>
               <w:rPr>
-                <w:rFonts w:ascii="Tahoma" w:cs="Tahoma" w:eastAsia="Tahoma" w:hAnsi="Tahoma"/>
+                <w:rFonts w:ascii="Leelawadee UI" w:cs="Leelawadee UI" w:eastAsia="Leelawadee UI" w:hAnsi="Leelawadee UI"/>
                 <w:b w:val="false"/>
                 <w:bCs w:val="false"/>
                 <w:color w:val="1A1A1A"/>
@@ -2163,7 +2163,7 @@
             </w:pPr>
             <w:r>
               <w:rPr>
-                <w:rFonts w:ascii="Tahoma" w:cs="Tahoma" w:eastAsia="Tahoma" w:hAnsi="Tahoma"/>
+                <w:rFonts w:ascii="Leelawadee UI" w:cs="Leelawadee UI" w:eastAsia="Leelawadee UI" w:hAnsi="Leelawadee UI"/>
                 <w:b w:val="false"/>
                 <w:bCs w:val="false"/>
                 <w:color w:val="1A1A1A"/>
@@ -2191,7 +2191,7 @@
             </w:pPr>
             <w:r>
               <w:rPr>
-                <w:rFonts w:ascii="Tahoma" w:cs="Tahoma" w:eastAsia="Tahoma" w:hAnsi="Tahoma"/>
+                <w:rFonts w:ascii="Leelawadee UI" w:cs="Leelawadee UI" w:eastAsia="Leelawadee UI" w:hAnsi="Leelawadee UI"/>
                 <w:b w:val="false"/>
                 <w:bCs w:val="false"/>
                 <w:color w:val="1A1A1A"/>
@@ -2223,7 +2223,7 @@
             </w:pPr>
             <w:r>
               <w:rPr>
-                <w:rFonts w:ascii="Tahoma" w:cs="Tahoma" w:eastAsia="Tahoma" w:hAnsi="Tahoma"/>
+                <w:rFonts w:ascii="Leelawadee UI" w:cs="Leelawadee UI" w:eastAsia="Leelawadee UI" w:hAnsi="Leelawadee UI"/>
                 <w:b w:val="false"/>
                 <w:bCs w:val="false"/>
                 <w:color w:val="1A1A1A"/>
@@ -2250,7 +2250,7 @@
             </w:pPr>
             <w:r>
               <w:rPr>
-                <w:rFonts w:ascii="Tahoma" w:cs="Tahoma" w:eastAsia="Tahoma" w:hAnsi="Tahoma"/>
+                <w:rFonts w:ascii="Leelawadee UI" w:cs="Leelawadee UI" w:eastAsia="Leelawadee UI" w:hAnsi="Leelawadee UI"/>
                 <w:b w:val="false"/>
                 <w:bCs w:val="false"/>
                 <w:color w:val="1A1A1A"/>
@@ -2277,7 +2277,7 @@
             </w:pPr>
             <w:r>
               <w:rPr>
-                <w:rFonts w:ascii="Tahoma" w:cs="Tahoma" w:eastAsia="Tahoma" w:hAnsi="Tahoma"/>
+                <w:rFonts w:ascii="Leelawadee UI" w:cs="Leelawadee UI" w:eastAsia="Leelawadee UI" w:hAnsi="Leelawadee UI"/>
                 <w:b w:val="false"/>
                 <w:bCs w:val="false"/>
                 <w:color w:val="1A1A1A"/>
@@ -2310,7 +2310,7 @@
             </w:pPr>
             <w:r>
               <w:rPr>
-                <w:rFonts w:ascii="Tahoma" w:cs="Tahoma" w:eastAsia="Tahoma" w:hAnsi="Tahoma"/>
+                <w:rFonts w:ascii="Leelawadee UI" w:cs="Leelawadee UI" w:eastAsia="Leelawadee UI" w:hAnsi="Leelawadee UI"/>
                 <w:b w:val="false"/>
                 <w:bCs w:val="false"/>
                 <w:color w:val="1A1A1A"/>
@@ -2338,7 +2338,7 @@
             </w:pPr>
             <w:r>
               <w:rPr>
-                <w:rFonts w:ascii="Tahoma" w:cs="Tahoma" w:eastAsia="Tahoma" w:hAnsi="Tahoma"/>
+                <w:rFonts w:ascii="Leelawadee UI" w:cs="Leelawadee UI" w:eastAsia="Leelawadee UI" w:hAnsi="Leelawadee UI"/>
                 <w:b w:val="false"/>
                 <w:bCs w:val="false"/>
                 <w:color w:val="1A1A1A"/>
@@ -2366,7 +2366,7 @@
             </w:pPr>
             <w:r>
               <w:rPr>
-                <w:rFonts w:ascii="Tahoma" w:cs="Tahoma" w:eastAsia="Tahoma" w:hAnsi="Tahoma"/>
+                <w:rFonts w:ascii="Leelawadee UI" w:cs="Leelawadee UI" w:eastAsia="Leelawadee UI" w:hAnsi="Leelawadee UI"/>
                 <w:b w:val="false"/>
                 <w:bCs w:val="false"/>
                 <w:color w:val="1A1A1A"/>
@@ -2386,7 +2386,7 @@
       </w:pPr>
       <w:r>
         <w:rPr>
-          <w:rFonts w:ascii="Tahoma" w:cs="Tahoma" w:eastAsia="Tahoma" w:hAnsi="Tahoma"/>
+          <w:rFonts w:ascii="Leelawadee UI" w:cs="Leelawadee UI" w:eastAsia="Leelawadee UI" w:hAnsi="Leelawadee UI"/>
           <w:b/>
           <w:bCs/>
           <w:color w:val="E85D04"/>
@@ -2402,7 +2402,7 @@
       </w:pPr>
       <w:r>
         <w:rPr>
-          <w:rFonts w:ascii="Tahoma" w:cs="Tahoma" w:eastAsia="Tahoma" w:hAnsi="Tahoma"/>
+          <w:rFonts w:ascii="Leelawadee UI" w:cs="Leelawadee UI" w:eastAsia="Leelawadee UI" w:hAnsi="Leelawadee UI"/>
           <w:sz w:val="20"/>
           <w:szCs w:val="20"/>
         </w:rPr>
@@ -2447,7 +2447,7 @@
             </w:pPr>
             <w:r>
               <w:rPr>
-                <w:rFonts w:ascii="Tahoma" w:cs="Tahoma" w:eastAsia="Tahoma" w:hAnsi="Tahoma"/>
+                <w:rFonts w:ascii="Leelawadee UI" w:cs="Leelawadee UI" w:eastAsia="Leelawadee UI" w:hAnsi="Leelawadee UI"/>
                 <w:b/>
                 <w:bCs/>
                 <w:color w:val="FFFFFF"/>
@@ -2475,7 +2475,7 @@
             </w:pPr>
             <w:r>
               <w:rPr>
-                <w:rFonts w:ascii="Tahoma" w:cs="Tahoma" w:eastAsia="Tahoma" w:hAnsi="Tahoma"/>
+                <w:rFonts w:ascii="Leelawadee UI" w:cs="Leelawadee UI" w:eastAsia="Leelawadee UI" w:hAnsi="Leelawadee UI"/>
                 <w:b/>
                 <w:bCs/>
                 <w:color w:val="FFFFFF"/>
@@ -2503,7 +2503,7 @@
             </w:pPr>
             <w:r>
               <w:rPr>
-                <w:rFonts w:ascii="Tahoma" w:cs="Tahoma" w:eastAsia="Tahoma" w:hAnsi="Tahoma"/>
+                <w:rFonts w:ascii="Leelawadee UI" w:cs="Leelawadee UI" w:eastAsia="Leelawadee UI" w:hAnsi="Leelawadee UI"/>
                 <w:b/>
                 <w:bCs/>
                 <w:color w:val="FFFFFF"/>
@@ -2535,7 +2535,7 @@
             </w:pPr>
             <w:r>
               <w:rPr>
-                <w:rFonts w:ascii="Tahoma" w:cs="Tahoma" w:eastAsia="Tahoma" w:hAnsi="Tahoma"/>
+                <w:rFonts w:ascii="Leelawadee UI" w:cs="Leelawadee UI" w:eastAsia="Leelawadee UI" w:hAnsi="Leelawadee UI"/>
                 <w:b w:val="false"/>
                 <w:bCs w:val="false"/>
                 <w:color w:val="1A1A1A"/>
@@ -2562,7 +2562,7 @@
             </w:pPr>
             <w:r>
               <w:rPr>
-                <w:rFonts w:ascii="Tahoma" w:cs="Tahoma" w:eastAsia="Tahoma" w:hAnsi="Tahoma"/>
+                <w:rFonts w:ascii="Leelawadee UI" w:cs="Leelawadee UI" w:eastAsia="Leelawadee UI" w:hAnsi="Leelawadee UI"/>
                 <w:b w:val="false"/>
                 <w:bCs w:val="false"/>
                 <w:color w:val="1A1A1A"/>
@@ -2589,7 +2589,7 @@
             </w:pPr>
             <w:r>
               <w:rPr>
-                <w:rFonts w:ascii="Tahoma" w:cs="Tahoma" w:eastAsia="Tahoma" w:hAnsi="Tahoma"/>
+                <w:rFonts w:ascii="Leelawadee UI" w:cs="Leelawadee UI" w:eastAsia="Leelawadee UI" w:hAnsi="Leelawadee UI"/>
                 <w:b w:val="false"/>
                 <w:bCs w:val="false"/>
                 <w:color w:val="1A1A1A"/>
@@ -2622,7 +2622,7 @@
             </w:pPr>
             <w:r>
               <w:rPr>
-                <w:rFonts w:ascii="Tahoma" w:cs="Tahoma" w:eastAsia="Tahoma" w:hAnsi="Tahoma"/>
+                <w:rFonts w:ascii="Leelawadee UI" w:cs="Leelawadee UI" w:eastAsia="Leelawadee UI" w:hAnsi="Leelawadee UI"/>
                 <w:b w:val="false"/>
                 <w:bCs w:val="false"/>
                 <w:color w:val="1A1A1A"/>
@@ -2650,7 +2650,7 @@
             </w:pPr>
             <w:r>
               <w:rPr>
-                <w:rFonts w:ascii="Tahoma" w:cs="Tahoma" w:eastAsia="Tahoma" w:hAnsi="Tahoma"/>
+                <w:rFonts w:ascii="Leelawadee UI" w:cs="Leelawadee UI" w:eastAsia="Leelawadee UI" w:hAnsi="Leelawadee UI"/>
                 <w:b w:val="false"/>
                 <w:bCs w:val="false"/>
                 <w:color w:val="1A1A1A"/>
@@ -2678,7 +2678,7 @@
             </w:pPr>
             <w:r>
               <w:rPr>
-                <w:rFonts w:ascii="Tahoma" w:cs="Tahoma" w:eastAsia="Tahoma" w:hAnsi="Tahoma"/>
+                <w:rFonts w:ascii="Leelawadee UI" w:cs="Leelawadee UI" w:eastAsia="Leelawadee UI" w:hAnsi="Leelawadee UI"/>
                 <w:b w:val="false"/>
                 <w:bCs w:val="false"/>
                 <w:color w:val="1A1A1A"/>
@@ -2710,7 +2710,7 @@
             </w:pPr>
             <w:r>
               <w:rPr>
-                <w:rFonts w:ascii="Tahoma" w:cs="Tahoma" w:eastAsia="Tahoma" w:hAnsi="Tahoma"/>
+                <w:rFonts w:ascii="Leelawadee UI" w:cs="Leelawadee UI" w:eastAsia="Leelawadee UI" w:hAnsi="Leelawadee UI"/>
                 <w:b w:val="false"/>
                 <w:bCs w:val="false"/>
                 <w:color w:val="1A1A1A"/>
@@ -2737,7 +2737,7 @@
             </w:pPr>
             <w:r>
               <w:rPr>
-                <w:rFonts w:ascii="Tahoma" w:cs="Tahoma" w:eastAsia="Tahoma" w:hAnsi="Tahoma"/>
+                <w:rFonts w:ascii="Leelawadee UI" w:cs="Leelawadee UI" w:eastAsia="Leelawadee UI" w:hAnsi="Leelawadee UI"/>
                 <w:b w:val="false"/>
                 <w:bCs w:val="false"/>
                 <w:color w:val="1A1A1A"/>
@@ -2764,7 +2764,7 @@
             </w:pPr>
             <w:r>
               <w:rPr>
-                <w:rFonts w:ascii="Tahoma" w:cs="Tahoma" w:eastAsia="Tahoma" w:hAnsi="Tahoma"/>
+                <w:rFonts w:ascii="Leelawadee UI" w:cs="Leelawadee UI" w:eastAsia="Leelawadee UI" w:hAnsi="Leelawadee UI"/>
                 <w:b w:val="false"/>
                 <w:bCs w:val="false"/>
                 <w:color w:val="1A1A1A"/>
@@ -2797,7 +2797,7 @@
             </w:pPr>
             <w:r>
               <w:rPr>
-                <w:rFonts w:ascii="Tahoma" w:cs="Tahoma" w:eastAsia="Tahoma" w:hAnsi="Tahoma"/>
+                <w:rFonts w:ascii="Leelawadee UI" w:cs="Leelawadee UI" w:eastAsia="Leelawadee UI" w:hAnsi="Leelawadee UI"/>
                 <w:b w:val="false"/>
                 <w:bCs w:val="false"/>
                 <w:color w:val="1A1A1A"/>
@@ -2825,7 +2825,7 @@
             </w:pPr>
             <w:r>
               <w:rPr>
-                <w:rFonts w:ascii="Tahoma" w:cs="Tahoma" w:eastAsia="Tahoma" w:hAnsi="Tahoma"/>
+                <w:rFonts w:ascii="Leelawadee UI" w:cs="Leelawadee UI" w:eastAsia="Leelawadee UI" w:hAnsi="Leelawadee UI"/>
                 <w:b w:val="false"/>
                 <w:bCs w:val="false"/>
                 <w:color w:val="1A1A1A"/>
@@ -2853,7 +2853,7 @@
             </w:pPr>
             <w:r>
               <w:rPr>
-                <w:rFonts w:ascii="Tahoma" w:cs="Tahoma" w:eastAsia="Tahoma" w:hAnsi="Tahoma"/>
+                <w:rFonts w:ascii="Leelawadee UI" w:cs="Leelawadee UI" w:eastAsia="Leelawadee UI" w:hAnsi="Leelawadee UI"/>
                 <w:b w:val="false"/>
                 <w:bCs w:val="false"/>
                 <w:color w:val="1A1A1A"/>
@@ -2885,7 +2885,7 @@
             </w:pPr>
             <w:r>
               <w:rPr>
-                <w:rFonts w:ascii="Tahoma" w:cs="Tahoma" w:eastAsia="Tahoma" w:hAnsi="Tahoma"/>
+                <w:rFonts w:ascii="Leelawadee UI" w:cs="Leelawadee UI" w:eastAsia="Leelawadee UI" w:hAnsi="Leelawadee UI"/>
                 <w:b w:val="false"/>
                 <w:bCs w:val="false"/>
                 <w:color w:val="1A1A1A"/>
@@ -2912,7 +2912,7 @@
             </w:pPr>
             <w:r>
               <w:rPr>
-                <w:rFonts w:ascii="Tahoma" w:cs="Tahoma" w:eastAsia="Tahoma" w:hAnsi="Tahoma"/>
+                <w:rFonts w:ascii="Leelawadee UI" w:cs="Leelawadee UI" w:eastAsia="Leelawadee UI" w:hAnsi="Leelawadee UI"/>
                 <w:b w:val="false"/>
                 <w:bCs w:val="false"/>
                 <w:color w:val="1A1A1A"/>
@@ -2939,7 +2939,7 @@
             </w:pPr>
             <w:r>
               <w:rPr>
-                <w:rFonts w:ascii="Tahoma" w:cs="Tahoma" w:eastAsia="Tahoma" w:hAnsi="Tahoma"/>
+                <w:rFonts w:ascii="Leelawadee UI" w:cs="Leelawadee UI" w:eastAsia="Leelawadee UI" w:hAnsi="Leelawadee UI"/>
                 <w:b w:val="false"/>
                 <w:bCs w:val="false"/>
                 <w:color w:val="1A1A1A"/>
@@ -2958,7 +2958,7 @@
       </w:pPr>
       <w:r>
         <w:rPr>
-          <w:rFonts w:ascii="Tahoma" w:cs="Tahoma" w:eastAsia="Tahoma" w:hAnsi="Tahoma"/>
+          <w:rFonts w:ascii="Leelawadee UI" w:cs="Leelawadee UI" w:eastAsia="Leelawadee UI" w:hAnsi="Leelawadee UI"/>
           <w:b/>
           <w:bCs/>
           <w:sz w:val="20"/>
@@ -2968,7 +2968,7 @@
       </w:r>
       <w:r>
         <w:rPr>
-          <w:rFonts w:ascii="Tahoma" w:cs="Tahoma" w:eastAsia="Tahoma" w:hAnsi="Tahoma"/>
+          <w:rFonts w:ascii="Leelawadee UI" w:cs="Leelawadee UI" w:eastAsia="Leelawadee UI" w:hAnsi="Leelawadee UI"/>
           <w:sz w:val="20"/>
           <w:szCs w:val="20"/>
         </w:rPr>
@@ -2982,7 +2982,7 @@
       </w:pPr>
       <w:r>
         <w:rPr>
-          <w:rFonts w:ascii="Tahoma" w:cs="Tahoma" w:eastAsia="Tahoma" w:hAnsi="Tahoma"/>
+          <w:rFonts w:ascii="Leelawadee UI" w:cs="Leelawadee UI" w:eastAsia="Leelawadee UI" w:hAnsi="Leelawadee UI"/>
           <w:b/>
           <w:bCs/>
           <w:color w:val="E85D04"/>
@@ -3029,7 +3029,7 @@
             </w:pPr>
             <w:r>
               <w:rPr>
-                <w:rFonts w:ascii="Tahoma" w:cs="Tahoma" w:eastAsia="Tahoma" w:hAnsi="Tahoma"/>
+                <w:rFonts w:ascii="Leelawadee UI" w:cs="Leelawadee UI" w:eastAsia="Leelawadee UI" w:hAnsi="Leelawadee UI"/>
                 <w:b/>
                 <w:bCs/>
                 <w:color w:val="FFFFFF"/>
@@ -3057,7 +3057,7 @@
             </w:pPr>
             <w:r>
               <w:rPr>
-                <w:rFonts w:ascii="Tahoma" w:cs="Tahoma" w:eastAsia="Tahoma" w:hAnsi="Tahoma"/>
+                <w:rFonts w:ascii="Leelawadee UI" w:cs="Leelawadee UI" w:eastAsia="Leelawadee UI" w:hAnsi="Leelawadee UI"/>
                 <w:b/>
                 <w:bCs/>
                 <w:color w:val="FFFFFF"/>
@@ -3089,7 +3089,7 @@
             </w:pPr>
             <w:r>
               <w:rPr>
-                <w:rFonts w:ascii="Tahoma" w:cs="Tahoma" w:eastAsia="Tahoma" w:hAnsi="Tahoma"/>
+                <w:rFonts w:ascii="Leelawadee UI" w:cs="Leelawadee UI" w:eastAsia="Leelawadee UI" w:hAnsi="Leelawadee UI"/>
                 <w:b w:val="false"/>
                 <w:bCs w:val="false"/>
                 <w:color w:val="1A1A1A"/>
@@ -3116,7 +3116,7 @@
             </w:pPr>
             <w:r>
               <w:rPr>
-                <w:rFonts w:ascii="Tahoma" w:cs="Tahoma" w:eastAsia="Tahoma" w:hAnsi="Tahoma"/>
+                <w:rFonts w:ascii="Leelawadee UI" w:cs="Leelawadee UI" w:eastAsia="Leelawadee UI" w:hAnsi="Leelawadee UI"/>
                 <w:b w:val="false"/>
                 <w:bCs w:val="false"/>
                 <w:color w:val="1A1A1A"/>
@@ -3149,7 +3149,7 @@
             </w:pPr>
             <w:r>
               <w:rPr>
-                <w:rFonts w:ascii="Tahoma" w:cs="Tahoma" w:eastAsia="Tahoma" w:hAnsi="Tahoma"/>
+                <w:rFonts w:ascii="Leelawadee UI" w:cs="Leelawadee UI" w:eastAsia="Leelawadee UI" w:hAnsi="Leelawadee UI"/>
                 <w:b w:val="false"/>
                 <w:bCs w:val="false"/>
                 <w:color w:val="1A1A1A"/>
@@ -3177,7 +3177,7 @@
             </w:pPr>
             <w:r>
               <w:rPr>
-                <w:rFonts w:ascii="Tahoma" w:cs="Tahoma" w:eastAsia="Tahoma" w:hAnsi="Tahoma"/>
+                <w:rFonts w:ascii="Leelawadee UI" w:cs="Leelawadee UI" w:eastAsia="Leelawadee UI" w:hAnsi="Leelawadee UI"/>
                 <w:b w:val="false"/>
                 <w:bCs w:val="false"/>
                 <w:color w:val="1A1A1A"/>
@@ -3209,7 +3209,7 @@
             </w:pPr>
             <w:r>
               <w:rPr>
-                <w:rFonts w:ascii="Tahoma" w:cs="Tahoma" w:eastAsia="Tahoma" w:hAnsi="Tahoma"/>
+                <w:rFonts w:ascii="Leelawadee UI" w:cs="Leelawadee UI" w:eastAsia="Leelawadee UI" w:hAnsi="Leelawadee UI"/>
                 <w:b w:val="false"/>
                 <w:bCs w:val="false"/>
                 <w:color w:val="1A1A1A"/>
@@ -3236,7 +3236,7 @@
             </w:pPr>
             <w:r>
               <w:rPr>
-                <w:rFonts w:ascii="Tahoma" w:cs="Tahoma" w:eastAsia="Tahoma" w:hAnsi="Tahoma"/>
+                <w:rFonts w:ascii="Leelawadee UI" w:cs="Leelawadee UI" w:eastAsia="Leelawadee UI" w:hAnsi="Leelawadee UI"/>
                 <w:b w:val="false"/>
                 <w:bCs w:val="false"/>
                 <w:color w:val="1A1A1A"/>
@@ -3269,7 +3269,7 @@
             </w:pPr>
             <w:r>
               <w:rPr>
-                <w:rFonts w:ascii="Tahoma" w:cs="Tahoma" w:eastAsia="Tahoma" w:hAnsi="Tahoma"/>
+                <w:rFonts w:ascii="Leelawadee UI" w:cs="Leelawadee UI" w:eastAsia="Leelawadee UI" w:hAnsi="Leelawadee UI"/>
                 <w:b w:val="false"/>
                 <w:bCs w:val="false"/>
                 <w:color w:val="1A1A1A"/>
@@ -3297,7 +3297,7 @@
             </w:pPr>
             <w:r>
               <w:rPr>
-                <w:rFonts w:ascii="Tahoma" w:cs="Tahoma" w:eastAsia="Tahoma" w:hAnsi="Tahoma"/>
+                <w:rFonts w:ascii="Leelawadee UI" w:cs="Leelawadee UI" w:eastAsia="Leelawadee UI" w:hAnsi="Leelawadee UI"/>
                 <w:b w:val="false"/>
                 <w:bCs w:val="false"/>
                 <w:color w:val="1A1A1A"/>
@@ -3329,7 +3329,7 @@
             </w:pPr>
             <w:r>
               <w:rPr>
-                <w:rFonts w:ascii="Tahoma" w:cs="Tahoma" w:eastAsia="Tahoma" w:hAnsi="Tahoma"/>
+                <w:rFonts w:ascii="Leelawadee UI" w:cs="Leelawadee UI" w:eastAsia="Leelawadee UI" w:hAnsi="Leelawadee UI"/>
                 <w:b w:val="false"/>
                 <w:bCs w:val="false"/>
                 <w:color w:val="1A1A1A"/>
@@ -3356,7 +3356,7 @@
             </w:pPr>
             <w:r>
               <w:rPr>
-                <w:rFonts w:ascii="Tahoma" w:cs="Tahoma" w:eastAsia="Tahoma" w:hAnsi="Tahoma"/>
+                <w:rFonts w:ascii="Leelawadee UI" w:cs="Leelawadee UI" w:eastAsia="Leelawadee UI" w:hAnsi="Leelawadee UI"/>
                 <w:b w:val="false"/>
                 <w:bCs w:val="false"/>
                 <w:color w:val="1A1A1A"/>
@@ -3389,7 +3389,7 @@
             </w:pPr>
             <w:r>
               <w:rPr>
-                <w:rFonts w:ascii="Tahoma" w:cs="Tahoma" w:eastAsia="Tahoma" w:hAnsi="Tahoma"/>
+                <w:rFonts w:ascii="Leelawadee UI" w:cs="Leelawadee UI" w:eastAsia="Leelawadee UI" w:hAnsi="Leelawadee UI"/>
                 <w:b w:val="false"/>
                 <w:bCs w:val="false"/>
                 <w:color w:val="1A1A1A"/>
@@ -3417,7 +3417,7 @@
             </w:pPr>
             <w:r>
               <w:rPr>
-                <w:rFonts w:ascii="Tahoma" w:cs="Tahoma" w:eastAsia="Tahoma" w:hAnsi="Tahoma"/>
+                <w:rFonts w:ascii="Leelawadee UI" w:cs="Leelawadee UI" w:eastAsia="Leelawadee UI" w:hAnsi="Leelawadee UI"/>
                 <w:b w:val="false"/>
                 <w:bCs w:val="false"/>
                 <w:color w:val="1A1A1A"/>
@@ -3436,7 +3436,7 @@
       </w:pPr>
       <w:r>
         <w:rPr>
-          <w:rFonts w:ascii="Tahoma" w:cs="Tahoma" w:eastAsia="Tahoma" w:hAnsi="Tahoma"/>
+          <w:rFonts w:ascii="Leelawadee UI" w:cs="Leelawadee UI" w:eastAsia="Leelawadee UI" w:hAnsi="Leelawadee UI"/>
           <w:b/>
           <w:bCs/>
           <w:sz w:val="20"/>
@@ -3446,7 +3446,7 @@
       </w:r>
       <w:r>
         <w:rPr>
-          <w:rFonts w:ascii="Tahoma" w:cs="Tahoma" w:eastAsia="Tahoma" w:hAnsi="Tahoma"/>
+          <w:rFonts w:ascii="Leelawadee UI" w:cs="Leelawadee UI" w:eastAsia="Leelawadee UI" w:hAnsi="Leelawadee UI"/>
           <w:i/>
           <w:iCs/>
           <w:sz w:val="20"/>
@@ -3462,7 +3462,7 @@
       </w:pPr>
       <w:r>
         <w:rPr>
-          <w:rFonts w:ascii="Tahoma" w:cs="Tahoma" w:eastAsia="Tahoma" w:hAnsi="Tahoma"/>
+          <w:rFonts w:ascii="Leelawadee UI" w:cs="Leelawadee UI" w:eastAsia="Leelawadee UI" w:hAnsi="Leelawadee UI"/>
           <w:b/>
           <w:bCs/>
           <w:color w:val="E85D04"/>
@@ -3509,7 +3509,7 @@
             </w:pPr>
             <w:r>
               <w:rPr>
-                <w:rFonts w:ascii="Tahoma" w:cs="Tahoma" w:eastAsia="Tahoma" w:hAnsi="Tahoma"/>
+                <w:rFonts w:ascii="Leelawadee UI" w:cs="Leelawadee UI" w:eastAsia="Leelawadee UI" w:hAnsi="Leelawadee UI"/>
                 <w:b/>
                 <w:bCs/>
                 <w:color w:val="FFFFFF"/>
@@ -3537,7 +3537,7 @@
             </w:pPr>
             <w:r>
               <w:rPr>
-                <w:rFonts w:ascii="Tahoma" w:cs="Tahoma" w:eastAsia="Tahoma" w:hAnsi="Tahoma"/>
+                <w:rFonts w:ascii="Leelawadee UI" w:cs="Leelawadee UI" w:eastAsia="Leelawadee UI" w:hAnsi="Leelawadee UI"/>
                 <w:b/>
                 <w:bCs/>
                 <w:color w:val="FFFFFF"/>
@@ -3569,7 +3569,7 @@
             </w:pPr>
             <w:r>
               <w:rPr>
-                <w:rFonts w:ascii="Tahoma" w:cs="Tahoma" w:eastAsia="Tahoma" w:hAnsi="Tahoma"/>
+                <w:rFonts w:ascii="Leelawadee UI" w:cs="Leelawadee UI" w:eastAsia="Leelawadee UI" w:hAnsi="Leelawadee UI"/>
                 <w:b w:val="false"/>
                 <w:bCs w:val="false"/>
                 <w:color w:val="1A1A1A"/>
@@ -3596,7 +3596,7 @@
             </w:pPr>
             <w:r>
               <w:rPr>
-                <w:rFonts w:ascii="Tahoma" w:cs="Tahoma" w:eastAsia="Tahoma" w:hAnsi="Tahoma"/>
+                <w:rFonts w:ascii="Leelawadee UI" w:cs="Leelawadee UI" w:eastAsia="Leelawadee UI" w:hAnsi="Leelawadee UI"/>
                 <w:b w:val="false"/>
                 <w:bCs w:val="false"/>
                 <w:color w:val="1A1A1A"/>
@@ -3629,7 +3629,7 @@
             </w:pPr>
             <w:r>
               <w:rPr>
-                <w:rFonts w:ascii="Tahoma" w:cs="Tahoma" w:eastAsia="Tahoma" w:hAnsi="Tahoma"/>
+                <w:rFonts w:ascii="Leelawadee UI" w:cs="Leelawadee UI" w:eastAsia="Leelawadee UI" w:hAnsi="Leelawadee UI"/>
                 <w:b w:val="false"/>
                 <w:bCs w:val="false"/>
                 <w:color w:val="1A1A1A"/>
@@ -3657,7 +3657,7 @@
             </w:pPr>
             <w:r>
               <w:rPr>
-                <w:rFonts w:ascii="Tahoma" w:cs="Tahoma" w:eastAsia="Tahoma" w:hAnsi="Tahoma"/>
+                <w:rFonts w:ascii="Leelawadee UI" w:cs="Leelawadee UI" w:eastAsia="Leelawadee UI" w:hAnsi="Leelawadee UI"/>
                 <w:b w:val="false"/>
                 <w:bCs w:val="false"/>
                 <w:color w:val="1A1A1A"/>
@@ -3689,7 +3689,7 @@
             </w:pPr>
             <w:r>
               <w:rPr>
-                <w:rFonts w:ascii="Tahoma" w:cs="Tahoma" w:eastAsia="Tahoma" w:hAnsi="Tahoma"/>
+                <w:rFonts w:ascii="Leelawadee UI" w:cs="Leelawadee UI" w:eastAsia="Leelawadee UI" w:hAnsi="Leelawadee UI"/>
                 <w:b w:val="false"/>
                 <w:bCs w:val="false"/>
                 <w:color w:val="1A1A1A"/>
@@ -3716,7 +3716,7 @@
             </w:pPr>
             <w:r>
               <w:rPr>
-                <w:rFonts w:ascii="Tahoma" w:cs="Tahoma" w:eastAsia="Tahoma" w:hAnsi="Tahoma"/>
+                <w:rFonts w:ascii="Leelawadee UI" w:cs="Leelawadee UI" w:eastAsia="Leelawadee UI" w:hAnsi="Leelawadee UI"/>
                 <w:b w:val="false"/>
                 <w:bCs w:val="false"/>
                 <w:color w:val="1A1A1A"/>
@@ -3749,7 +3749,7 @@
             </w:pPr>
             <w:r>
               <w:rPr>
-                <w:rFonts w:ascii="Tahoma" w:cs="Tahoma" w:eastAsia="Tahoma" w:hAnsi="Tahoma"/>
+                <w:rFonts w:ascii="Leelawadee UI" w:cs="Leelawadee UI" w:eastAsia="Leelawadee UI" w:hAnsi="Leelawadee UI"/>
                 <w:b w:val="false"/>
                 <w:bCs w:val="false"/>
                 <w:color w:val="1A1A1A"/>
@@ -3777,7 +3777,7 @@
             </w:pPr>
             <w:r>
               <w:rPr>
-                <w:rFonts w:ascii="Tahoma" w:cs="Tahoma" w:eastAsia="Tahoma" w:hAnsi="Tahoma"/>
+                <w:rFonts w:ascii="Leelawadee UI" w:cs="Leelawadee UI" w:eastAsia="Leelawadee UI" w:hAnsi="Leelawadee UI"/>
                 <w:b w:val="false"/>
                 <w:bCs w:val="false"/>
                 <w:color w:val="1A1A1A"/>
@@ -3809,7 +3809,7 @@
             </w:pPr>
             <w:r>
               <w:rPr>
-                <w:rFonts w:ascii="Tahoma" w:cs="Tahoma" w:eastAsia="Tahoma" w:hAnsi="Tahoma"/>
+                <w:rFonts w:ascii="Leelawadee UI" w:cs="Leelawadee UI" w:eastAsia="Leelawadee UI" w:hAnsi="Leelawadee UI"/>
                 <w:b w:val="false"/>
                 <w:bCs w:val="false"/>
                 <w:color w:val="1A1A1A"/>
@@ -3836,7 +3836,7 @@
             </w:pPr>
             <w:r>
               <w:rPr>
-                <w:rFonts w:ascii="Tahoma" w:cs="Tahoma" w:eastAsia="Tahoma" w:hAnsi="Tahoma"/>
+                <w:rFonts w:ascii="Leelawadee UI" w:cs="Leelawadee UI" w:eastAsia="Leelawadee UI" w:hAnsi="Leelawadee UI"/>
                 <w:b w:val="false"/>
                 <w:bCs w:val="false"/>
                 <w:color w:val="1A1A1A"/>
@@ -3855,7 +3855,7 @@
       </w:pPr>
       <w:r>
         <w:rPr>
-          <w:rFonts w:ascii="Tahoma" w:cs="Tahoma" w:eastAsia="Tahoma" w:hAnsi="Tahoma"/>
+          <w:rFonts w:ascii="Leelawadee UI" w:cs="Leelawadee UI" w:eastAsia="Leelawadee UI" w:hAnsi="Leelawadee UI"/>
           <w:b/>
           <w:bCs/>
           <w:sz w:val="20"/>
@@ -3865,7 +3865,7 @@
       </w:r>
       <w:r>
         <w:rPr>
-          <w:rFonts w:ascii="Tahoma" w:cs="Tahoma" w:eastAsia="Tahoma" w:hAnsi="Tahoma"/>
+          <w:rFonts w:ascii="Leelawadee UI" w:cs="Leelawadee UI" w:eastAsia="Leelawadee UI" w:hAnsi="Leelawadee UI"/>
           <w:sz w:val="20"/>
           <w:szCs w:val="20"/>
         </w:rPr>
@@ -3879,7 +3879,7 @@
       </w:pPr>
       <w:r>
         <w:rPr>
-          <w:rFonts w:ascii="Tahoma" w:cs="Tahoma" w:eastAsia="Tahoma" w:hAnsi="Tahoma"/>
+          <w:rFonts w:ascii="Leelawadee UI" w:cs="Leelawadee UI" w:eastAsia="Leelawadee UI" w:hAnsi="Leelawadee UI"/>
           <w:b/>
           <w:bCs/>
           <w:color w:val="E85D04"/>
@@ -3900,7 +3900,7 @@
       </w:pPr>
       <w:r>
         <w:rPr>
-          <w:rFonts w:ascii="Tahoma" w:cs="Tahoma" w:eastAsia="Tahoma" w:hAnsi="Tahoma"/>
+          <w:rFonts w:ascii="Leelawadee UI" w:cs="Leelawadee UI" w:eastAsia="Leelawadee UI" w:hAnsi="Leelawadee UI"/>
           <w:b/>
           <w:bCs/>
           <w:sz w:val="20"/>
@@ -3910,7 +3910,7 @@
       </w:r>
       <w:r>
         <w:rPr>
-          <w:rFonts w:ascii="Tahoma" w:cs="Tahoma" w:eastAsia="Tahoma" w:hAnsi="Tahoma"/>
+          <w:rFonts w:ascii="Leelawadee UI" w:cs="Leelawadee UI" w:eastAsia="Leelawadee UI" w:hAnsi="Leelawadee UI"/>
           <w:sz w:val="20"/>
           <w:szCs w:val="20"/>
         </w:rPr>
@@ -3928,7 +3928,7 @@
       </w:pPr>
       <w:r>
         <w:rPr>
-          <w:rFonts w:ascii="Tahoma" w:cs="Tahoma" w:eastAsia="Tahoma" w:hAnsi="Tahoma"/>
+          <w:rFonts w:ascii="Leelawadee UI" w:cs="Leelawadee UI" w:eastAsia="Leelawadee UI" w:hAnsi="Leelawadee UI"/>
           <w:b/>
           <w:bCs/>
           <w:sz w:val="20"/>
@@ -3938,7 +3938,7 @@
       </w:r>
       <w:r>
         <w:rPr>
-          <w:rFonts w:ascii="Tahoma" w:cs="Tahoma" w:eastAsia="Tahoma" w:hAnsi="Tahoma"/>
+          <w:rFonts w:ascii="Leelawadee UI" w:cs="Leelawadee UI" w:eastAsia="Leelawadee UI" w:hAnsi="Leelawadee UI"/>
           <w:sz w:val="20"/>
           <w:szCs w:val="20"/>
         </w:rPr>
@@ -3956,7 +3956,7 @@
       </w:pPr>
       <w:r>
         <w:rPr>
-          <w:rFonts w:ascii="Tahoma" w:cs="Tahoma" w:eastAsia="Tahoma" w:hAnsi="Tahoma"/>
+          <w:rFonts w:ascii="Leelawadee UI" w:cs="Leelawadee UI" w:eastAsia="Leelawadee UI" w:hAnsi="Leelawadee UI"/>
           <w:b/>
           <w:bCs/>
           <w:sz w:val="20"/>
@@ -3966,7 +3966,7 @@
       </w:r>
       <w:r>
         <w:rPr>
-          <w:rFonts w:ascii="Tahoma" w:cs="Tahoma" w:eastAsia="Tahoma" w:hAnsi="Tahoma"/>
+          <w:rFonts w:ascii="Leelawadee UI" w:cs="Leelawadee UI" w:eastAsia="Leelawadee UI" w:hAnsi="Leelawadee UI"/>
           <w:sz w:val="20"/>
           <w:szCs w:val="20"/>
         </w:rPr>
@@ -3984,7 +3984,7 @@
       </w:pPr>
       <w:r>
         <w:rPr>
-          <w:rFonts w:ascii="Tahoma" w:cs="Tahoma" w:eastAsia="Tahoma" w:hAnsi="Tahoma"/>
+          <w:rFonts w:ascii="Leelawadee UI" w:cs="Leelawadee UI" w:eastAsia="Leelawadee UI" w:hAnsi="Leelawadee UI"/>
           <w:b/>
           <w:bCs/>
           <w:sz w:val="20"/>
@@ -3994,7 +3994,7 @@
       </w:r>
       <w:r>
         <w:rPr>
-          <w:rFonts w:ascii="Tahoma" w:cs="Tahoma" w:eastAsia="Tahoma" w:hAnsi="Tahoma"/>
+          <w:rFonts w:ascii="Leelawadee UI" w:cs="Leelawadee UI" w:eastAsia="Leelawadee UI" w:hAnsi="Leelawadee UI"/>
           <w:sz w:val="20"/>
           <w:szCs w:val="20"/>
         </w:rPr>
@@ -4012,7 +4012,7 @@
       </w:pPr>
       <w:r>
         <w:rPr>
-          <w:rFonts w:ascii="Tahoma" w:cs="Tahoma" w:eastAsia="Tahoma" w:hAnsi="Tahoma"/>
+          <w:rFonts w:ascii="Leelawadee UI" w:cs="Leelawadee UI" w:eastAsia="Leelawadee UI" w:hAnsi="Leelawadee UI"/>
           <w:b/>
           <w:bCs/>
           <w:sz w:val="20"/>
@@ -4022,7 +4022,7 @@
       </w:r>
       <w:r>
         <w:rPr>
-          <w:rFonts w:ascii="Tahoma" w:cs="Tahoma" w:eastAsia="Tahoma" w:hAnsi="Tahoma"/>
+          <w:rFonts w:ascii="Leelawadee UI" w:cs="Leelawadee UI" w:eastAsia="Leelawadee UI" w:hAnsi="Leelawadee UI"/>
           <w:sz w:val="20"/>
           <w:szCs w:val="20"/>
         </w:rPr>
@@ -4036,7 +4036,7 @@
       </w:pPr>
       <w:r>
         <w:rPr>
-          <w:rFonts w:ascii="Tahoma" w:cs="Tahoma" w:eastAsia="Tahoma" w:hAnsi="Tahoma"/>
+          <w:rFonts w:ascii="Leelawadee UI" w:cs="Leelawadee UI" w:eastAsia="Leelawadee UI" w:hAnsi="Leelawadee UI"/>
           <w:b/>
           <w:bCs/>
           <w:color w:val="E85D04"/>
@@ -4057,7 +4057,7 @@
       </w:pPr>
       <w:r>
         <w:rPr>
-          <w:rFonts w:ascii="Tahoma" w:cs="Tahoma" w:eastAsia="Tahoma" w:hAnsi="Tahoma"/>
+          <w:rFonts w:ascii="Leelawadee UI" w:cs="Leelawadee UI" w:eastAsia="Leelawadee UI" w:hAnsi="Leelawadee UI"/>
           <w:sz w:val="20"/>
           <w:szCs w:val="20"/>
         </w:rPr>
@@ -4075,7 +4075,7 @@
       </w:pPr>
       <w:r>
         <w:rPr>
-          <w:rFonts w:ascii="Tahoma" w:cs="Tahoma" w:eastAsia="Tahoma" w:hAnsi="Tahoma"/>
+          <w:rFonts w:ascii="Leelawadee UI" w:cs="Leelawadee UI" w:eastAsia="Leelawadee UI" w:hAnsi="Leelawadee UI"/>
           <w:sz w:val="20"/>
           <w:szCs w:val="20"/>
         </w:rPr>
@@ -4093,7 +4093,7 @@
       </w:pPr>
       <w:r>
         <w:rPr>
-          <w:rFonts w:ascii="Tahoma" w:cs="Tahoma" w:eastAsia="Tahoma" w:hAnsi="Tahoma"/>
+          <w:rFonts w:ascii="Leelawadee UI" w:cs="Leelawadee UI" w:eastAsia="Leelawadee UI" w:hAnsi="Leelawadee UI"/>
           <w:sz w:val="20"/>
           <w:szCs w:val="20"/>
         </w:rPr>
@@ -4111,7 +4111,7 @@
       </w:pPr>
       <w:r>
         <w:rPr>
-          <w:rFonts w:ascii="Tahoma" w:cs="Tahoma" w:eastAsia="Tahoma" w:hAnsi="Tahoma"/>
+          <w:rFonts w:ascii="Leelawadee UI" w:cs="Leelawadee UI" w:eastAsia="Leelawadee UI" w:hAnsi="Leelawadee UI"/>
           <w:sz w:val="20"/>
           <w:szCs w:val="20"/>
         </w:rPr>
@@ -4125,7 +4125,7 @@
       </w:pPr>
       <w:r>
         <w:rPr>
-          <w:rFonts w:ascii="Tahoma" w:cs="Tahoma" w:eastAsia="Tahoma" w:hAnsi="Tahoma"/>
+          <w:rFonts w:ascii="Leelawadee UI" w:cs="Leelawadee UI" w:eastAsia="Leelawadee UI" w:hAnsi="Leelawadee UI"/>
           <w:b/>
           <w:bCs/>
           <w:color w:val="E85D04"/>
@@ -4141,7 +4141,7 @@
       </w:pPr>
       <w:r>
         <w:rPr>
-          <w:rFonts w:ascii="Tahoma" w:cs="Tahoma" w:eastAsia="Tahoma" w:hAnsi="Tahoma"/>
+          <w:rFonts w:ascii="Leelawadee UI" w:cs="Leelawadee UI" w:eastAsia="Leelawadee UI" w:hAnsi="Leelawadee UI"/>
           <w:sz w:val="20"/>
           <w:szCs w:val="20"/>
         </w:rPr>
@@ -4159,7 +4159,7 @@
       </w:pPr>
       <w:r>
         <w:rPr>
-          <w:rFonts w:ascii="Tahoma" w:cs="Tahoma" w:eastAsia="Tahoma" w:hAnsi="Tahoma"/>
+          <w:rFonts w:ascii="Leelawadee UI" w:cs="Leelawadee UI" w:eastAsia="Leelawadee UI" w:hAnsi="Leelawadee UI"/>
           <w:sz w:val="20"/>
           <w:szCs w:val="20"/>
         </w:rPr>
@@ -4177,7 +4177,7 @@
       </w:pPr>
       <w:r>
         <w:rPr>
-          <w:rFonts w:ascii="Tahoma" w:cs="Tahoma" w:eastAsia="Tahoma" w:hAnsi="Tahoma"/>
+          <w:rFonts w:ascii="Leelawadee UI" w:cs="Leelawadee UI" w:eastAsia="Leelawadee UI" w:hAnsi="Leelawadee UI"/>
           <w:sz w:val="20"/>
           <w:szCs w:val="20"/>
         </w:rPr>
@@ -4190,7 +4190,7 @@
       </w:pPr>
       <w:r>
         <w:rPr>
-          <w:rFonts w:ascii="Tahoma" w:cs="Tahoma" w:eastAsia="Tahoma" w:hAnsi="Tahoma"/>
+          <w:rFonts w:ascii="Leelawadee UI" w:cs="Leelawadee UI" w:eastAsia="Leelawadee UI" w:hAnsi="Leelawadee UI"/>
           <w:i/>
           <w:iCs/>
           <w:sz w:val="20"/>
@@ -4206,7 +4206,7 @@
       </w:pPr>
       <w:r>
         <w:rPr>
-          <w:rFonts w:ascii="Tahoma" w:cs="Tahoma" w:eastAsia="Tahoma" w:hAnsi="Tahoma"/>
+          <w:rFonts w:ascii="Leelawadee UI" w:cs="Leelawadee UI" w:eastAsia="Leelawadee UI" w:hAnsi="Leelawadee UI"/>
           <w:color w:val="999999"/>
           <w:sz w:val="18"/>
           <w:szCs w:val="18"/>
@@ -4402,7 +4402,7 @@
   <w:docDefaults>
     <w:rPrDefault>
       <w:rPr>
-        <w:rFonts w:ascii="Tahoma" w:cs="Tahoma" w:eastAsia="Tahoma" w:hAnsi="Tahoma"/>
+        <w:rFonts w:ascii="Leelawadee UI" w:cs="Leelawadee UI" w:eastAsia="Leelawadee UI" w:hAnsi="Leelawadee UI"/>
         <w:sz w:val="20"/>
         <w:szCs w:val="20"/>
       </w:rPr>

</xml_diff>

<commit_message>
Summary doc: add mobile screen crops + vehicle booking section
</commit_message>
<xml_diff>
--- a/RSC-Connect-สรุประบบ.docx
+++ b/RSC-Connect-สรุประบบ.docx
@@ -1049,6 +1049,93 @@
                 <w:sz w:val="18"/>
                 <w:szCs w:val="18"/>
               </w:rPr>
+              <w:t xml:space="preserve">จองรถ</w:t>
+            </w:r>
+          </w:p>
+        </w:tc>
+        <w:tc>
+          <w:tcPr>
+            <w:tcW w:type="dxa" w:w="3400"/>
+            <w:tcMar>
+              <w:top w:type="dxa" w:w="60"/>
+              <w:left w:type="dxa" w:w="100"/>
+              <w:bottom w:type="dxa" w:w="60"/>
+              <w:right w:type="dxa" w:w="100"/>
+            </w:tcMar>
+          </w:tcPr>
+          <w:p>
+            <w:pPr>
+              <w:spacing w:after="0" w:line="252"/>
+            </w:pPr>
+            <w:r>
+              <w:rPr>
+                <w:rFonts w:ascii="Leelawadee UI" w:cs="Leelawadee UI" w:eastAsia="Leelawadee UI" w:hAnsi="Leelawadee UI"/>
+                <w:b w:val="false"/>
+                <w:bCs w:val="false"/>
+                <w:color w:val="1A1A1A"/>
+                <w:sz w:val="18"/>
+                <w:szCs w:val="18"/>
+              </w:rPr>
+              <w:t xml:space="preserve">งานใน Planner + ทะเบียนรถ</w:t>
+            </w:r>
+          </w:p>
+        </w:tc>
+        <w:tc>
+          <w:tcPr>
+            <w:tcW w:type="dxa" w:w="3360"/>
+            <w:tcMar>
+              <w:top w:type="dxa" w:w="60"/>
+              <w:left w:type="dxa" w:w="100"/>
+              <w:bottom w:type="dxa" w:w="60"/>
+              <w:right w:type="dxa" w:w="100"/>
+            </w:tcMar>
+          </w:tcPr>
+          <w:p>
+            <w:pPr>
+              <w:spacing w:after="0" w:line="252"/>
+            </w:pPr>
+            <w:r>
+              <w:rPr>
+                <w:rFonts w:ascii="Leelawadee UI" w:cs="Leelawadee UI" w:eastAsia="Leelawadee UI" w:hAnsi="Leelawadee UI"/>
+                <w:b w:val="false"/>
+                <w:bCs w:val="false"/>
+                <w:color w:val="1A1A1A"/>
+                <w:sz w:val="18"/>
+                <w:szCs w:val="18"/>
+              </w:rPr>
+              <w:t xml:space="preserve">กันเวลาชนกัน + ผูกปลายทางกับไซต์งาน</w:t>
+            </w:r>
+          </w:p>
+        </w:tc>
+      </w:tr>
+      <w:tr>
+        <w:trPr>
+          <w:tblHeader w:val="false"/>
+        </w:trPr>
+        <w:tc>
+          <w:tcPr>
+            <w:tcW w:type="dxa" w:w="2600"/>
+            <w:shd w:fill="F2F2F2" w:color="auto" w:val="clear"/>
+            <w:tcMar>
+              <w:top w:type="dxa" w:w="60"/>
+              <w:left w:type="dxa" w:w="100"/>
+              <w:bottom w:type="dxa" w:w="60"/>
+              <w:right w:type="dxa" w:w="100"/>
+            </w:tcMar>
+          </w:tcPr>
+          <w:p>
+            <w:pPr>
+              <w:spacing w:after="0" w:line="252"/>
+            </w:pPr>
+            <w:r>
+              <w:rPr>
+                <w:rFonts w:ascii="Leelawadee UI" w:cs="Leelawadee UI" w:eastAsia="Leelawadee UI" w:hAnsi="Leelawadee UI"/>
+                <w:b w:val="false"/>
+                <w:bCs w:val="false"/>
+                <w:color w:val="1A1A1A"/>
+                <w:sz w:val="18"/>
+                <w:szCs w:val="18"/>
+              </w:rPr>
               <w:t xml:space="preserve">ข้อมูลทั้งหมด</w:t>
             </w:r>
           </w:p>
@@ -1056,6 +1143,7 @@
         <w:tc>
           <w:tcPr>
             <w:tcW w:type="dxa" w:w="3400"/>
+            <w:shd w:fill="F2F2F2" w:color="auto" w:val="clear"/>
             <w:tcMar>
               <w:top w:type="dxa" w:w="60"/>
               <w:left w:type="dxa" w:w="100"/>
@@ -1083,6 +1171,7 @@
         <w:tc>
           <w:tcPr>
             <w:tcW w:type="dxa" w:w="3360"/>
+            <w:shd w:fill="F2F2F2" w:color="auto" w:val="clear"/>
             <w:tcMar>
               <w:top w:type="dxa" w:w="60"/>
               <w:left w:type="dxa" w:w="100"/>
@@ -1158,7 +1247,7 @@
           <w:sz w:val="20"/>
           <w:szCs w:val="20"/>
         </w:rPr>
-        <w:t xml:space="preserve">พนักงานเปิดจากมือถือ (ติดตั้งเป็นแอปได้): นาฬิกา, ปุ่มเช็คอิน/เช็คเอาท์, ดึงพิกัด GPS, เลือกงานจาก Planner, ขอลา และขอ OT ล่วงหน้า</w:t>
+        <w:t xml:space="preserve">พนักงานเปิดจากมือถือ (ติดตั้งเป็นแอปได้ — PWA) แต่ละส่วนของหน้าจอ:</w:t>
       </w:r>
     </w:p>
     <w:p>
@@ -1169,7 +1258,7 @@
       <w:r>
         <w:drawing>
           <wp:inline distT="0" distB="0" distL="0" distR="0">
-            <wp:extent cx="2238375" cy="10448925"/>
+            <wp:extent cx="2857500" cy="1181100"/>
             <wp:effectExtent t="0" r="0" b="0" l="0"/>
             <wp:docPr id="1" name="" descr="" title=""/>
             <wp:cNvGraphicFramePr>
@@ -1194,7 +1283,7 @@
                   <pic:spPr bwMode="auto">
                     <a:xfrm>
                       <a:off x="0" y="0"/>
-                      <a:ext cx="2238375" cy="10448925"/>
+                      <a:ext cx="2857500" cy="1181100"/>
                     </a:xfrm>
                     <a:prstGeom prst="rect">
                       <a:avLst/>
@@ -1221,42 +1310,7 @@
           <w:sz w:val="16"/>
           <w:szCs w:val="16"/>
         </w:rPr>
-        <w:t xml:space="preserve">หน้าจอแอปพนักงาน (RSC Connect)</w:t>
-      </w:r>
-    </w:p>
-    <w:p>
-      <w:r>
-        <w:br w:type="page"/>
-      </w:r>
-    </w:p>
-    <w:p>
-      <w:pPr>
-        <w:pStyle w:val="Heading2"/>
-        <w:spacing w:after="100" w:before="220"/>
-      </w:pPr>
-      <w:r>
-        <w:rPr>
-          <w:rFonts w:ascii="Leelawadee UI" w:cs="Leelawadee UI" w:eastAsia="Leelawadee UI" w:hAnsi="Leelawadee UI"/>
-          <w:b/>
-          <w:bCs/>
-          <w:color w:val="1A1A1A"/>
-          <w:sz w:val="24"/>
-          <w:szCs w:val="24"/>
-        </w:rPr>
-        <w:t xml:space="preserve">3.2 แดชบอร์ด HR — ภาพรวมวันนี้</w:t>
-      </w:r>
-    </w:p>
-    <w:p>
-      <w:pPr>
-        <w:spacing w:after="100" w:line="276"/>
-      </w:pPr>
-      <w:r>
-        <w:rPr>
-          <w:rFonts w:ascii="Leelawadee UI" w:cs="Leelawadee UI" w:eastAsia="Leelawadee UI" w:hAnsi="Leelawadee UI"/>
-          <w:sz w:val="20"/>
-          <w:szCs w:val="20"/>
-        </w:rPr>
-        <w:t xml:space="preserve">สรุปเรียลไทม์: เข้างานแล้วกี่คน, มาสายกี่คน, ลากี่คน, ยังไม่เข้ากี่คน พร้อมสถานะรายคน (ตรงเวลา/สาย/ทำงานอยู่)</w:t>
+        <w:t xml:space="preserve">นาฬิกา &amp; สถานะวันนี้</w:t>
       </w:r>
     </w:p>
     <w:p>
@@ -1267,7 +1321,7 @@
       <w:r>
         <w:drawing>
           <wp:inline distT="0" distB="0" distL="0" distR="0">
-            <wp:extent cx="5715000" cy="4019550"/>
+            <wp:extent cx="2857500" cy="3857625"/>
             <wp:effectExtent t="0" r="0" b="0" l="0"/>
             <wp:docPr id="1" name="" descr="" title=""/>
             <wp:cNvGraphicFramePr>
@@ -1292,7 +1346,7 @@
                   <pic:spPr bwMode="auto">
                     <a:xfrm>
                       <a:off x="0" y="0"/>
-                      <a:ext cx="5715000" cy="4019550"/>
+                      <a:ext cx="2857500" cy="3857625"/>
                     </a:xfrm>
                     <a:prstGeom prst="rect">
                       <a:avLst/>
@@ -1319,29 +1373,12 @@
           <w:sz w:val="16"/>
           <w:szCs w:val="16"/>
         </w:rPr>
-        <w:t xml:space="preserve">แดชบอร์ด HR — แท็บ “วันนี้”</w:t>
+        <w:t xml:space="preserve">เช็คอิน/เช็คเอาท์ + GPS + เลือกงานจาก Planner</w:t>
       </w:r>
     </w:p>
     <w:p>
       <w:r>
         <w:br w:type="page"/>
-      </w:r>
-    </w:p>
-    <w:p>
-      <w:pPr>
-        <w:pStyle w:val="Heading2"/>
-        <w:spacing w:after="100" w:before="220"/>
-      </w:pPr>
-      <w:r>
-        <w:rPr>
-          <w:rFonts w:ascii="Leelawadee UI" w:cs="Leelawadee UI" w:eastAsia="Leelawadee UI" w:hAnsi="Leelawadee UI"/>
-          <w:b/>
-          <w:bCs/>
-          <w:color w:val="1A1A1A"/>
-          <w:sz w:val="24"/>
-          <w:szCs w:val="24"/>
-        </w:rPr>
-        <w:t xml:space="preserve">3.3 Planner — วางแผน &amp; มอบหมายงาน</w:t>
       </w:r>
     </w:p>
     <w:p>
@@ -1352,7 +1389,7 @@
       <w:r>
         <w:drawing>
           <wp:inline distT="0" distB="0" distL="0" distR="0">
-            <wp:extent cx="5715000" cy="4305300"/>
+            <wp:extent cx="2857500" cy="3676650"/>
             <wp:effectExtent t="0" r="0" b="0" l="0"/>
             <wp:docPr id="1" name="" descr="" title=""/>
             <wp:cNvGraphicFramePr>
@@ -1377,7 +1414,7 @@
                   <pic:spPr bwMode="auto">
                     <a:xfrm>
                       <a:off x="0" y="0"/>
-                      <a:ext cx="5715000" cy="4305300"/>
+                      <a:ext cx="2857500" cy="3676650"/>
                     </a:xfrm>
                     <a:prstGeom prst="rect">
                       <a:avLst/>
@@ -1404,29 +1441,7 @@
           <w:sz w:val="16"/>
           <w:szCs w:val="16"/>
         </w:rPr>
-        <w:t xml:space="preserve">เพิ่มงาน + มอบหมายให้พนักงานรายคน + พิกัดไซต์งาน</w:t>
-      </w:r>
-    </w:p>
-    <w:p>
-      <w:r>
-        <w:br w:type="page"/>
-      </w:r>
-    </w:p>
-    <w:p>
-      <w:pPr>
-        <w:pStyle w:val="Heading2"/>
-        <w:spacing w:after="100" w:before="220"/>
-      </w:pPr>
-      <w:r>
-        <w:rPr>
-          <w:rFonts w:ascii="Leelawadee UI" w:cs="Leelawadee UI" w:eastAsia="Leelawadee UI" w:hAnsi="Leelawadee UI"/>
-          <w:b/>
-          <w:bCs/>
-          <w:color w:val="1A1A1A"/>
-          <w:sz w:val="24"/>
-          <w:szCs w:val="24"/>
-        </w:rPr>
-        <w:t xml:space="preserve">3.4 คิวอนุมัติ — ลา &amp; OT (2 ลำดับ)</w:t>
+        <w:t xml:space="preserve">ขอลางาน + ดูสถานะการอนุมัติ</w:t>
       </w:r>
     </w:p>
     <w:p>
@@ -1437,7 +1452,7 @@
       <w:r>
         <w:drawing>
           <wp:inline distT="0" distB="0" distL="0" distR="0">
-            <wp:extent cx="5715000" cy="4019550"/>
+            <wp:extent cx="2857500" cy="3676650"/>
             <wp:effectExtent t="0" r="0" b="0" l="0"/>
             <wp:docPr id="1" name="" descr="" title=""/>
             <wp:cNvGraphicFramePr>
@@ -1462,7 +1477,7 @@
                   <pic:spPr bwMode="auto">
                     <a:xfrm>
                       <a:off x="0" y="0"/>
-                      <a:ext cx="5715000" cy="4019550"/>
+                      <a:ext cx="2857500" cy="3676650"/>
                     </a:xfrm>
                     <a:prstGeom prst="rect">
                       <a:avLst/>
@@ -1489,29 +1504,7 @@
           <w:sz w:val="16"/>
           <w:szCs w:val="16"/>
         </w:rPr>
-        <w:t xml:space="preserve">หัวหน้า/ผู้จัดการเห็นเฉพาะรายการที่ตัวเองต้องอนุมัติ</w:t>
-      </w:r>
-    </w:p>
-    <w:p>
-      <w:r>
-        <w:br w:type="page"/>
-      </w:r>
-    </w:p>
-    <w:p>
-      <w:pPr>
-        <w:pStyle w:val="Heading2"/>
-        <w:spacing w:after="100" w:before="220"/>
-      </w:pPr>
-      <w:r>
-        <w:rPr>
-          <w:rFonts w:ascii="Leelawadee UI" w:cs="Leelawadee UI" w:eastAsia="Leelawadee UI" w:hAnsi="Leelawadee UI"/>
-          <w:b/>
-          <w:bCs/>
-          <w:color w:val="1A1A1A"/>
-          <w:sz w:val="24"/>
-          <w:szCs w:val="24"/>
-        </w:rPr>
-        <w:t xml:space="preserve">3.5 รายงาน — ขาด/ลา/มาสาย/ชั่วโมง</w:t>
+        <w:t xml:space="preserve">ขอ OT ล่วงหน้า (อ้างอิงงาน Planner)</w:t>
       </w:r>
     </w:p>
     <w:p>
@@ -1522,7 +1515,7 @@
       <w:r>
         <w:drawing>
           <wp:inline distT="0" distB="0" distL="0" distR="0">
-            <wp:extent cx="5715000" cy="5438775"/>
+            <wp:extent cx="2857500" cy="4429125"/>
             <wp:effectExtent t="0" r="0" b="0" l="0"/>
             <wp:docPr id="1" name="" descr="" title=""/>
             <wp:cNvGraphicFramePr>
@@ -1547,7 +1540,7 @@
                   <pic:spPr bwMode="auto">
                     <a:xfrm>
                       <a:off x="0" y="0"/>
-                      <a:ext cx="5715000" cy="5438775"/>
+                      <a:ext cx="2857500" cy="4429125"/>
                     </a:xfrm>
                     <a:prstGeom prst="rect">
                       <a:avLst/>
@@ -1574,7 +1567,7 @@
           <w:sz w:val="16"/>
           <w:szCs w:val="16"/>
         </w:rPr>
-        <w:t xml:space="preserve">สรุปรายเดือน แยกรายคน · แผนก · จ๊อป (แสดงเป็นชั่วโมง ไม่มีเงิน)</w:t>
+        <w:t xml:space="preserve">จองรถ — ระบบแสดงเฉพาะรถที่ว่างในช่วงเวลานั้น</w:t>
       </w:r>
     </w:p>
     <w:p>
@@ -1596,7 +1589,20 @@
           <w:sz w:val="24"/>
           <w:szCs w:val="24"/>
         </w:rPr>
-        <w:t xml:space="preserve">3.6 วันลาคงเหลือ &amp; ทะเบียนพนักงาน</w:t>
+        <w:t xml:space="preserve">3.2 แดชบอร์ด HR — ภาพรวมวันนี้</w:t>
+      </w:r>
+    </w:p>
+    <w:p>
+      <w:pPr>
+        <w:spacing w:after="100" w:line="276"/>
+      </w:pPr>
+      <w:r>
+        <w:rPr>
+          <w:rFonts w:ascii="Leelawadee UI" w:cs="Leelawadee UI" w:eastAsia="Leelawadee UI" w:hAnsi="Leelawadee UI"/>
+          <w:sz w:val="20"/>
+          <w:szCs w:val="20"/>
+        </w:rPr>
+        <w:t xml:space="preserve">สรุปเรียลไทม์: เข้างานแล้วกี่คน, มาสายกี่คน, ลากี่คน, ยังไม่เข้ากี่คน พร้อมสถานะรายคน (ตรงเวลา/สาย/ทำงานอยู่)</w:t>
       </w:r>
     </w:p>
     <w:p>
@@ -1607,7 +1613,7 @@
       <w:r>
         <w:drawing>
           <wp:inline distT="0" distB="0" distL="0" distR="0">
-            <wp:extent cx="5715000" cy="4257675"/>
+            <wp:extent cx="5715000" cy="4019550"/>
             <wp:effectExtent t="0" r="0" b="0" l="0"/>
             <wp:docPr id="1" name="" descr="" title=""/>
             <wp:cNvGraphicFramePr>
@@ -1632,7 +1638,7 @@
                   <pic:spPr bwMode="auto">
                     <a:xfrm>
                       <a:off x="0" y="0"/>
-                      <a:ext cx="5715000" cy="4257675"/>
+                      <a:ext cx="5715000" cy="4019550"/>
                     </a:xfrm>
                     <a:prstGeom prst="rect">
                       <a:avLst/>
@@ -1659,7 +1665,29 @@
           <w:sz w:val="16"/>
           <w:szCs w:val="16"/>
         </w:rPr>
-        <w:t xml:space="preserve">วันลาคงเหลือรายคน (ใช้ไป/โควตา)</w:t>
+        <w:t xml:space="preserve">แดชบอร์ด HR — แท็บ “วันนี้”</w:t>
+      </w:r>
+    </w:p>
+    <w:p>
+      <w:r>
+        <w:br w:type="page"/>
+      </w:r>
+    </w:p>
+    <w:p>
+      <w:pPr>
+        <w:pStyle w:val="Heading2"/>
+        <w:spacing w:after="100" w:before="220"/>
+      </w:pPr>
+      <w:r>
+        <w:rPr>
+          <w:rFonts w:ascii="Leelawadee UI" w:cs="Leelawadee UI" w:eastAsia="Leelawadee UI" w:hAnsi="Leelawadee UI"/>
+          <w:b/>
+          <w:bCs/>
+          <w:color w:val="1A1A1A"/>
+          <w:sz w:val="24"/>
+          <w:szCs w:val="24"/>
+        </w:rPr>
+        <w:t xml:space="preserve">3.3 Planner — วางแผน &amp; มอบหมายงาน</w:t>
       </w:r>
     </w:p>
     <w:p>
@@ -1670,7 +1698,7 @@
       <w:r>
         <w:drawing>
           <wp:inline distT="0" distB="0" distL="0" distR="0">
-            <wp:extent cx="5715000" cy="4019550"/>
+            <wp:extent cx="5715000" cy="4305300"/>
             <wp:effectExtent t="0" r="0" b="0" l="0"/>
             <wp:docPr id="1" name="" descr="" title=""/>
             <wp:cNvGraphicFramePr>
@@ -1695,6 +1723,91 @@
                   <pic:spPr bwMode="auto">
                     <a:xfrm>
                       <a:off x="0" y="0"/>
+                      <a:ext cx="5715000" cy="4305300"/>
+                    </a:xfrm>
+                    <a:prstGeom prst="rect">
+                      <a:avLst/>
+                    </a:prstGeom>
+                  </pic:spPr>
+                </pic:pic>
+              </a:graphicData>
+            </a:graphic>
+          </wp:inline>
+        </w:drawing>
+      </w:r>
+    </w:p>
+    <w:p>
+      <w:pPr>
+        <w:spacing w:after="200"/>
+        <w:jc w:val="center"/>
+      </w:pPr>
+      <w:r>
+        <w:rPr>
+          <w:rFonts w:ascii="Leelawadee UI" w:cs="Leelawadee UI" w:eastAsia="Leelawadee UI" w:hAnsi="Leelawadee UI"/>
+          <w:i/>
+          <w:iCs/>
+          <w:color w:val="666666"/>
+          <w:sz w:val="16"/>
+          <w:szCs w:val="16"/>
+        </w:rPr>
+        <w:t xml:space="preserve">เพิ่มงาน + มอบหมายให้พนักงานรายคน + พิกัดไซต์งาน</w:t>
+      </w:r>
+    </w:p>
+    <w:p>
+      <w:r>
+        <w:br w:type="page"/>
+      </w:r>
+    </w:p>
+    <w:p>
+      <w:pPr>
+        <w:pStyle w:val="Heading2"/>
+        <w:spacing w:after="100" w:before="220"/>
+      </w:pPr>
+      <w:r>
+        <w:rPr>
+          <w:rFonts w:ascii="Leelawadee UI" w:cs="Leelawadee UI" w:eastAsia="Leelawadee UI" w:hAnsi="Leelawadee UI"/>
+          <w:b/>
+          <w:bCs/>
+          <w:color w:val="1A1A1A"/>
+          <w:sz w:val="24"/>
+          <w:szCs w:val="24"/>
+        </w:rPr>
+        <w:t xml:space="preserve">3.4 คิวอนุมัติ — ลา &amp; OT (2 ลำดับ)</w:t>
+      </w:r>
+    </w:p>
+    <w:p>
+      <w:pPr>
+        <w:spacing w:after="120" w:before="120"/>
+        <w:jc w:val="center"/>
+      </w:pPr>
+      <w:r>
+        <w:drawing>
+          <wp:inline distT="0" distB="0" distL="0" distR="0">
+            <wp:extent cx="5715000" cy="4019550"/>
+            <wp:effectExtent t="0" r="0" b="0" l="0"/>
+            <wp:docPr id="1" name="" descr="" title=""/>
+            <wp:cNvGraphicFramePr>
+              <a:graphicFrameLocks xmlns:a="http://schemas.openxmlformats.org/drawingml/2006/main" noChangeAspect="1"/>
+            </wp:cNvGraphicFramePr>
+            <a:graphic xmlns:a="http://schemas.openxmlformats.org/drawingml/2006/main">
+              <a:graphicData uri="http://schemas.openxmlformats.org/drawingml/2006/picture">
+                <pic:pic xmlns:pic="http://schemas.openxmlformats.org/drawingml/2006/picture">
+                  <pic:nvPicPr>
+                    <pic:cNvPr id="0" name="" descr=""/>
+                    <pic:cNvPicPr>
+                      <a:picLocks noChangeAspect="1" noChangeArrowheads="1"/>
+                    </pic:cNvPicPr>
+                  </pic:nvPicPr>
+                  <pic:blipFill>
+                    <a:blip r:embed="rId15" cstate="none"/>
+                    <a:srcRect/>
+                    <a:stretch>
+                      <a:fillRect/>
+                    </a:stretch>
+                  </pic:blipFill>
+                  <pic:spPr bwMode="auto">
+                    <a:xfrm>
+                      <a:off x="0" y="0"/>
                       <a:ext cx="5715000" cy="4019550"/>
                     </a:xfrm>
                     <a:prstGeom prst="rect">
@@ -1722,7 +1835,338 @@
           <w:sz w:val="16"/>
           <w:szCs w:val="16"/>
         </w:rPr>
+        <w:t xml:space="preserve">หัวหน้า/ผู้จัดการเห็นเฉพาะรายการที่ตัวเองต้องอนุมัติ</w:t>
+      </w:r>
+    </w:p>
+    <w:p>
+      <w:r>
+        <w:br w:type="page"/>
+      </w:r>
+    </w:p>
+    <w:p>
+      <w:pPr>
+        <w:pStyle w:val="Heading2"/>
+        <w:spacing w:after="100" w:before="220"/>
+      </w:pPr>
+      <w:r>
+        <w:rPr>
+          <w:rFonts w:ascii="Leelawadee UI" w:cs="Leelawadee UI" w:eastAsia="Leelawadee UI" w:hAnsi="Leelawadee UI"/>
+          <w:b/>
+          <w:bCs/>
+          <w:color w:val="1A1A1A"/>
+          <w:sz w:val="24"/>
+          <w:szCs w:val="24"/>
+        </w:rPr>
+        <w:t xml:space="preserve">3.5 รายงาน — ขาด/ลา/มาสาย/ชั่วโมง</w:t>
+      </w:r>
+    </w:p>
+    <w:p>
+      <w:pPr>
+        <w:spacing w:after="120" w:before="120"/>
+        <w:jc w:val="center"/>
+      </w:pPr>
+      <w:r>
+        <w:drawing>
+          <wp:inline distT="0" distB="0" distL="0" distR="0">
+            <wp:extent cx="5715000" cy="5438775"/>
+            <wp:effectExtent t="0" r="0" b="0" l="0"/>
+            <wp:docPr id="1" name="" descr="" title=""/>
+            <wp:cNvGraphicFramePr>
+              <a:graphicFrameLocks xmlns:a="http://schemas.openxmlformats.org/drawingml/2006/main" noChangeAspect="1"/>
+            </wp:cNvGraphicFramePr>
+            <a:graphic xmlns:a="http://schemas.openxmlformats.org/drawingml/2006/main">
+              <a:graphicData uri="http://schemas.openxmlformats.org/drawingml/2006/picture">
+                <pic:pic xmlns:pic="http://schemas.openxmlformats.org/drawingml/2006/picture">
+                  <pic:nvPicPr>
+                    <pic:cNvPr id="0" name="" descr=""/>
+                    <pic:cNvPicPr>
+                      <a:picLocks noChangeAspect="1" noChangeArrowheads="1"/>
+                    </pic:cNvPicPr>
+                  </pic:nvPicPr>
+                  <pic:blipFill>
+                    <a:blip r:embed="rId16" cstate="none"/>
+                    <a:srcRect/>
+                    <a:stretch>
+                      <a:fillRect/>
+                    </a:stretch>
+                  </pic:blipFill>
+                  <pic:spPr bwMode="auto">
+                    <a:xfrm>
+                      <a:off x="0" y="0"/>
+                      <a:ext cx="5715000" cy="5438775"/>
+                    </a:xfrm>
+                    <a:prstGeom prst="rect">
+                      <a:avLst/>
+                    </a:prstGeom>
+                  </pic:spPr>
+                </pic:pic>
+              </a:graphicData>
+            </a:graphic>
+          </wp:inline>
+        </w:drawing>
+      </w:r>
+    </w:p>
+    <w:p>
+      <w:pPr>
+        <w:spacing w:after="200"/>
+        <w:jc w:val="center"/>
+      </w:pPr>
+      <w:r>
+        <w:rPr>
+          <w:rFonts w:ascii="Leelawadee UI" w:cs="Leelawadee UI" w:eastAsia="Leelawadee UI" w:hAnsi="Leelawadee UI"/>
+          <w:i/>
+          <w:iCs/>
+          <w:color w:val="666666"/>
+          <w:sz w:val="16"/>
+          <w:szCs w:val="16"/>
+        </w:rPr>
+        <w:t xml:space="preserve">สรุปรายเดือน แยกรายคน · แผนก · จ๊อป (แสดงเป็นชั่วโมง ไม่มีเงิน)</w:t>
+      </w:r>
+    </w:p>
+    <w:p>
+      <w:r>
+        <w:br w:type="page"/>
+      </w:r>
+    </w:p>
+    <w:p>
+      <w:pPr>
+        <w:pStyle w:val="Heading2"/>
+        <w:spacing w:after="100" w:before="220"/>
+      </w:pPr>
+      <w:r>
+        <w:rPr>
+          <w:rFonts w:ascii="Leelawadee UI" w:cs="Leelawadee UI" w:eastAsia="Leelawadee UI" w:hAnsi="Leelawadee UI"/>
+          <w:b/>
+          <w:bCs/>
+          <w:color w:val="1A1A1A"/>
+          <w:sz w:val="24"/>
+          <w:szCs w:val="24"/>
+        </w:rPr>
+        <w:t xml:space="preserve">3.6 วันลาคงเหลือ &amp; ทะเบียนพนักงาน</w:t>
+      </w:r>
+    </w:p>
+    <w:p>
+      <w:pPr>
+        <w:spacing w:after="120" w:before="120"/>
+        <w:jc w:val="center"/>
+      </w:pPr>
+      <w:r>
+        <w:drawing>
+          <wp:inline distT="0" distB="0" distL="0" distR="0">
+            <wp:extent cx="5715000" cy="4257675"/>
+            <wp:effectExtent t="0" r="0" b="0" l="0"/>
+            <wp:docPr id="1" name="" descr="" title=""/>
+            <wp:cNvGraphicFramePr>
+              <a:graphicFrameLocks xmlns:a="http://schemas.openxmlformats.org/drawingml/2006/main" noChangeAspect="1"/>
+            </wp:cNvGraphicFramePr>
+            <a:graphic xmlns:a="http://schemas.openxmlformats.org/drawingml/2006/main">
+              <a:graphicData uri="http://schemas.openxmlformats.org/drawingml/2006/picture">
+                <pic:pic xmlns:pic="http://schemas.openxmlformats.org/drawingml/2006/picture">
+                  <pic:nvPicPr>
+                    <pic:cNvPr id="0" name="" descr=""/>
+                    <pic:cNvPicPr>
+                      <a:picLocks noChangeAspect="1" noChangeArrowheads="1"/>
+                    </pic:cNvPicPr>
+                  </pic:nvPicPr>
+                  <pic:blipFill>
+                    <a:blip r:embed="rId17" cstate="none"/>
+                    <a:srcRect/>
+                    <a:stretch>
+                      <a:fillRect/>
+                    </a:stretch>
+                  </pic:blipFill>
+                  <pic:spPr bwMode="auto">
+                    <a:xfrm>
+                      <a:off x="0" y="0"/>
+                      <a:ext cx="5715000" cy="4257675"/>
+                    </a:xfrm>
+                    <a:prstGeom prst="rect">
+                      <a:avLst/>
+                    </a:prstGeom>
+                  </pic:spPr>
+                </pic:pic>
+              </a:graphicData>
+            </a:graphic>
+          </wp:inline>
+        </w:drawing>
+      </w:r>
+    </w:p>
+    <w:p>
+      <w:pPr>
+        <w:spacing w:after="200"/>
+        <w:jc w:val="center"/>
+      </w:pPr>
+      <w:r>
+        <w:rPr>
+          <w:rFonts w:ascii="Leelawadee UI" w:cs="Leelawadee UI" w:eastAsia="Leelawadee UI" w:hAnsi="Leelawadee UI"/>
+          <w:i/>
+          <w:iCs/>
+          <w:color w:val="666666"/>
+          <w:sz w:val="16"/>
+          <w:szCs w:val="16"/>
+        </w:rPr>
+        <w:t xml:space="preserve">วันลาคงเหลือรายคน (ใช้ไป/โควตา)</w:t>
+      </w:r>
+    </w:p>
+    <w:p>
+      <w:pPr>
+        <w:spacing w:after="120" w:before="120"/>
+        <w:jc w:val="center"/>
+      </w:pPr>
+      <w:r>
+        <w:drawing>
+          <wp:inline distT="0" distB="0" distL="0" distR="0">
+            <wp:extent cx="5715000" cy="4019550"/>
+            <wp:effectExtent t="0" r="0" b="0" l="0"/>
+            <wp:docPr id="1" name="" descr="" title=""/>
+            <wp:cNvGraphicFramePr>
+              <a:graphicFrameLocks xmlns:a="http://schemas.openxmlformats.org/drawingml/2006/main" noChangeAspect="1"/>
+            </wp:cNvGraphicFramePr>
+            <a:graphic xmlns:a="http://schemas.openxmlformats.org/drawingml/2006/main">
+              <a:graphicData uri="http://schemas.openxmlformats.org/drawingml/2006/picture">
+                <pic:pic xmlns:pic="http://schemas.openxmlformats.org/drawingml/2006/picture">
+                  <pic:nvPicPr>
+                    <pic:cNvPr id="0" name="" descr=""/>
+                    <pic:cNvPicPr>
+                      <a:picLocks noChangeAspect="1" noChangeArrowheads="1"/>
+                    </pic:cNvPicPr>
+                  </pic:nvPicPr>
+                  <pic:blipFill>
+                    <a:blip r:embed="rId18" cstate="none"/>
+                    <a:srcRect/>
+                    <a:stretch>
+                      <a:fillRect/>
+                    </a:stretch>
+                  </pic:blipFill>
+                  <pic:spPr bwMode="auto">
+                    <a:xfrm>
+                      <a:off x="0" y="0"/>
+                      <a:ext cx="5715000" cy="4019550"/>
+                    </a:xfrm>
+                    <a:prstGeom prst="rect">
+                      <a:avLst/>
+                    </a:prstGeom>
+                  </pic:spPr>
+                </pic:pic>
+              </a:graphicData>
+            </a:graphic>
+          </wp:inline>
+        </w:drawing>
+      </w:r>
+    </w:p>
+    <w:p>
+      <w:pPr>
+        <w:spacing w:after="200"/>
+        <w:jc w:val="center"/>
+      </w:pPr>
+      <w:r>
+        <w:rPr>
+          <w:rFonts w:ascii="Leelawadee UI" w:cs="Leelawadee UI" w:eastAsia="Leelawadee UI" w:hAnsi="Leelawadee UI"/>
+          <w:i/>
+          <w:iCs/>
+          <w:color w:val="666666"/>
+          <w:sz w:val="16"/>
+          <w:szCs w:val="16"/>
+        </w:rPr>
         <w:t xml:space="preserve">ทะเบียนพนักงาน: ระดับสิทธิ์ + หัวหน้าโดยตรง</w:t>
+      </w:r>
+    </w:p>
+    <w:p>
+      <w:r>
+        <w:br w:type="page"/>
+      </w:r>
+    </w:p>
+    <w:p>
+      <w:pPr>
+        <w:pStyle w:val="Heading2"/>
+        <w:spacing w:after="100" w:before="220"/>
+      </w:pPr>
+      <w:r>
+        <w:rPr>
+          <w:rFonts w:ascii="Leelawadee UI" w:cs="Leelawadee UI" w:eastAsia="Leelawadee UI" w:hAnsi="Leelawadee UI"/>
+          <w:b/>
+          <w:bCs/>
+          <w:color w:val="1A1A1A"/>
+          <w:sz w:val="24"/>
+          <w:szCs w:val="24"/>
+        </w:rPr>
+        <w:t xml:space="preserve">3.7 จองรถ (แดชบอร์ด)</w:t>
+      </w:r>
+    </w:p>
+    <w:p>
+      <w:pPr>
+        <w:spacing w:after="100" w:line="276"/>
+      </w:pPr>
+      <w:r>
+        <w:rPr>
+          <w:rFonts w:ascii="Leelawadee UI" w:cs="Leelawadee UI" w:eastAsia="Leelawadee UI" w:hAnsi="Leelawadee UI"/>
+          <w:sz w:val="20"/>
+          <w:szCs w:val="20"/>
+        </w:rPr>
+        <w:t xml:space="preserve">จองแบบมาก่อนได้ก่อน • ระบบกันเวลาชนกันอัตโนมัติ • ผู้ดูแลรถ “ย้ายรถ” (สลับให้คันว่าง) หรือ “ยกเลิก” ได้</w:t>
+      </w:r>
+    </w:p>
+    <w:p>
+      <w:pPr>
+        <w:spacing w:after="120" w:before="120"/>
+        <w:jc w:val="center"/>
+      </w:pPr>
+      <w:r>
+        <w:drawing>
+          <wp:inline distT="0" distB="0" distL="0" distR="0">
+            <wp:extent cx="5715000" cy="4019550"/>
+            <wp:effectExtent t="0" r="0" b="0" l="0"/>
+            <wp:docPr id="1" name="" descr="" title=""/>
+            <wp:cNvGraphicFramePr>
+              <a:graphicFrameLocks xmlns:a="http://schemas.openxmlformats.org/drawingml/2006/main" noChangeAspect="1"/>
+            </wp:cNvGraphicFramePr>
+            <a:graphic xmlns:a="http://schemas.openxmlformats.org/drawingml/2006/main">
+              <a:graphicData uri="http://schemas.openxmlformats.org/drawingml/2006/picture">
+                <pic:pic xmlns:pic="http://schemas.openxmlformats.org/drawingml/2006/picture">
+                  <pic:nvPicPr>
+                    <pic:cNvPr id="0" name="" descr=""/>
+                    <pic:cNvPicPr>
+                      <a:picLocks noChangeAspect="1" noChangeArrowheads="1"/>
+                    </pic:cNvPicPr>
+                  </pic:nvPicPr>
+                  <pic:blipFill>
+                    <a:blip r:embed="rId19" cstate="none"/>
+                    <a:srcRect/>
+                    <a:stretch>
+                      <a:fillRect/>
+                    </a:stretch>
+                  </pic:blipFill>
+                  <pic:spPr bwMode="auto">
+                    <a:xfrm>
+                      <a:off x="0" y="0"/>
+                      <a:ext cx="5715000" cy="4019550"/>
+                    </a:xfrm>
+                    <a:prstGeom prst="rect">
+                      <a:avLst/>
+                    </a:prstGeom>
+                  </pic:spPr>
+                </pic:pic>
+              </a:graphicData>
+            </a:graphic>
+          </wp:inline>
+        </w:drawing>
+      </w:r>
+    </w:p>
+    <w:p>
+      <w:pPr>
+        <w:spacing w:after="200"/>
+        <w:jc w:val="center"/>
+      </w:pPr>
+      <w:r>
+        <w:rPr>
+          <w:rFonts w:ascii="Leelawadee UI" w:cs="Leelawadee UI" w:eastAsia="Leelawadee UI" w:hAnsi="Leelawadee UI"/>
+          <w:i/>
+          <w:iCs/>
+          <w:color w:val="666666"/>
+          <w:sz w:val="16"/>
+          <w:szCs w:val="16"/>
+        </w:rPr>
+        <w:t xml:space="preserve">ทะเบียนรถ + ตารางการจอง + ย้าย/ยกเลิก</w:t>
       </w:r>
     </w:p>
     <w:p>
@@ -2378,6 +2822,92 @@
           </w:p>
         </w:tc>
       </w:tr>
+      <w:tr>
+        <w:trPr>
+          <w:tblHeader w:val="false"/>
+        </w:trPr>
+        <w:tc>
+          <w:tcPr>
+            <w:tcW w:type="dxa" w:w="2500"/>
+            <w:tcMar>
+              <w:top w:type="dxa" w:w="60"/>
+              <w:left w:type="dxa" w:w="100"/>
+              <w:bottom w:type="dxa" w:w="60"/>
+              <w:right w:type="dxa" w:w="100"/>
+            </w:tcMar>
+          </w:tcPr>
+          <w:p>
+            <w:pPr>
+              <w:spacing w:after="0" w:line="252"/>
+            </w:pPr>
+            <w:r>
+              <w:rPr>
+                <w:rFonts w:ascii="Leelawadee UI" w:cs="Leelawadee UI" w:eastAsia="Leelawadee UI" w:hAnsi="Leelawadee UI"/>
+                <w:b w:val="false"/>
+                <w:bCs w:val="false"/>
+                <w:color w:val="1A1A1A"/>
+                <w:sz w:val="18"/>
+                <w:szCs w:val="18"/>
+              </w:rPr>
+              <w:t xml:space="preserve">จองรถ</w:t>
+            </w:r>
+          </w:p>
+        </w:tc>
+        <w:tc>
+          <w:tcPr>
+            <w:tcW w:type="dxa" w:w="4500"/>
+            <w:tcMar>
+              <w:top w:type="dxa" w:w="60"/>
+              <w:left w:type="dxa" w:w="100"/>
+              <w:bottom w:type="dxa" w:w="60"/>
+              <w:right w:type="dxa" w:w="100"/>
+            </w:tcMar>
+          </w:tcPr>
+          <w:p>
+            <w:pPr>
+              <w:spacing w:after="0" w:line="252"/>
+            </w:pPr>
+            <w:r>
+              <w:rPr>
+                <w:rFonts w:ascii="Leelawadee UI" w:cs="Leelawadee UI" w:eastAsia="Leelawadee UI" w:hAnsi="Leelawadee UI"/>
+                <w:b w:val="false"/>
+                <w:bCs w:val="false"/>
+                <w:color w:val="1A1A1A"/>
+                <w:sz w:val="18"/>
+                <w:szCs w:val="18"/>
+              </w:rPr>
+              <w:t xml:space="preserve">จองรถบริษัทตามช่วงเวลา ผูกกับงาน กันเวลาชนกัน ผู้ดูแลย้าย/ยกเลิกได้</w:t>
+            </w:r>
+          </w:p>
+        </w:tc>
+        <w:tc>
+          <w:tcPr>
+            <w:tcW w:type="dxa" w:w="2360"/>
+            <w:tcMar>
+              <w:top w:type="dxa" w:w="60"/>
+              <w:left w:type="dxa" w:w="100"/>
+              <w:bottom w:type="dxa" w:w="60"/>
+              <w:right w:type="dxa" w:w="100"/>
+            </w:tcMar>
+          </w:tcPr>
+          <w:p>
+            <w:pPr>
+              <w:spacing w:after="0" w:line="252"/>
+            </w:pPr>
+            <w:r>
+              <w:rPr>
+                <w:rFonts w:ascii="Leelawadee UI" w:cs="Leelawadee UI" w:eastAsia="Leelawadee UI" w:hAnsi="Leelawadee UI"/>
+                <w:b w:val="false"/>
+                <w:bCs w:val="false"/>
+                <w:color w:val="1A1A1A"/>
+                <w:sz w:val="18"/>
+                <w:szCs w:val="18"/>
+              </w:rPr>
+              <w:t xml:space="preserve">พนักงาน / ผู้ดูแลรถ</w:t>
+            </w:r>
+          </w:p>
+        </w:tc>
+      </w:tr>
     </w:tbl>
     <w:p>
       <w:pPr>
@@ -3844,6 +4374,126 @@
                 <w:szCs w:val="18"/>
               </w:rPr>
               <w:t xml:space="preserve">ชื่อผู้ใช้, ชื่อ-สกุล, แผนก, ตำแหน่ง, ระดับสิทธิ์, หัวหน้า</w:t>
+            </w:r>
+          </w:p>
+        </w:tc>
+      </w:tr>
+      <w:tr>
+        <w:trPr>
+          <w:tblHeader w:val="false"/>
+        </w:trPr>
+        <w:tc>
+          <w:tcPr>
+            <w:tcW w:type="dxa" w:w="2600"/>
+            <w:shd w:fill="F2F2F2" w:color="auto" w:val="clear"/>
+            <w:tcMar>
+              <w:top w:type="dxa" w:w="60"/>
+              <w:left w:type="dxa" w:w="100"/>
+              <w:bottom w:type="dxa" w:w="60"/>
+              <w:right w:type="dxa" w:w="100"/>
+            </w:tcMar>
+          </w:tcPr>
+          <w:p>
+            <w:pPr>
+              <w:spacing w:after="0" w:line="252"/>
+            </w:pPr>
+            <w:r>
+              <w:rPr>
+                <w:rFonts w:ascii="Leelawadee UI" w:cs="Leelawadee UI" w:eastAsia="Leelawadee UI" w:hAnsi="Leelawadee UI"/>
+                <w:b w:val="false"/>
+                <w:bCs w:val="false"/>
+                <w:color w:val="1A1A1A"/>
+                <w:sz w:val="18"/>
+                <w:szCs w:val="18"/>
+              </w:rPr>
+              <w:t xml:space="preserve">รถ (Fleet)</w:t>
+            </w:r>
+          </w:p>
+        </w:tc>
+        <w:tc>
+          <w:tcPr>
+            <w:tcW w:type="dxa" w:w="6760"/>
+            <w:shd w:fill="F2F2F2" w:color="auto" w:val="clear"/>
+            <w:tcMar>
+              <w:top w:type="dxa" w:w="60"/>
+              <w:left w:type="dxa" w:w="100"/>
+              <w:bottom w:type="dxa" w:w="60"/>
+              <w:right w:type="dxa" w:w="100"/>
+            </w:tcMar>
+          </w:tcPr>
+          <w:p>
+            <w:pPr>
+              <w:spacing w:after="0" w:line="252"/>
+            </w:pPr>
+            <w:r>
+              <w:rPr>
+                <w:rFonts w:ascii="Leelawadee UI" w:cs="Leelawadee UI" w:eastAsia="Leelawadee UI" w:hAnsi="Leelawadee UI"/>
+                <w:b w:val="false"/>
+                <w:bCs w:val="false"/>
+                <w:color w:val="1A1A1A"/>
+                <w:sz w:val="18"/>
+                <w:szCs w:val="18"/>
+              </w:rPr>
+              <w:t xml:space="preserve">ทะเบียน, ประเภท, จำนวนที่นั่ง, สถานะ</w:t>
+            </w:r>
+          </w:p>
+        </w:tc>
+      </w:tr>
+      <w:tr>
+        <w:trPr>
+          <w:tblHeader w:val="false"/>
+        </w:trPr>
+        <w:tc>
+          <w:tcPr>
+            <w:tcW w:type="dxa" w:w="2600"/>
+            <w:tcMar>
+              <w:top w:type="dxa" w:w="60"/>
+              <w:left w:type="dxa" w:w="100"/>
+              <w:bottom w:type="dxa" w:w="60"/>
+              <w:right w:type="dxa" w:w="100"/>
+            </w:tcMar>
+          </w:tcPr>
+          <w:p>
+            <w:pPr>
+              <w:spacing w:after="0" w:line="252"/>
+            </w:pPr>
+            <w:r>
+              <w:rPr>
+                <w:rFonts w:ascii="Leelawadee UI" w:cs="Leelawadee UI" w:eastAsia="Leelawadee UI" w:hAnsi="Leelawadee UI"/>
+                <w:b w:val="false"/>
+                <w:bCs w:val="false"/>
+                <w:color w:val="1A1A1A"/>
+                <w:sz w:val="18"/>
+                <w:szCs w:val="18"/>
+              </w:rPr>
+              <w:t xml:space="preserve">การจองรถ</w:t>
+            </w:r>
+          </w:p>
+        </w:tc>
+        <w:tc>
+          <w:tcPr>
+            <w:tcW w:type="dxa" w:w="6760"/>
+            <w:tcMar>
+              <w:top w:type="dxa" w:w="60"/>
+              <w:left w:type="dxa" w:w="100"/>
+              <w:bottom w:type="dxa" w:w="60"/>
+              <w:right w:type="dxa" w:w="100"/>
+            </w:tcMar>
+          </w:tcPr>
+          <w:p>
+            <w:pPr>
+              <w:spacing w:after="0" w:line="252"/>
+            </w:pPr>
+            <w:r>
+              <w:rPr>
+                <w:rFonts w:ascii="Leelawadee UI" w:cs="Leelawadee UI" w:eastAsia="Leelawadee UI" w:hAnsi="Leelawadee UI"/>
+                <w:b w:val="false"/>
+                <w:bCs w:val="false"/>
+                <w:color w:val="1A1A1A"/>
+                <w:sz w:val="18"/>
+                <w:szCs w:val="18"/>
+              </w:rPr>
+              <w:t xml:space="preserve">ผู้จอง, รถ, วันเวลาไป-กลับ, งาน/ปลายทาง, สถานะ</w:t>
             </w:r>
           </w:p>
         </w:tc>

</xml_diff>

<commit_message>
Summary doc: add org management (import, resign roll-up, cross-dept) + refresh people screenshot
</commit_message>
<xml_diff>
--- a/RSC-Connect-สรุประบบ.docx
+++ b/RSC-Connect-สรุประบบ.docx
@@ -3507,6 +3507,170 @@
     </w:p>
     <w:p>
       <w:pPr>
+        <w:pStyle w:val="Heading2"/>
+        <w:spacing w:after="100" w:before="220"/>
+      </w:pPr>
+      <w:r>
+        <w:rPr>
+          <w:rFonts w:ascii="Leelawadee UI" w:cs="Leelawadee UI" w:eastAsia="Leelawadee UI" w:hAnsi="Leelawadee UI"/>
+          <w:b/>
+          <w:bCs/>
+          <w:color w:val="1A1A1A"/>
+          <w:sz w:val="24"/>
+          <w:szCs w:val="24"/>
+        </w:rPr>
+        <w:t xml:space="preserve">5.1 การจัดการองค์กร &amp; บุคลากร</w:t>
+      </w:r>
+    </w:p>
+    <w:p>
+      <w:pPr>
+        <w:pStyle w:val="ListParagraph"/>
+        <w:numPr>
+          <w:ilvl w:val="0"/>
+          <w:numId w:val="1"/>
+        </w:numPr>
+        <w:spacing w:after="60" w:line="264"/>
+      </w:pPr>
+      <w:r>
+        <w:rPr>
+          <w:rFonts w:ascii="Leelawadee UI" w:cs="Leelawadee UI" w:eastAsia="Leelawadee UI" w:hAnsi="Leelawadee UI"/>
+          <w:b/>
+          <w:bCs/>
+          <w:sz w:val="20"/>
+          <w:szCs w:val="20"/>
+        </w:rPr>
+        <w:t xml:space="preserve">นำเข้าพนักงานทั้งองค์กร: </w:t>
+      </w:r>
+      <w:r>
+        <w:rPr>
+          <w:rFonts w:ascii="Leelawadee UI" w:cs="Leelawadee UI" w:eastAsia="Leelawadee UI" w:hAnsi="Leelawadee UI"/>
+          <w:sz w:val="20"/>
+          <w:szCs w:val="20"/>
+        </w:rPr>
+        <w:t xml:space="preserve">นำเข้าไฟล์รายชื่อ (JSON) ได้ทีเดียว — รองรับข้อมูลจากทะเบียน HR เดิม (รหัสพนักงาน, ชื่อ, แผนก, ตำแหน่ง, หัวหน้า, ระดับสิทธิ์)</w:t>
+      </w:r>
+    </w:p>
+    <w:p>
+      <w:pPr>
+        <w:pStyle w:val="ListParagraph"/>
+        <w:numPr>
+          <w:ilvl w:val="0"/>
+          <w:numId w:val="1"/>
+        </w:numPr>
+        <w:spacing w:after="60" w:line="264"/>
+      </w:pPr>
+      <w:r>
+        <w:rPr>
+          <w:rFonts w:ascii="Leelawadee UI" w:cs="Leelawadee UI" w:eastAsia="Leelawadee UI" w:hAnsi="Leelawadee UI"/>
+          <w:b/>
+          <w:bCs/>
+          <w:sz w:val="20"/>
+          <w:szCs w:val="20"/>
+        </w:rPr>
+        <w:t xml:space="preserve">เปลี่ยนหัวหน้าข้ามแผนกได้: </w:t>
+      </w:r>
+      <w:r>
+        <w:rPr>
+          <w:rFonts w:ascii="Leelawadee UI" w:cs="Leelawadee UI" w:eastAsia="Leelawadee UI" w:hAnsi="Leelawadee UI"/>
+          <w:sz w:val="20"/>
+          <w:szCs w:val="20"/>
+        </w:rPr>
+        <w:t xml:space="preserve">เลือกหัวหน้าจากทุกแผนก ไม่จำกัดเฉพาะแผนกเดียวกัน</w:t>
+      </w:r>
+    </w:p>
+    <w:p>
+      <w:pPr>
+        <w:pStyle w:val="ListParagraph"/>
+        <w:numPr>
+          <w:ilvl w:val="0"/>
+          <w:numId w:val="1"/>
+        </w:numPr>
+        <w:spacing w:after="60" w:line="264"/>
+      </w:pPr>
+      <w:r>
+        <w:rPr>
+          <w:rFonts w:ascii="Leelawadee UI" w:cs="Leelawadee UI" w:eastAsia="Leelawadee UI" w:hAnsi="Leelawadee UI"/>
+          <w:b/>
+          <w:bCs/>
+          <w:sz w:val="20"/>
+          <w:szCs w:val="20"/>
+        </w:rPr>
+        <w:t xml:space="preserve">หัวหน้าลาออก: </w:t>
+      </w:r>
+      <w:r>
+        <w:rPr>
+          <w:rFonts w:ascii="Leelawadee UI" w:cs="Leelawadee UI" w:eastAsia="Leelawadee UI" w:hAnsi="Leelawadee UI"/>
+          <w:sz w:val="20"/>
+          <w:szCs w:val="20"/>
+        </w:rPr>
+        <w:t xml:space="preserve">กด “ลาออก” → ระบบเก็บประวัติไว้ (ไม่ลบ) และย้ายลูกน้องทุกคนขึ้นกับหัวหน้าของคนที่ลาออกโดยอัตโนมัติ (roll-up) — เลือกหัวหน้าใหม่เองได้</w:t>
+      </w:r>
+    </w:p>
+    <w:p>
+      <w:pPr>
+        <w:spacing w:after="120" w:before="120"/>
+        <w:jc w:val="center"/>
+      </w:pPr>
+      <w:r>
+        <w:drawing>
+          <wp:inline distT="0" distB="0" distL="0" distR="0">
+            <wp:extent cx="5715000" cy="4019550"/>
+            <wp:effectExtent t="0" r="0" b="0" l="0"/>
+            <wp:docPr id="1" name="" descr="" title=""/>
+            <wp:cNvGraphicFramePr>
+              <a:graphicFrameLocks xmlns:a="http://schemas.openxmlformats.org/drawingml/2006/main" noChangeAspect="1"/>
+            </wp:cNvGraphicFramePr>
+            <a:graphic xmlns:a="http://schemas.openxmlformats.org/drawingml/2006/main">
+              <a:graphicData uri="http://schemas.openxmlformats.org/drawingml/2006/picture">
+                <pic:pic xmlns:pic="http://schemas.openxmlformats.org/drawingml/2006/picture">
+                  <pic:nvPicPr>
+                    <pic:cNvPr id="0" name="" descr=""/>
+                    <pic:cNvPicPr>
+                      <a:picLocks noChangeAspect="1" noChangeArrowheads="1"/>
+                    </pic:cNvPicPr>
+                  </pic:nvPicPr>
+                  <pic:blipFill>
+                    <a:blip r:embed="rId18" cstate="none"/>
+                    <a:srcRect/>
+                    <a:stretch>
+                      <a:fillRect/>
+                    </a:stretch>
+                  </pic:blipFill>
+                  <pic:spPr bwMode="auto">
+                    <a:xfrm>
+                      <a:off x="0" y="0"/>
+                      <a:ext cx="5715000" cy="4019550"/>
+                    </a:xfrm>
+                    <a:prstGeom prst="rect">
+                      <a:avLst/>
+                    </a:prstGeom>
+                  </pic:spPr>
+                </pic:pic>
+              </a:graphicData>
+            </a:graphic>
+          </wp:inline>
+        </w:drawing>
+      </w:r>
+    </w:p>
+    <w:p>
+      <w:pPr>
+        <w:spacing w:after="200"/>
+        <w:jc w:val="center"/>
+      </w:pPr>
+      <w:r>
+        <w:rPr>
+          <w:rFonts w:ascii="Leelawadee UI" w:cs="Leelawadee UI" w:eastAsia="Leelawadee UI" w:hAnsi="Leelawadee UI"/>
+          <w:i/>
+          <w:iCs/>
+          <w:color w:val="666666"/>
+          <w:sz w:val="16"/>
+          <w:szCs w:val="16"/>
+        </w:rPr>
+        <w:t xml:space="preserve">ทะเบียนพนักงาน: นำเข้า/สำรอง JSON · ระดับสิทธิ์ · หัวหน้า · ลาออก</w:t>
+      </w:r>
+    </w:p>
+    <w:p>
+      <w:pPr>
         <w:pStyle w:val="Heading1"/>
         <w:spacing w:after="120" w:before="280"/>
       </w:pPr>
@@ -4708,10 +4872,20 @@
       <w:r>
         <w:rPr>
           <w:rFonts w:ascii="Leelawadee UI" w:cs="Leelawadee UI" w:eastAsia="Leelawadee UI" w:hAnsi="Leelawadee UI"/>
-          <w:sz w:val="20"/>
-          <w:szCs w:val="20"/>
-        </w:rPr>
-        <w:t xml:space="preserve">รายชื่อพนักงาน: ชื่อผู้ใช้, ชื่อ-สกุล, แผนก, ตำแหน่ง, ระดับสิทธิ์, หัวหน้า</w:t>
+          <w:b/>
+          <w:bCs/>
+          <w:sz w:val="20"/>
+          <w:szCs w:val="20"/>
+        </w:rPr>
+        <w:t xml:space="preserve">รายชื่อพนักงาน (มีในทะเบียน HR เดิมแล้ว): </w:t>
+      </w:r>
+      <w:r>
+        <w:rPr>
+          <w:rFonts w:ascii="Leelawadee UI" w:cs="Leelawadee UI" w:eastAsia="Leelawadee UI" w:hAnsi="Leelawadee UI"/>
+          <w:sz w:val="20"/>
+          <w:szCs w:val="20"/>
+        </w:rPr>
+        <w:t xml:space="preserve">รหัสพนักงาน, ชื่อ-สกุล, แผนก, ตำแหน่ง, หัวหน้า → นำเข้าได้ทีเดียว (เตรียมไฟล์ 38 คนไว้แล้ว)</w:t>
       </w:r>
     </w:p>
     <w:p>

</xml_diff>

<commit_message>
Update Word summary: add time-logging by JR + office/factory hours
- New section 3.8: บันทึกเวลาตาม JR (mobile card + hours-by-JR dashboard)
- Exec summary, connectivity table, feature table, data table, and scope
  note updated to cover time logging, office/factory side, and Excel export

Co-Authored-By: Claude Opus 4.8 <noreply@anthropic.com>
Claude-Session: https://claude.ai/code/session_01ArsoFtzBDrJZ1pV8kUFrfD
</commit_message>
<xml_diff>
--- a/RSC-Connect-สรุประบบ.docx
+++ b/RSC-Connect-สรุประบบ.docx
@@ -264,7 +264,25 @@
           <w:sz w:val="23"/>
           <w:szCs w:val="23"/>
         </w:rPr>
-        <w:t xml:space="preserve">รายงาน ขาด / ลา / มาสาย / ชั่วโมงทำงาน แยกแผนก · คน · งาน</w:t>
+        <w:t xml:space="preserve">บันทึกเวลาทำงานจริงตามเลข JR (เลือกช่วงเช้า/บ่าย/เต็มวัน หรือระบุเวลาเอง) — แยกฝั่งสำนักงาน/โรงงาน ให้บัญชีนำไปคิดค่าแรง</w:t>
+      </w:r>
+    </w:p>
+    <w:p>
+      <w:pPr>
+        <w:pStyle w:val="ListParagraph"/>
+        <w:numPr>
+          <w:ilvl w:val="0"/>
+          <w:numId w:val="1"/>
+        </w:numPr>
+        <w:spacing w:after="80" w:line="312"/>
+      </w:pPr>
+      <w:r>
+        <w:rPr>
+          <w:rFonts w:ascii="Sarabun" w:cs="Sarabun" w:eastAsia="Sarabun" w:hAnsi="Sarabun"/>
+          <w:sz w:val="23"/>
+          <w:szCs w:val="23"/>
+        </w:rPr>
+        <w:t xml:space="preserve">รายงาน ขาด / ลา / มาสาย / ชั่วโมงทำงาน แยกแผนก · คน · งาน · ส่งออก Excel และ CSV</w:t>
       </w:r>
     </w:p>
     <w:tbl>
@@ -1869,7 +1887,7 @@
                 <w:sz w:val="21"/>
                 <w:szCs w:val="21"/>
               </w:rPr>
-              <w:t xml:space="preserve">ข้อมูลทั้งหมด</w:t>
+              <w:t xml:space="preserve">บันทึกเวลาตาม JR</w:t>
             </w:r>
           </w:p>
         </w:tc>
@@ -1897,7 +1915,7 @@
                 <w:sz w:val="21"/>
                 <w:szCs w:val="21"/>
               </w:rPr>
-              <w:t xml:space="preserve">แผนก + จ๊อป + รายคน</w:t>
+              <w:t xml:space="preserve">เลข JR ของงาน (หรือ JR ส่วนกลาง)</w:t>
             </w:r>
           </w:p>
         </w:tc>
@@ -1905,6 +1923,92 @@
           <w:tcPr>
             <w:tcW w:type="dxa" w:w="3360"/>
             <w:shd w:fill="F2F2F2" w:color="auto" w:val="clear"/>
+            <w:tcMar>
+              <w:top w:type="dxa" w:w="80"/>
+              <w:left w:type="dxa" w:w="120"/>
+              <w:bottom w:type="dxa" w:w="80"/>
+              <w:right w:type="dxa" w:w="120"/>
+            </w:tcMar>
+          </w:tcPr>
+          <w:p>
+            <w:pPr>
+              <w:spacing w:after="0" w:line="288"/>
+            </w:pPr>
+            <w:r>
+              <w:rPr>
+                <w:rFonts w:ascii="Sarabun" w:cs="Sarabun" w:eastAsia="Sarabun" w:hAnsi="Sarabun"/>
+                <w:b w:val="false"/>
+                <w:bCs w:val="false"/>
+                <w:color w:val="1A1A1A"/>
+                <w:sz w:val="21"/>
+                <w:szCs w:val="21"/>
+              </w:rPr>
+              <w:t xml:space="preserve">รวมชั่วโมงจริงต่อ JR แยกฝั่งสำนักงาน/โรงงาน</w:t>
+            </w:r>
+          </w:p>
+        </w:tc>
+      </w:tr>
+      <w:tr>
+        <w:trPr>
+          <w:tblHeader w:val="false"/>
+        </w:trPr>
+        <w:tc>
+          <w:tcPr>
+            <w:tcW w:type="dxa" w:w="2600"/>
+            <w:tcMar>
+              <w:top w:type="dxa" w:w="80"/>
+              <w:left w:type="dxa" w:w="120"/>
+              <w:bottom w:type="dxa" w:w="80"/>
+              <w:right w:type="dxa" w:w="120"/>
+            </w:tcMar>
+          </w:tcPr>
+          <w:p>
+            <w:pPr>
+              <w:spacing w:after="0" w:line="288"/>
+            </w:pPr>
+            <w:r>
+              <w:rPr>
+                <w:rFonts w:ascii="Sarabun" w:cs="Sarabun" w:eastAsia="Sarabun" w:hAnsi="Sarabun"/>
+                <w:b w:val="false"/>
+                <w:bCs w:val="false"/>
+                <w:color w:val="1A1A1A"/>
+                <w:sz w:val="21"/>
+                <w:szCs w:val="21"/>
+              </w:rPr>
+              <w:t xml:space="preserve">ข้อมูลทั้งหมด</w:t>
+            </w:r>
+          </w:p>
+        </w:tc>
+        <w:tc>
+          <w:tcPr>
+            <w:tcW w:type="dxa" w:w="3400"/>
+            <w:tcMar>
+              <w:top w:type="dxa" w:w="80"/>
+              <w:left w:type="dxa" w:w="120"/>
+              <w:bottom w:type="dxa" w:w="80"/>
+              <w:right w:type="dxa" w:w="120"/>
+            </w:tcMar>
+          </w:tcPr>
+          <w:p>
+            <w:pPr>
+              <w:spacing w:after="0" w:line="288"/>
+            </w:pPr>
+            <w:r>
+              <w:rPr>
+                <w:rFonts w:ascii="Sarabun" w:cs="Sarabun" w:eastAsia="Sarabun" w:hAnsi="Sarabun"/>
+                <w:b w:val="false"/>
+                <w:bCs w:val="false"/>
+                <w:color w:val="1A1A1A"/>
+                <w:sz w:val="21"/>
+                <w:szCs w:val="21"/>
+              </w:rPr>
+              <w:t xml:space="preserve">แผนก + จ๊อป + รายคน</w:t>
+            </w:r>
+          </w:p>
+        </w:tc>
+        <w:tc>
+          <w:tcPr>
+            <w:tcW w:type="dxa" w:w="3360"/>
             <w:tcMar>
               <w:top w:type="dxa" w:w="80"/>
               <w:left w:type="dxa" w:w="120"/>
@@ -2909,6 +3013,195 @@
     </w:p>
     <w:p>
       <w:pPr>
+        <w:pStyle w:val="Heading2"/>
+        <w:spacing w:after="120" w:before="260"/>
+      </w:pPr>
+      <w:r>
+        <w:rPr>
+          <w:rFonts w:ascii="Sarabun" w:cs="Sarabun" w:eastAsia="Sarabun" w:hAnsi="Sarabun"/>
+          <w:b/>
+          <w:bCs/>
+          <w:color w:val="1A1A1A"/>
+          <w:sz w:val="27"/>
+          <w:szCs w:val="27"/>
+        </w:rPr>
+        <w:t xml:space="preserve">3.8 บันทึกเวลาทำงานตาม JR (เก็บชั่วโมงจริงให้บัญชี)</w:t>
+      </w:r>
+    </w:p>
+    <w:p>
+      <w:pPr>
+        <w:spacing w:after="130" w:line="330"/>
+      </w:pPr>
+      <w:r>
+        <w:rPr>
+          <w:rFonts w:ascii="Sarabun" w:cs="Sarabun" w:eastAsia="Sarabun" w:hAnsi="Sarabun"/>
+          <w:sz w:val="23"/>
+          <w:szCs w:val="23"/>
+        </w:rPr>
+        <w:t xml:space="preserve">พนักงานลงเวลาที่ทำงานให้แต่ละเลข JR — เลือก “ช่วง” เช้า/บ่าย/เต็มวัน (ระบบเติมเวลาให้อัตโนมัติ) หรือกดเลือกเวลาเริ่ม–สิ้นสุดเองก็ได้ ระบบคำนวณชั่วโมงให้ (หักพักเที่ยง). งานที่ไม่ผูกโปรเจกต์เลือก “JR ส่วนกลาง” (เช่น JR OFFICE, JR Marketing).</w:t>
+      </w:r>
+    </w:p>
+    <w:p>
+      <w:pPr>
+        <w:spacing w:after="120" w:before="120"/>
+        <w:jc w:val="center"/>
+      </w:pPr>
+      <w:r>
+        <w:drawing>
+          <wp:inline distT="0" distB="0" distL="0" distR="0">
+            <wp:extent cx="2857500" cy="4581525"/>
+            <wp:effectExtent t="0" r="0" b="0" l="0"/>
+            <wp:docPr id="1" name="" descr="" title=""/>
+            <wp:cNvGraphicFramePr>
+              <a:graphicFrameLocks xmlns:a="http://schemas.openxmlformats.org/drawingml/2006/main" noChangeAspect="1"/>
+            </wp:cNvGraphicFramePr>
+            <a:graphic xmlns:a="http://schemas.openxmlformats.org/drawingml/2006/main">
+              <a:graphicData uri="http://schemas.openxmlformats.org/drawingml/2006/picture">
+                <pic:pic xmlns:pic="http://schemas.openxmlformats.org/drawingml/2006/picture">
+                  <pic:nvPicPr>
+                    <pic:cNvPr id="0" name="" descr=""/>
+                    <pic:cNvPicPr>
+                      <a:picLocks noChangeAspect="1" noChangeArrowheads="1"/>
+                    </pic:cNvPicPr>
+                  </pic:nvPicPr>
+                  <pic:blipFill>
+                    <a:blip r:embed="rId21" cstate="none"/>
+                    <a:srcRect/>
+                    <a:stretch>
+                      <a:fillRect/>
+                    </a:stretch>
+                  </pic:blipFill>
+                  <pic:spPr bwMode="auto">
+                    <a:xfrm>
+                      <a:off x="0" y="0"/>
+                      <a:ext cx="2857500" cy="4581525"/>
+                    </a:xfrm>
+                    <a:prstGeom prst="rect">
+                      <a:avLst/>
+                    </a:prstGeom>
+                  </pic:spPr>
+                </pic:pic>
+              </a:graphicData>
+            </a:graphic>
+          </wp:inline>
+        </w:drawing>
+      </w:r>
+    </w:p>
+    <w:p>
+      <w:pPr>
+        <w:spacing w:after="220"/>
+        <w:jc w:val="center"/>
+      </w:pPr>
+      <w:r>
+        <w:rPr>
+          <w:rFonts w:ascii="Sarabun" w:cs="Sarabun" w:eastAsia="Sarabun" w:hAnsi="Sarabun"/>
+          <w:i/>
+          <w:iCs/>
+          <w:color w:val="666666"/>
+          <w:sz w:val="19"/>
+          <w:szCs w:val="19"/>
+        </w:rPr>
+        <w:t xml:space="preserve">แอปพนักงาน — เลือกช่วงเช้า/บ่าย/เต็มวัน + เลือกเวลาเอง + เลือก JR</w:t>
+      </w:r>
+    </w:p>
+    <w:p>
+      <w:r>
+        <w:br w:type="page"/>
+      </w:r>
+    </w:p>
+    <w:p>
+      <w:pPr>
+        <w:spacing w:after="130" w:line="330"/>
+      </w:pPr>
+      <w:r>
+        <w:rPr>
+          <w:rFonts w:ascii="Sarabun" w:cs="Sarabun" w:eastAsia="Sarabun" w:hAnsi="Sarabun"/>
+          <w:b/>
+          <w:bCs/>
+          <w:sz w:val="23"/>
+          <w:szCs w:val="23"/>
+        </w:rPr>
+        <w:t xml:space="preserve">ฝั่ง HR/ผู้บริหาร </w:t>
+      </w:r>
+      <w:r>
+        <w:rPr>
+          <w:rFonts w:ascii="Sarabun" w:cs="Sarabun" w:eastAsia="Sarabun" w:hAnsi="Sarabun"/>
+          <w:sz w:val="23"/>
+          <w:szCs w:val="23"/>
+        </w:rPr>
+        <w:t xml:space="preserve">ดูรวมชั่วโมงจริงต่อ JR ได้ทันที โดยแยก ฝั่งสำนักงาน / ฝั่งโรงงาน (ตั้งค่าที่บัตรพนักงาน) เพื่อให้ฝ่ายบัญชีนำชั่วโมงไปแยกคิดค่าแรงทางตรงเอง — ระบบเก็บเป็น “ชั่วโมง” เท่านั้น ไม่ตีเป็นต้นทุน. ส่งออกได้ทั้ง Excel (3 ชีท) และ CSV.</w:t>
+      </w:r>
+    </w:p>
+    <w:p>
+      <w:pPr>
+        <w:spacing w:after="120" w:before="120"/>
+        <w:jc w:val="center"/>
+      </w:pPr>
+      <w:r>
+        <w:drawing>
+          <wp:inline distT="0" distB="0" distL="0" distR="0">
+            <wp:extent cx="5715000" cy="4400550"/>
+            <wp:effectExtent t="0" r="0" b="0" l="0"/>
+            <wp:docPr id="1" name="" descr="" title=""/>
+            <wp:cNvGraphicFramePr>
+              <a:graphicFrameLocks xmlns:a="http://schemas.openxmlformats.org/drawingml/2006/main" noChangeAspect="1"/>
+            </wp:cNvGraphicFramePr>
+            <a:graphic xmlns:a="http://schemas.openxmlformats.org/drawingml/2006/main">
+              <a:graphicData uri="http://schemas.openxmlformats.org/drawingml/2006/picture">
+                <pic:pic xmlns:pic="http://schemas.openxmlformats.org/drawingml/2006/picture">
+                  <pic:nvPicPr>
+                    <pic:cNvPr id="0" name="" descr=""/>
+                    <pic:cNvPicPr>
+                      <a:picLocks noChangeAspect="1" noChangeArrowheads="1"/>
+                    </pic:cNvPicPr>
+                  </pic:nvPicPr>
+                  <pic:blipFill>
+                    <a:blip r:embed="rId22" cstate="none"/>
+                    <a:srcRect/>
+                    <a:stretch>
+                      <a:fillRect/>
+                    </a:stretch>
+                  </pic:blipFill>
+                  <pic:spPr bwMode="auto">
+                    <a:xfrm>
+                      <a:off x="0" y="0"/>
+                      <a:ext cx="5715000" cy="4400550"/>
+                    </a:xfrm>
+                    <a:prstGeom prst="rect">
+                      <a:avLst/>
+                    </a:prstGeom>
+                  </pic:spPr>
+                </pic:pic>
+              </a:graphicData>
+            </a:graphic>
+          </wp:inline>
+        </w:drawing>
+      </w:r>
+    </w:p>
+    <w:p>
+      <w:pPr>
+        <w:spacing w:after="220"/>
+        <w:jc w:val="center"/>
+      </w:pPr>
+      <w:r>
+        <w:rPr>
+          <w:rFonts w:ascii="Sarabun" w:cs="Sarabun" w:eastAsia="Sarabun" w:hAnsi="Sarabun"/>
+          <w:i/>
+          <w:iCs/>
+          <w:color w:val="666666"/>
+          <w:sz w:val="19"/>
+          <w:szCs w:val="19"/>
+        </w:rPr>
+        <w:t xml:space="preserve">แดชบอร์ด — ชั่วโมงจริงตาม JR แยกฝั่งสำนักงาน/โรงงาน + รายคน</w:t>
+      </w:r>
+    </w:p>
+    <w:p>
+      <w:r>
+        <w:br w:type="page"/>
+      </w:r>
+    </w:p>
+    <w:p>
+      <w:pPr>
         <w:pStyle w:val="Heading1"/>
         <w:spacing w:after="150" w:before="320"/>
       </w:pPr>
@@ -3522,7 +3815,7 @@
                 <w:sz w:val="21"/>
                 <w:szCs w:val="21"/>
               </w:rPr>
-              <w:t xml:space="preserve">สรุปแยกแผนก/คน/จ๊อป + ส่งออก CSV</w:t>
+              <w:t xml:space="preserve">สรุปแยกแผนก/คน/จ๊อป + ส่งออก Excel และ CSV</w:t>
             </w:r>
           </w:p>
         </w:tc>
@@ -3582,6 +3875,93 @@
                 <w:sz w:val="21"/>
                 <w:szCs w:val="21"/>
               </w:rPr>
+              <w:t xml:space="preserve">บันทึกเวลาตาม JR</w:t>
+            </w:r>
+          </w:p>
+        </w:tc>
+        <w:tc>
+          <w:tcPr>
+            <w:tcW w:type="dxa" w:w="4500"/>
+            <w:tcMar>
+              <w:top w:type="dxa" w:w="80"/>
+              <w:left w:type="dxa" w:w="120"/>
+              <w:bottom w:type="dxa" w:w="80"/>
+              <w:right w:type="dxa" w:w="120"/>
+            </w:tcMar>
+          </w:tcPr>
+          <w:p>
+            <w:pPr>
+              <w:spacing w:after="0" w:line="288"/>
+            </w:pPr>
+            <w:r>
+              <w:rPr>
+                <w:rFonts w:ascii="Sarabun" w:cs="Sarabun" w:eastAsia="Sarabun" w:hAnsi="Sarabun"/>
+                <w:b w:val="false"/>
+                <w:bCs w:val="false"/>
+                <w:color w:val="1A1A1A"/>
+                <w:sz w:val="21"/>
+                <w:szCs w:val="21"/>
+              </w:rPr>
+              <w:t xml:space="preserve">ลงชั่วโมงจริงต่อ JR (ช่วงเช้า/บ่าย/เต็มวัน หรือเลือกเวลาเอง) แยกฝั่งสำนักงาน/โรงงาน</w:t>
+            </w:r>
+          </w:p>
+        </w:tc>
+        <w:tc>
+          <w:tcPr>
+            <w:tcW w:type="dxa" w:w="2360"/>
+            <w:tcMar>
+              <w:top w:type="dxa" w:w="80"/>
+              <w:left w:type="dxa" w:w="120"/>
+              <w:bottom w:type="dxa" w:w="80"/>
+              <w:right w:type="dxa" w:w="120"/>
+            </w:tcMar>
+          </w:tcPr>
+          <w:p>
+            <w:pPr>
+              <w:spacing w:after="0" w:line="288"/>
+            </w:pPr>
+            <w:r>
+              <w:rPr>
+                <w:rFonts w:ascii="Sarabun" w:cs="Sarabun" w:eastAsia="Sarabun" w:hAnsi="Sarabun"/>
+                <w:b w:val="false"/>
+                <w:bCs w:val="false"/>
+                <w:color w:val="1A1A1A"/>
+                <w:sz w:val="21"/>
+                <w:szCs w:val="21"/>
+              </w:rPr>
+              <w:t xml:space="preserve">พนักงาน / HR / บัญชี</w:t>
+            </w:r>
+          </w:p>
+        </w:tc>
+      </w:tr>
+      <w:tr>
+        <w:trPr>
+          <w:tblHeader w:val="false"/>
+        </w:trPr>
+        <w:tc>
+          <w:tcPr>
+            <w:tcW w:type="dxa" w:w="2500"/>
+            <w:shd w:fill="F2F2F2" w:color="auto" w:val="clear"/>
+            <w:tcMar>
+              <w:top w:type="dxa" w:w="80"/>
+              <w:left w:type="dxa" w:w="120"/>
+              <w:bottom w:type="dxa" w:w="80"/>
+              <w:right w:type="dxa" w:w="120"/>
+            </w:tcMar>
+          </w:tcPr>
+          <w:p>
+            <w:pPr>
+              <w:spacing w:after="0" w:line="288"/>
+            </w:pPr>
+            <w:r>
+              <w:rPr>
+                <w:rFonts w:ascii="Sarabun" w:cs="Sarabun" w:eastAsia="Sarabun" w:hAnsi="Sarabun"/>
+                <w:b w:val="false"/>
+                <w:bCs w:val="false"/>
+                <w:color w:val="1A1A1A"/>
+                <w:sz w:val="21"/>
+                <w:szCs w:val="21"/>
+              </w:rPr>
               <w:t xml:space="preserve">จองรถ</w:t>
             </w:r>
           </w:p>
@@ -3589,6 +3969,7 @@
         <w:tc>
           <w:tcPr>
             <w:tcW w:type="dxa" w:w="4500"/>
+            <w:shd w:fill="F2F2F2" w:color="auto" w:val="clear"/>
             <w:tcMar>
               <w:top w:type="dxa" w:w="80"/>
               <w:left w:type="dxa" w:w="120"/>
@@ -3616,6 +3997,7 @@
         <w:tc>
           <w:tcPr>
             <w:tcW w:type="dxa" w:w="2360"/>
+            <w:shd w:fill="F2F2F2" w:color="auto" w:val="clear"/>
             <w:tcMar>
               <w:top w:type="dxa" w:w="80"/>
               <w:left w:type="dxa" w:w="120"/>
@@ -5243,7 +5625,7 @@
                 <w:sz w:val="21"/>
                 <w:szCs w:val="21"/>
               </w:rPr>
-              <w:t xml:space="preserve">ทะเบียนพนักงาน</w:t>
+              <w:t xml:space="preserve">เวลาตาม JR</w:t>
             </w:r>
           </w:p>
         </w:tc>
@@ -5270,7 +5652,7 @@
                 <w:sz w:val="21"/>
                 <w:szCs w:val="21"/>
               </w:rPr>
-              <w:t xml:space="preserve">ชื่อผู้ใช้, ชื่อ-สกุล, แผนก, ตำแหน่ง, ระดับสิทธิ์, หัวหน้า</w:t>
+              <w:t xml:space="preserve">พนักงาน, วันที่, เลข JR, ช่วง (เช้า/บ่าย/เต็มวัน), เวลาเริ่ม-สิ้นสุด, ชั่วโมง, ประเภท (โปรเจกต์/ส่วนกลาง)</w:t>
             </w:r>
           </w:p>
         </w:tc>
@@ -5303,7 +5685,7 @@
                 <w:sz w:val="21"/>
                 <w:szCs w:val="21"/>
               </w:rPr>
-              <w:t xml:space="preserve">รถ (Fleet)</w:t>
+              <w:t xml:space="preserve">ทะเบียนพนักงาน</w:t>
             </w:r>
           </w:p>
         </w:tc>
@@ -5331,7 +5713,7 @@
                 <w:sz w:val="21"/>
                 <w:szCs w:val="21"/>
               </w:rPr>
-              <w:t xml:space="preserve">ทะเบียน, ประเภท, จำนวนที่นั่ง, สถานะ</w:t>
+              <w:t xml:space="preserve">ชื่อผู้ใช้, ชื่อ-สกุล, แผนก, ตำแหน่ง, ฝั่ง (สำนักงาน/โรงงาน), ระดับสิทธิ์, หัวหน้า</w:t>
             </w:r>
           </w:p>
         </w:tc>
@@ -5363,6 +5745,66 @@
                 <w:sz w:val="21"/>
                 <w:szCs w:val="21"/>
               </w:rPr>
+              <w:t xml:space="preserve">รถ (Fleet)</w:t>
+            </w:r>
+          </w:p>
+        </w:tc>
+        <w:tc>
+          <w:tcPr>
+            <w:tcW w:type="dxa" w:w="6760"/>
+            <w:tcMar>
+              <w:top w:type="dxa" w:w="80"/>
+              <w:left w:type="dxa" w:w="120"/>
+              <w:bottom w:type="dxa" w:w="80"/>
+              <w:right w:type="dxa" w:w="120"/>
+            </w:tcMar>
+          </w:tcPr>
+          <w:p>
+            <w:pPr>
+              <w:spacing w:after="0" w:line="288"/>
+            </w:pPr>
+            <w:r>
+              <w:rPr>
+                <w:rFonts w:ascii="Sarabun" w:cs="Sarabun" w:eastAsia="Sarabun" w:hAnsi="Sarabun"/>
+                <w:b w:val="false"/>
+                <w:bCs w:val="false"/>
+                <w:color w:val="1A1A1A"/>
+                <w:sz w:val="21"/>
+                <w:szCs w:val="21"/>
+              </w:rPr>
+              <w:t xml:space="preserve">ทะเบียน, ประเภท, จำนวนที่นั่ง, สถานะ</w:t>
+            </w:r>
+          </w:p>
+        </w:tc>
+      </w:tr>
+      <w:tr>
+        <w:trPr>
+          <w:tblHeader w:val="false"/>
+        </w:trPr>
+        <w:tc>
+          <w:tcPr>
+            <w:tcW w:type="dxa" w:w="2600"/>
+            <w:shd w:fill="F2F2F2" w:color="auto" w:val="clear"/>
+            <w:tcMar>
+              <w:top w:type="dxa" w:w="80"/>
+              <w:left w:type="dxa" w:w="120"/>
+              <w:bottom w:type="dxa" w:w="80"/>
+              <w:right w:type="dxa" w:w="120"/>
+            </w:tcMar>
+          </w:tcPr>
+          <w:p>
+            <w:pPr>
+              <w:spacing w:after="0" w:line="288"/>
+            </w:pPr>
+            <w:r>
+              <w:rPr>
+                <w:rFonts w:ascii="Sarabun" w:cs="Sarabun" w:eastAsia="Sarabun" w:hAnsi="Sarabun"/>
+                <w:b w:val="false"/>
+                <w:bCs w:val="false"/>
+                <w:color w:val="1A1A1A"/>
+                <w:sz w:val="21"/>
+                <w:szCs w:val="21"/>
+              </w:rPr>
               <w:t xml:space="preserve">การจองรถ</w:t>
             </w:r>
           </w:p>
@@ -5370,6 +5812,7 @@
         <w:tc>
           <w:tcPr>
             <w:tcW w:type="dxa" w:w="6760"/>
+            <w:shd w:fill="F2F2F2" w:color="auto" w:val="clear"/>
             <w:tcMar>
               <w:top w:type="dxa" w:w="80"/>
               <w:left w:type="dxa" w:w="120"/>
@@ -5753,7 +6196,7 @@
           <w:sz w:val="23"/>
           <w:szCs w:val="23"/>
         </w:rPr>
-        <w:t xml:space="preserve">→ ระบบส่งออกชั่วโมงทำงานเป็น CSV เพื่อนำไปคิดเงินเดือนในระบบอื่นต่อได้</w:t>
+        <w:t xml:space="preserve">→ ระบบส่งออกชั่วโมงทำงาน (รวมชั่วโมงตาม JR แยกฝั่งสำนักงาน/โรงงาน) เป็น Excel และ CSV เพื่อให้ฝ่ายบัญชีนำไปแยกคิดค่าแรงทางตรงและคิดเงินเดือนในระบบอื่นต่อได้</w:t>
       </w:r>
     </w:p>
     <w:p>

</xml_diff>

<commit_message>
Update Word summary: add unified Hub (เมนูรวมระบบ) section
- New section 3.0: Hub landing page screenshot + description
- Section 1 lists all four systems reached from the Hub
- Tech section notes single sign-on across systems + role-gated finance/JR360

Co-Authored-By: Claude Opus 4.8 <noreply@anthropic.com>
Claude-Session: https://claude.ai/code/session_01ArsoFtzBDrJZ1pV8kUFrfD
</commit_message>
<xml_diff>
--- a/RSC-Connect-สรุประบบ.docx
+++ b/RSC-Connect-สรุประบบ.docx
@@ -915,10 +915,33 @@
       <w:r>
         <w:rPr>
           <w:rFonts w:ascii="Sarabun" w:cs="Sarabun" w:eastAsia="Sarabun" w:hAnsi="Sarabun"/>
-          <w:sz w:val="23"/>
-          <w:szCs w:val="23"/>
-        </w:rPr>
-        <w:t xml:space="preserve">ระบบแบ่งเป็น 2 ส่วนที่เชื่อมข้อมูลชุดเดียวกัน:</w:t>
+          <w:b/>
+          <w:bCs/>
+          <w:sz w:val="23"/>
+          <w:szCs w:val="23"/>
+        </w:rPr>
+        <w:t xml:space="preserve">เข้าใช้งานผ่าน “เมนูรวมระบบ” (Hub) หน้าเดียว </w:t>
+      </w:r>
+      <w:r>
+        <w:rPr>
+          <w:rFonts w:ascii="Sarabun" w:cs="Sarabun" w:eastAsia="Sarabun" w:hAnsi="Sarabun"/>
+          <w:sz w:val="23"/>
+          <w:szCs w:val="23"/>
+        </w:rPr>
+        <w:t xml:space="preserve">— ล็อกอินครั้งเดียว เห็นเฉพาะระบบที่ตัวเองมีสิทธิ์เข้าถึง แล้วคลิกเข้าแต่ละระบบได้ทันที</w:t>
+      </w:r>
+    </w:p>
+    <w:p>
+      <w:pPr>
+        <w:spacing w:after="130" w:line="330"/>
+      </w:pPr>
+      <w:r>
+        <w:rPr>
+          <w:rFonts w:ascii="Sarabun" w:cs="Sarabun" w:eastAsia="Sarabun" w:hAnsi="Sarabun"/>
+          <w:sz w:val="23"/>
+          <w:szCs w:val="23"/>
+        </w:rPr>
+        <w:t xml:space="preserve">ระบบแบ่งเป็นส่วนย่อยที่เชื่อมข้อมูลชุดเดียวกัน:</w:t>
       </w:r>
     </w:p>
     <w:p>
@@ -946,7 +969,7 @@
           <w:sz w:val="23"/>
           <w:szCs w:val="23"/>
         </w:rPr>
-        <w:t xml:space="preserve">— เช็คอิน/เช็คเอาท์ พร้อม GPS, ขอลา, ขอ OT (ติดตั้งเป็นแอปบนมือถือได้)</w:t>
+        <w:t xml:space="preserve">— เช็คอิน/เช็คเอาท์ พร้อม GPS, ขอลา, ขอ OT, บันทึกเวลาตาม JR (ติดตั้งเป็นแอปบนมือถือได้)</w:t>
       </w:r>
     </w:p>
     <w:p>
@@ -975,6 +998,62 @@
           <w:szCs w:val="23"/>
         </w:rPr>
         <w:t xml:space="preserve">— วางแผนงาน, อนุมัติ, ดูรายงาน ขาด/ลา/สาย/OT</w:t>
+      </w:r>
+    </w:p>
+    <w:p>
+      <w:pPr>
+        <w:pStyle w:val="ListParagraph"/>
+        <w:numPr>
+          <w:ilvl w:val="0"/>
+          <w:numId w:val="1"/>
+        </w:numPr>
+        <w:spacing w:after="80" w:line="312"/>
+      </w:pPr>
+      <w:r>
+        <w:rPr>
+          <w:rFonts w:ascii="Sarabun" w:cs="Sarabun" w:eastAsia="Sarabun" w:hAnsi="Sarabun"/>
+          <w:b/>
+          <w:bCs/>
+          <w:sz w:val="23"/>
+          <w:szCs w:val="23"/>
+        </w:rPr>
+        <w:t xml:space="preserve">JR 360 (ผู้บริหาร) </w:t>
+      </w:r>
+      <w:r>
+        <w:rPr>
+          <w:rFonts w:ascii="Sarabun" w:cs="Sarabun" w:eastAsia="Sarabun" w:hAnsi="Sarabun"/>
+          <w:sz w:val="23"/>
+          <w:szCs w:val="23"/>
+        </w:rPr>
+        <w:t xml:space="preserve">— ภาพรวมงานตามเลข JR เปรียบเทียบ DL งบ vs จริง</w:t>
+      </w:r>
+    </w:p>
+    <w:p>
+      <w:pPr>
+        <w:pStyle w:val="ListParagraph"/>
+        <w:numPr>
+          <w:ilvl w:val="0"/>
+          <w:numId w:val="1"/>
+        </w:numPr>
+        <w:spacing w:after="80" w:line="312"/>
+      </w:pPr>
+      <w:r>
+        <w:rPr>
+          <w:rFonts w:ascii="Sarabun" w:cs="Sarabun" w:eastAsia="Sarabun" w:hAnsi="Sarabun"/>
+          <w:b/>
+          <w:bCs/>
+          <w:sz w:val="23"/>
+          <w:szCs w:val="23"/>
+        </w:rPr>
+        <w:t xml:space="preserve">แดชบอร์ดการเงิน (เฉพาะผู้บริหาร/บัญชี) </w:t>
+      </w:r>
+      <w:r>
+        <w:rPr>
+          <w:rFonts w:ascii="Sarabun" w:cs="Sarabun" w:eastAsia="Sarabun" w:hAnsi="Sarabun"/>
+          <w:sz w:val="23"/>
+          <w:szCs w:val="23"/>
+        </w:rPr>
+        <w:t xml:space="preserve">— มีล็อกอิน+จำกัดสิทธิ์ กันข้อมูลลับ</w:t>
       </w:r>
     </w:p>
     <w:p>
@@ -2071,7 +2150,7 @@
           <w:sz w:val="27"/>
           <w:szCs w:val="27"/>
         </w:rPr>
-        <w:t xml:space="preserve">3.1 แอปมือถือพนักงาน</w:t>
+        <w:t xml:space="preserve">3.0 หน้าแรก — เมนูรวมระบบ (Hub)</w:t>
       </w:r>
     </w:p>
     <w:p>
@@ -2084,7 +2163,7 @@
           <w:sz w:val="23"/>
           <w:szCs w:val="23"/>
         </w:rPr>
-        <w:t xml:space="preserve">พนักงานเปิดจากมือถือ (ติดตั้งเป็นแอปได้ — PWA) แต่ละส่วนของหน้าจอ:</w:t>
+        <w:t xml:space="preserve">ประตูเข้าเดียวของทั้งองค์กร: ล็อกอินครั้งเดียว แล้วเห็นการ์ดของทุกระบบ — ระบบที่ไม่มีสิทธิ์จะถูกล็อก (จางลง กดไม่ได้) ตามระดับสิทธิ์ของแต่ละคน</w:t>
       </w:r>
     </w:p>
     <w:p>
@@ -2095,7 +2174,7 @@
       <w:r>
         <w:drawing>
           <wp:inline distT="0" distB="0" distL="0" distR="0">
-            <wp:extent cx="2857500" cy="1181100"/>
+            <wp:extent cx="5715000" cy="4152900"/>
             <wp:effectExtent t="0" r="0" b="0" l="0"/>
             <wp:docPr id="1" name="" descr="" title=""/>
             <wp:cNvGraphicFramePr>
@@ -2120,7 +2199,7 @@
                   <pic:spPr bwMode="auto">
                     <a:xfrm>
                       <a:off x="0" y="0"/>
-                      <a:ext cx="2857500" cy="1181100"/>
+                      <a:ext cx="5715000" cy="4152900"/>
                     </a:xfrm>
                     <a:prstGeom prst="rect">
                       <a:avLst/>
@@ -2147,7 +2226,42 @@
           <w:sz w:val="19"/>
           <w:szCs w:val="19"/>
         </w:rPr>
-        <w:t xml:space="preserve">นาฬิกา &amp; สถานะวันนี้</w:t>
+        <w:t xml:space="preserve">เมนูรวมระบบ — ลงเวลา · แดชบอร์ด HR · JR 360 · การเงิน (เข้าตามสิทธิ์)</w:t>
+      </w:r>
+    </w:p>
+    <w:p>
+      <w:r>
+        <w:br w:type="page"/>
+      </w:r>
+    </w:p>
+    <w:p>
+      <w:pPr>
+        <w:pStyle w:val="Heading2"/>
+        <w:spacing w:after="120" w:before="260"/>
+      </w:pPr>
+      <w:r>
+        <w:rPr>
+          <w:rFonts w:ascii="Sarabun" w:cs="Sarabun" w:eastAsia="Sarabun" w:hAnsi="Sarabun"/>
+          <w:b/>
+          <w:bCs/>
+          <w:color w:val="1A1A1A"/>
+          <w:sz w:val="27"/>
+          <w:szCs w:val="27"/>
+        </w:rPr>
+        <w:t xml:space="preserve">3.1 แอปมือถือพนักงาน</w:t>
+      </w:r>
+    </w:p>
+    <w:p>
+      <w:pPr>
+        <w:spacing w:after="130" w:line="330"/>
+      </w:pPr>
+      <w:r>
+        <w:rPr>
+          <w:rFonts w:ascii="Sarabun" w:cs="Sarabun" w:eastAsia="Sarabun" w:hAnsi="Sarabun"/>
+          <w:sz w:val="23"/>
+          <w:szCs w:val="23"/>
+        </w:rPr>
+        <w:t xml:space="preserve">พนักงานเปิดจากมือถือ (ติดตั้งเป็นแอปได้ — PWA) แต่ละส่วนของหน้าจอ:</w:t>
       </w:r>
     </w:p>
     <w:p>
@@ -2158,7 +2272,7 @@
       <w:r>
         <w:drawing>
           <wp:inline distT="0" distB="0" distL="0" distR="0">
-            <wp:extent cx="2857500" cy="3857625"/>
+            <wp:extent cx="2857500" cy="1181100"/>
             <wp:effectExtent t="0" r="0" b="0" l="0"/>
             <wp:docPr id="1" name="" descr="" title=""/>
             <wp:cNvGraphicFramePr>
@@ -2183,7 +2297,7 @@
                   <pic:spPr bwMode="auto">
                     <a:xfrm>
                       <a:off x="0" y="0"/>
-                      <a:ext cx="2857500" cy="3857625"/>
+                      <a:ext cx="2857500" cy="1181100"/>
                     </a:xfrm>
                     <a:prstGeom prst="rect">
                       <a:avLst/>
@@ -2210,12 +2324,7 @@
           <w:sz w:val="19"/>
           <w:szCs w:val="19"/>
         </w:rPr>
-        <w:t xml:space="preserve">เช็คอิน/เช็คเอาท์ + GPS + เลือกงานจาก Planner</w:t>
-      </w:r>
-    </w:p>
-    <w:p>
-      <w:r>
-        <w:br w:type="page"/>
+        <w:t xml:space="preserve">นาฬิกา &amp; สถานะวันนี้</w:t>
       </w:r>
     </w:p>
     <w:p>
@@ -2226,7 +2335,7 @@
       <w:r>
         <w:drawing>
           <wp:inline distT="0" distB="0" distL="0" distR="0">
-            <wp:extent cx="2857500" cy="3676650"/>
+            <wp:extent cx="2857500" cy="3857625"/>
             <wp:effectExtent t="0" r="0" b="0" l="0"/>
             <wp:docPr id="1" name="" descr="" title=""/>
             <wp:cNvGraphicFramePr>
@@ -2251,7 +2360,7 @@
                   <pic:spPr bwMode="auto">
                     <a:xfrm>
                       <a:off x="0" y="0"/>
-                      <a:ext cx="2857500" cy="3676650"/>
+                      <a:ext cx="2857500" cy="3857625"/>
                     </a:xfrm>
                     <a:prstGeom prst="rect">
                       <a:avLst/>
@@ -2278,7 +2387,12 @@
           <w:sz w:val="19"/>
           <w:szCs w:val="19"/>
         </w:rPr>
-        <w:t xml:space="preserve">ขอลางาน + ดูสถานะการอนุมัติ</w:t>
+        <w:t xml:space="preserve">เช็คอิน/เช็คเอาท์ + GPS + เลือกงานจาก Planner</w:t>
+      </w:r>
+    </w:p>
+    <w:p>
+      <w:r>
+        <w:br w:type="page"/>
       </w:r>
     </w:p>
     <w:p>
@@ -2341,7 +2455,7 @@
           <w:sz w:val="19"/>
           <w:szCs w:val="19"/>
         </w:rPr>
-        <w:t xml:space="preserve">ขอ OT ล่วงหน้า (อ้างอิงงาน Planner)</w:t>
+        <w:t xml:space="preserve">ขอลางาน + ดูสถานะการอนุมัติ</w:t>
       </w:r>
     </w:p>
     <w:p>
@@ -2352,7 +2466,7 @@
       <w:r>
         <w:drawing>
           <wp:inline distT="0" distB="0" distL="0" distR="0">
-            <wp:extent cx="2857500" cy="4429125"/>
+            <wp:extent cx="2857500" cy="3676650"/>
             <wp:effectExtent t="0" r="0" b="0" l="0"/>
             <wp:docPr id="1" name="" descr="" title=""/>
             <wp:cNvGraphicFramePr>
@@ -2377,7 +2491,7 @@
                   <pic:spPr bwMode="auto">
                     <a:xfrm>
                       <a:off x="0" y="0"/>
-                      <a:ext cx="2857500" cy="4429125"/>
+                      <a:ext cx="2857500" cy="3676650"/>
                     </a:xfrm>
                     <a:prstGeom prst="rect">
                       <a:avLst/>
@@ -2404,42 +2518,7 @@
           <w:sz w:val="19"/>
           <w:szCs w:val="19"/>
         </w:rPr>
-        <w:t xml:space="preserve">จองรถ — ระบบแสดงเฉพาะรถที่ว่างในช่วงเวลานั้น</w:t>
-      </w:r>
-    </w:p>
-    <w:p>
-      <w:r>
-        <w:br w:type="page"/>
-      </w:r>
-    </w:p>
-    <w:p>
-      <w:pPr>
-        <w:pStyle w:val="Heading2"/>
-        <w:spacing w:after="120" w:before="260"/>
-      </w:pPr>
-      <w:r>
-        <w:rPr>
-          <w:rFonts w:ascii="Sarabun" w:cs="Sarabun" w:eastAsia="Sarabun" w:hAnsi="Sarabun"/>
-          <w:b/>
-          <w:bCs/>
-          <w:color w:val="1A1A1A"/>
-          <w:sz w:val="27"/>
-          <w:szCs w:val="27"/>
-        </w:rPr>
-        <w:t xml:space="preserve">3.2 แดชบอร์ด HR — ภาพรวมวันนี้</w:t>
-      </w:r>
-    </w:p>
-    <w:p>
-      <w:pPr>
-        <w:spacing w:after="130" w:line="330"/>
-      </w:pPr>
-      <w:r>
-        <w:rPr>
-          <w:rFonts w:ascii="Sarabun" w:cs="Sarabun" w:eastAsia="Sarabun" w:hAnsi="Sarabun"/>
-          <w:sz w:val="23"/>
-          <w:szCs w:val="23"/>
-        </w:rPr>
-        <w:t xml:space="preserve">สรุปเรียลไทม์: เข้างานแล้วกี่คน, มาสายกี่คน, ลากี่คน, ยังไม่เข้ากี่คน พร้อมสถานะรายคน (ตรงเวลา/สาย/ทำงานอยู่)</w:t>
+        <w:t xml:space="preserve">ขอ OT ล่วงหน้า (อ้างอิงงาน Planner)</w:t>
       </w:r>
     </w:p>
     <w:p>
@@ -2450,7 +2529,7 @@
       <w:r>
         <w:drawing>
           <wp:inline distT="0" distB="0" distL="0" distR="0">
-            <wp:extent cx="5715000" cy="4019550"/>
+            <wp:extent cx="2857500" cy="4429125"/>
             <wp:effectExtent t="0" r="0" b="0" l="0"/>
             <wp:docPr id="1" name="" descr="" title=""/>
             <wp:cNvGraphicFramePr>
@@ -2475,7 +2554,7 @@
                   <pic:spPr bwMode="auto">
                     <a:xfrm>
                       <a:off x="0" y="0"/>
-                      <a:ext cx="5715000" cy="4019550"/>
+                      <a:ext cx="2857500" cy="4429125"/>
                     </a:xfrm>
                     <a:prstGeom prst="rect">
                       <a:avLst/>
@@ -2502,7 +2581,7 @@
           <w:sz w:val="19"/>
           <w:szCs w:val="19"/>
         </w:rPr>
-        <w:t xml:space="preserve">แดชบอร์ด HR — แท็บ “วันนี้”</w:t>
+        <w:t xml:space="preserve">จองรถ — ระบบแสดงเฉพาะรถที่ว่างในช่วงเวลานั้น</w:t>
       </w:r>
     </w:p>
     <w:p>
@@ -2524,7 +2603,20 @@
           <w:sz w:val="27"/>
           <w:szCs w:val="27"/>
         </w:rPr>
-        <w:t xml:space="preserve">3.3 Planner — วางแผน &amp; มอบหมายงาน</w:t>
+        <w:t xml:space="preserve">3.2 แดชบอร์ด HR — ภาพรวมวันนี้</w:t>
+      </w:r>
+    </w:p>
+    <w:p>
+      <w:pPr>
+        <w:spacing w:after="130" w:line="330"/>
+      </w:pPr>
+      <w:r>
+        <w:rPr>
+          <w:rFonts w:ascii="Sarabun" w:cs="Sarabun" w:eastAsia="Sarabun" w:hAnsi="Sarabun"/>
+          <w:sz w:val="23"/>
+          <w:szCs w:val="23"/>
+        </w:rPr>
+        <w:t xml:space="preserve">สรุปเรียลไทม์: เข้างานแล้วกี่คน, มาสายกี่คน, ลากี่คน, ยังไม่เข้ากี่คน พร้อมสถานะรายคน (ตรงเวลา/สาย/ทำงานอยู่)</w:t>
       </w:r>
     </w:p>
     <w:p>
@@ -2535,7 +2627,7 @@
       <w:r>
         <w:drawing>
           <wp:inline distT="0" distB="0" distL="0" distR="0">
-            <wp:extent cx="5715000" cy="4305300"/>
+            <wp:extent cx="5715000" cy="4019550"/>
             <wp:effectExtent t="0" r="0" b="0" l="0"/>
             <wp:docPr id="1" name="" descr="" title=""/>
             <wp:cNvGraphicFramePr>
@@ -2560,7 +2652,7 @@
                   <pic:spPr bwMode="auto">
                     <a:xfrm>
                       <a:off x="0" y="0"/>
-                      <a:ext cx="5715000" cy="4305300"/>
+                      <a:ext cx="5715000" cy="4019550"/>
                     </a:xfrm>
                     <a:prstGeom prst="rect">
                       <a:avLst/>
@@ -2587,7 +2679,7 @@
           <w:sz w:val="19"/>
           <w:szCs w:val="19"/>
         </w:rPr>
-        <w:t xml:space="preserve">เพิ่มงาน + มอบหมายให้พนักงานรายคน + พิกัดไซต์งาน</w:t>
+        <w:t xml:space="preserve">แดชบอร์ด HR — แท็บ “วันนี้”</w:t>
       </w:r>
     </w:p>
     <w:p>
@@ -2609,7 +2701,7 @@
           <w:sz w:val="27"/>
           <w:szCs w:val="27"/>
         </w:rPr>
-        <w:t xml:space="preserve">3.4 คิวอนุมัติ — ลา &amp; OT (2 ลำดับ)</w:t>
+        <w:t xml:space="preserve">3.3 Planner — วางแผน &amp; มอบหมายงาน</w:t>
       </w:r>
     </w:p>
     <w:p>
@@ -2620,7 +2712,7 @@
       <w:r>
         <w:drawing>
           <wp:inline distT="0" distB="0" distL="0" distR="0">
-            <wp:extent cx="5715000" cy="4019550"/>
+            <wp:extent cx="5715000" cy="4305300"/>
             <wp:effectExtent t="0" r="0" b="0" l="0"/>
             <wp:docPr id="1" name="" descr="" title=""/>
             <wp:cNvGraphicFramePr>
@@ -2645,7 +2737,7 @@
                   <pic:spPr bwMode="auto">
                     <a:xfrm>
                       <a:off x="0" y="0"/>
-                      <a:ext cx="5715000" cy="4019550"/>
+                      <a:ext cx="5715000" cy="4305300"/>
                     </a:xfrm>
                     <a:prstGeom prst="rect">
                       <a:avLst/>
@@ -2672,7 +2764,7 @@
           <w:sz w:val="19"/>
           <w:szCs w:val="19"/>
         </w:rPr>
-        <w:t xml:space="preserve">หัวหน้า/ผู้จัดการเห็นเฉพาะรายการที่ตัวเองต้องอนุมัติ</w:t>
+        <w:t xml:space="preserve">เพิ่มงาน + มอบหมายให้พนักงานรายคน + พิกัดไซต์งาน</w:t>
       </w:r>
     </w:p>
     <w:p>
@@ -2694,7 +2786,7 @@
           <w:sz w:val="27"/>
           <w:szCs w:val="27"/>
         </w:rPr>
-        <w:t xml:space="preserve">3.5 รายงาน — ขาด/ลา/มาสาย/ชั่วโมง</w:t>
+        <w:t xml:space="preserve">3.4 คิวอนุมัติ — ลา &amp; OT (2 ลำดับ)</w:t>
       </w:r>
     </w:p>
     <w:p>
@@ -2705,7 +2797,7 @@
       <w:r>
         <w:drawing>
           <wp:inline distT="0" distB="0" distL="0" distR="0">
-            <wp:extent cx="5715000" cy="5438775"/>
+            <wp:extent cx="5715000" cy="4019550"/>
             <wp:effectExtent t="0" r="0" b="0" l="0"/>
             <wp:docPr id="1" name="" descr="" title=""/>
             <wp:cNvGraphicFramePr>
@@ -2730,7 +2822,7 @@
                   <pic:spPr bwMode="auto">
                     <a:xfrm>
                       <a:off x="0" y="0"/>
-                      <a:ext cx="5715000" cy="5438775"/>
+                      <a:ext cx="5715000" cy="4019550"/>
                     </a:xfrm>
                     <a:prstGeom prst="rect">
                       <a:avLst/>
@@ -2757,7 +2849,7 @@
           <w:sz w:val="19"/>
           <w:szCs w:val="19"/>
         </w:rPr>
-        <w:t xml:space="preserve">สรุปรายเดือน แยกรายคน · แผนก · จ๊อป (แสดงเป็นชั่วโมง ไม่มีเงิน)</w:t>
+        <w:t xml:space="preserve">หัวหน้า/ผู้จัดการเห็นเฉพาะรายการที่ตัวเองต้องอนุมัติ</w:t>
       </w:r>
     </w:p>
     <w:p>
@@ -2779,7 +2871,7 @@
           <w:sz w:val="27"/>
           <w:szCs w:val="27"/>
         </w:rPr>
-        <w:t xml:space="preserve">3.6 วันลาคงเหลือ &amp; ทะเบียนพนักงาน</w:t>
+        <w:t xml:space="preserve">3.5 รายงาน — ขาด/ลา/มาสาย/ชั่วโมง</w:t>
       </w:r>
     </w:p>
     <w:p>
@@ -2790,7 +2882,7 @@
       <w:r>
         <w:drawing>
           <wp:inline distT="0" distB="0" distL="0" distR="0">
-            <wp:extent cx="5715000" cy="4257675"/>
+            <wp:extent cx="5715000" cy="5438775"/>
             <wp:effectExtent t="0" r="0" b="0" l="0"/>
             <wp:docPr id="1" name="" descr="" title=""/>
             <wp:cNvGraphicFramePr>
@@ -2815,7 +2907,7 @@
                   <pic:spPr bwMode="auto">
                     <a:xfrm>
                       <a:off x="0" y="0"/>
-                      <a:ext cx="5715000" cy="4257675"/>
+                      <a:ext cx="5715000" cy="5438775"/>
                     </a:xfrm>
                     <a:prstGeom prst="rect">
                       <a:avLst/>
@@ -2842,7 +2934,29 @@
           <w:sz w:val="19"/>
           <w:szCs w:val="19"/>
         </w:rPr>
-        <w:t xml:space="preserve">วันลาคงเหลือรายคน (ใช้ไป/โควตา)</w:t>
+        <w:t xml:space="preserve">สรุปรายเดือน แยกรายคน · แผนก · จ๊อป (แสดงเป็นชั่วโมง ไม่มีเงิน)</w:t>
+      </w:r>
+    </w:p>
+    <w:p>
+      <w:r>
+        <w:br w:type="page"/>
+      </w:r>
+    </w:p>
+    <w:p>
+      <w:pPr>
+        <w:pStyle w:val="Heading2"/>
+        <w:spacing w:after="120" w:before="260"/>
+      </w:pPr>
+      <w:r>
+        <w:rPr>
+          <w:rFonts w:ascii="Sarabun" w:cs="Sarabun" w:eastAsia="Sarabun" w:hAnsi="Sarabun"/>
+          <w:b/>
+          <w:bCs/>
+          <w:color w:val="1A1A1A"/>
+          <w:sz w:val="27"/>
+          <w:szCs w:val="27"/>
+        </w:rPr>
+        <w:t xml:space="preserve">3.6 วันลาคงเหลือ &amp; ทะเบียนพนักงาน</w:t>
       </w:r>
     </w:p>
     <w:p>
@@ -2853,7 +2967,7 @@
       <w:r>
         <w:drawing>
           <wp:inline distT="0" distB="0" distL="0" distR="0">
-            <wp:extent cx="5715000" cy="4019550"/>
+            <wp:extent cx="5715000" cy="4257675"/>
             <wp:effectExtent t="0" r="0" b="0" l="0"/>
             <wp:docPr id="1" name="" descr="" title=""/>
             <wp:cNvGraphicFramePr>
@@ -2878,7 +2992,7 @@
                   <pic:spPr bwMode="auto">
                     <a:xfrm>
                       <a:off x="0" y="0"/>
-                      <a:ext cx="5715000" cy="4019550"/>
+                      <a:ext cx="5715000" cy="4257675"/>
                     </a:xfrm>
                     <a:prstGeom prst="rect">
                       <a:avLst/>
@@ -2905,42 +3019,7 @@
           <w:sz w:val="19"/>
           <w:szCs w:val="19"/>
         </w:rPr>
-        <w:t xml:space="preserve">ทะเบียนพนักงาน: ระดับสิทธิ์ + หัวหน้าโดยตรง</w:t>
-      </w:r>
-    </w:p>
-    <w:p>
-      <w:r>
-        <w:br w:type="page"/>
-      </w:r>
-    </w:p>
-    <w:p>
-      <w:pPr>
-        <w:pStyle w:val="Heading2"/>
-        <w:spacing w:after="120" w:before="260"/>
-      </w:pPr>
-      <w:r>
-        <w:rPr>
-          <w:rFonts w:ascii="Sarabun" w:cs="Sarabun" w:eastAsia="Sarabun" w:hAnsi="Sarabun"/>
-          <w:b/>
-          <w:bCs/>
-          <w:color w:val="1A1A1A"/>
-          <w:sz w:val="27"/>
-          <w:szCs w:val="27"/>
-        </w:rPr>
-        <w:t xml:space="preserve">3.7 จองรถ (แดชบอร์ด)</w:t>
-      </w:r>
-    </w:p>
-    <w:p>
-      <w:pPr>
-        <w:spacing w:after="130" w:line="330"/>
-      </w:pPr>
-      <w:r>
-        <w:rPr>
-          <w:rFonts w:ascii="Sarabun" w:cs="Sarabun" w:eastAsia="Sarabun" w:hAnsi="Sarabun"/>
-          <w:sz w:val="23"/>
-          <w:szCs w:val="23"/>
-        </w:rPr>
-        <w:t xml:space="preserve">จองแบบมาก่อนได้ก่อน • ระบบกันเวลาชนกันอัตโนมัติ • ผู้ดูแลรถ “ย้ายรถ” (สลับให้คันว่าง) หรือ “ยกเลิก” ได้</w:t>
+        <w:t xml:space="preserve">วันลาคงเหลือรายคน (ใช้ไป/โควตา)</w:t>
       </w:r>
     </w:p>
     <w:p>
@@ -3003,7 +3082,7 @@
           <w:sz w:val="19"/>
           <w:szCs w:val="19"/>
         </w:rPr>
-        <w:t xml:space="preserve">ทะเบียนรถ + ตารางการจอง + ย้าย/ยกเลิก</w:t>
+        <w:t xml:space="preserve">ทะเบียนพนักงาน: ระดับสิทธิ์ + หัวหน้าโดยตรง</w:t>
       </w:r>
     </w:p>
     <w:p>
@@ -3025,7 +3104,7 @@
           <w:sz w:val="27"/>
           <w:szCs w:val="27"/>
         </w:rPr>
-        <w:t xml:space="preserve">3.8 บันทึกเวลาทำงานตาม JR (เก็บชั่วโมงจริงให้บัญชี)</w:t>
+        <w:t xml:space="preserve">3.7 จองรถ (แดชบอร์ด)</w:t>
       </w:r>
     </w:p>
     <w:p>
@@ -3038,7 +3117,7 @@
           <w:sz w:val="23"/>
           <w:szCs w:val="23"/>
         </w:rPr>
-        <w:t xml:space="preserve">พนักงานลงเวลาที่ทำงานให้แต่ละเลข JR — เลือก “ช่วง” เช้า/บ่าย/เต็มวัน (ระบบเติมเวลาให้อัตโนมัติ) หรือกดเลือกเวลาเริ่ม–สิ้นสุดเองก็ได้ ระบบคำนวณชั่วโมงให้ (หักพักเที่ยง). งานที่ไม่ผูกโปรเจกต์เลือก “JR ส่วนกลาง” (เช่น JR OFFICE, JR Marketing).</w:t>
+        <w:t xml:space="preserve">จองแบบมาก่อนได้ก่อน • ระบบกันเวลาชนกันอัตโนมัติ • ผู้ดูแลรถ “ย้ายรถ” (สลับให้คันว่าง) หรือ “ยกเลิก” ได้</w:t>
       </w:r>
     </w:p>
     <w:p>
@@ -3049,7 +3128,7 @@
       <w:r>
         <w:drawing>
           <wp:inline distT="0" distB="0" distL="0" distR="0">
-            <wp:extent cx="2857500" cy="4581525"/>
+            <wp:extent cx="5715000" cy="4019550"/>
             <wp:effectExtent t="0" r="0" b="0" l="0"/>
             <wp:docPr id="1" name="" descr="" title=""/>
             <wp:cNvGraphicFramePr>
@@ -3074,7 +3153,7 @@
                   <pic:spPr bwMode="auto">
                     <a:xfrm>
                       <a:off x="0" y="0"/>
-                      <a:ext cx="2857500" cy="4581525"/>
+                      <a:ext cx="5715000" cy="4019550"/>
                     </a:xfrm>
                     <a:prstGeom prst="rect">
                       <a:avLst/>
@@ -3101,7 +3180,7 @@
           <w:sz w:val="19"/>
           <w:szCs w:val="19"/>
         </w:rPr>
-        <w:t xml:space="preserve">แอปพนักงาน — เลือกช่วงเช้า/บ่าย/เต็มวัน + เลือกเวลาเอง + เลือก JR</w:t>
+        <w:t xml:space="preserve">ทะเบียนรถ + ตารางการจอง + ย้าย/ยกเลิก</w:t>
       </w:r>
     </w:p>
     <w:p>
@@ -3111,25 +3190,32 @@
     </w:p>
     <w:p>
       <w:pPr>
-        <w:spacing w:after="130" w:line="330"/>
+        <w:pStyle w:val="Heading2"/>
+        <w:spacing w:after="120" w:before="260"/>
       </w:pPr>
       <w:r>
         <w:rPr>
           <w:rFonts w:ascii="Sarabun" w:cs="Sarabun" w:eastAsia="Sarabun" w:hAnsi="Sarabun"/>
           <w:b/>
           <w:bCs/>
-          <w:sz w:val="23"/>
-          <w:szCs w:val="23"/>
-        </w:rPr>
-        <w:t xml:space="preserve">ฝั่ง HR/ผู้บริหาร </w:t>
-      </w:r>
-      <w:r>
-        <w:rPr>
-          <w:rFonts w:ascii="Sarabun" w:cs="Sarabun" w:eastAsia="Sarabun" w:hAnsi="Sarabun"/>
-          <w:sz w:val="23"/>
-          <w:szCs w:val="23"/>
-        </w:rPr>
-        <w:t xml:space="preserve">ดูรวมชั่วโมงจริงต่อ JR ได้ทันที โดยแยก ฝั่งสำนักงาน / ฝั่งโรงงาน (ตั้งค่าที่บัตรพนักงาน) เพื่อให้ฝ่ายบัญชีนำชั่วโมงไปแยกคิดค่าแรงทางตรงเอง — ระบบเก็บเป็น “ชั่วโมง” เท่านั้น ไม่ตีเป็นต้นทุน. ส่งออกได้ทั้ง Excel (3 ชีท) และ CSV.</w:t>
+          <w:color w:val="1A1A1A"/>
+          <w:sz w:val="27"/>
+          <w:szCs w:val="27"/>
+        </w:rPr>
+        <w:t xml:space="preserve">3.8 บันทึกเวลาทำงานตาม JR (เก็บชั่วโมงจริงให้บัญชี)</w:t>
+      </w:r>
+    </w:p>
+    <w:p>
+      <w:pPr>
+        <w:spacing w:after="130" w:line="330"/>
+      </w:pPr>
+      <w:r>
+        <w:rPr>
+          <w:rFonts w:ascii="Sarabun" w:cs="Sarabun" w:eastAsia="Sarabun" w:hAnsi="Sarabun"/>
+          <w:sz w:val="23"/>
+          <w:szCs w:val="23"/>
+        </w:rPr>
+        <w:t xml:space="preserve">พนักงานลงเวลาที่ทำงานให้แต่ละเลข JR — เลือก “ช่วง” เช้า/บ่าย/เต็มวัน (ระบบเติมเวลาให้อัตโนมัติ) หรือกดเลือกเวลาเริ่ม–สิ้นสุดเองก็ได้ ระบบคำนวณชั่วโมงให้ (หักพักเที่ยง). งานที่ไม่ผูกโปรเจกต์เลือก “JR ส่วนกลาง” (เช่น JR OFFICE, JR Marketing).</w:t>
       </w:r>
     </w:p>
     <w:p>
@@ -3140,7 +3226,7 @@
       <w:r>
         <w:drawing>
           <wp:inline distT="0" distB="0" distL="0" distR="0">
-            <wp:extent cx="5715000" cy="4400550"/>
+            <wp:extent cx="2857500" cy="4581525"/>
             <wp:effectExtent t="0" r="0" b="0" l="0"/>
             <wp:docPr id="1" name="" descr="" title=""/>
             <wp:cNvGraphicFramePr>
@@ -3165,6 +3251,97 @@
                   <pic:spPr bwMode="auto">
                     <a:xfrm>
                       <a:off x="0" y="0"/>
+                      <a:ext cx="2857500" cy="4581525"/>
+                    </a:xfrm>
+                    <a:prstGeom prst="rect">
+                      <a:avLst/>
+                    </a:prstGeom>
+                  </pic:spPr>
+                </pic:pic>
+              </a:graphicData>
+            </a:graphic>
+          </wp:inline>
+        </w:drawing>
+      </w:r>
+    </w:p>
+    <w:p>
+      <w:pPr>
+        <w:spacing w:after="220"/>
+        <w:jc w:val="center"/>
+      </w:pPr>
+      <w:r>
+        <w:rPr>
+          <w:rFonts w:ascii="Sarabun" w:cs="Sarabun" w:eastAsia="Sarabun" w:hAnsi="Sarabun"/>
+          <w:i/>
+          <w:iCs/>
+          <w:color w:val="666666"/>
+          <w:sz w:val="19"/>
+          <w:szCs w:val="19"/>
+        </w:rPr>
+        <w:t xml:space="preserve">แอปพนักงาน — เลือกช่วงเช้า/บ่าย/เต็มวัน + เลือกเวลาเอง + เลือก JR</w:t>
+      </w:r>
+    </w:p>
+    <w:p>
+      <w:r>
+        <w:br w:type="page"/>
+      </w:r>
+    </w:p>
+    <w:p>
+      <w:pPr>
+        <w:spacing w:after="130" w:line="330"/>
+      </w:pPr>
+      <w:r>
+        <w:rPr>
+          <w:rFonts w:ascii="Sarabun" w:cs="Sarabun" w:eastAsia="Sarabun" w:hAnsi="Sarabun"/>
+          <w:b/>
+          <w:bCs/>
+          <w:sz w:val="23"/>
+          <w:szCs w:val="23"/>
+        </w:rPr>
+        <w:t xml:space="preserve">ฝั่ง HR/ผู้บริหาร </w:t>
+      </w:r>
+      <w:r>
+        <w:rPr>
+          <w:rFonts w:ascii="Sarabun" w:cs="Sarabun" w:eastAsia="Sarabun" w:hAnsi="Sarabun"/>
+          <w:sz w:val="23"/>
+          <w:szCs w:val="23"/>
+        </w:rPr>
+        <w:t xml:space="preserve">ดูรวมชั่วโมงจริงต่อ JR ได้ทันที โดยแยก ฝั่งสำนักงาน / ฝั่งโรงงาน (ตั้งค่าที่บัตรพนักงาน) เพื่อให้ฝ่ายบัญชีนำชั่วโมงไปแยกคิดค่าแรงทางตรงเอง — ระบบเก็บเป็น “ชั่วโมง” เท่านั้น ไม่ตีเป็นต้นทุน. ส่งออกได้ทั้ง Excel (3 ชีท) และ CSV.</w:t>
+      </w:r>
+    </w:p>
+    <w:p>
+      <w:pPr>
+        <w:spacing w:after="120" w:before="120"/>
+        <w:jc w:val="center"/>
+      </w:pPr>
+      <w:r>
+        <w:drawing>
+          <wp:inline distT="0" distB="0" distL="0" distR="0">
+            <wp:extent cx="5715000" cy="4400550"/>
+            <wp:effectExtent t="0" r="0" b="0" l="0"/>
+            <wp:docPr id="1" name="" descr="" title=""/>
+            <wp:cNvGraphicFramePr>
+              <a:graphicFrameLocks xmlns:a="http://schemas.openxmlformats.org/drawingml/2006/main" noChangeAspect="1"/>
+            </wp:cNvGraphicFramePr>
+            <a:graphic xmlns:a="http://schemas.openxmlformats.org/drawingml/2006/main">
+              <a:graphicData uri="http://schemas.openxmlformats.org/drawingml/2006/picture">
+                <pic:pic xmlns:pic="http://schemas.openxmlformats.org/drawingml/2006/picture">
+                  <pic:nvPicPr>
+                    <pic:cNvPr id="0" name="" descr=""/>
+                    <pic:cNvPicPr>
+                      <a:picLocks noChangeAspect="1" noChangeArrowheads="1"/>
+                    </pic:cNvPicPr>
+                  </pic:nvPicPr>
+                  <pic:blipFill>
+                    <a:blip r:embed="rId23" cstate="none"/>
+                    <a:srcRect/>
+                    <a:stretch>
+                      <a:fillRect/>
+                    </a:stretch>
+                  </pic:blipFill>
+                  <pic:spPr bwMode="auto">
+                    <a:xfrm>
+                      <a:off x="0" y="0"/>
                       <a:ext cx="5715000" cy="4400550"/>
                     </a:xfrm>
                     <a:prstGeom prst="rect">
@@ -4745,7 +4922,7 @@
                     </pic:cNvPicPr>
                   </pic:nvPicPr>
                   <pic:blipFill>
-                    <a:blip r:embed="rId19" cstate="none"/>
+                    <a:blip r:embed="rId20" cstate="none"/>
                     <a:srcRect/>
                     <a:stretch>
                       <a:fillRect/>
@@ -5988,7 +6165,35 @@
           <w:sz w:val="23"/>
           <w:szCs w:val="23"/>
         </w:rPr>
-        <w:t xml:space="preserve">ใช้ชื่อเล่น/รหัสพนักงาน (ไม่ต้องมีอีเมลบริษัท)</w:t>
+        <w:t xml:space="preserve">ใช้ชื่อเล่น/รหัสพนักงาน (ไม่ต้องมีอีเมลบริษัท) — ล็อกอินครั้งเดียวใช้ได้ทุกระบบผ่านเมนูรวม (Hub)</w:t>
+      </w:r>
+    </w:p>
+    <w:p>
+      <w:pPr>
+        <w:pStyle w:val="ListParagraph"/>
+        <w:numPr>
+          <w:ilvl w:val="0"/>
+          <w:numId w:val="1"/>
+        </w:numPr>
+        <w:spacing w:after="80" w:line="312"/>
+      </w:pPr>
+      <w:r>
+        <w:rPr>
+          <w:rFonts w:ascii="Sarabun" w:cs="Sarabun" w:eastAsia="Sarabun" w:hAnsi="Sarabun"/>
+          <w:b/>
+          <w:bCs/>
+          <w:sz w:val="23"/>
+          <w:szCs w:val="23"/>
+        </w:rPr>
+        <w:t xml:space="preserve">ควบคุมสิทธิ์: </w:t>
+      </w:r>
+      <w:r>
+        <w:rPr>
+          <w:rFonts w:ascii="Sarabun" w:cs="Sarabun" w:eastAsia="Sarabun" w:hAnsi="Sarabun"/>
+          <w:sz w:val="23"/>
+          <w:szCs w:val="23"/>
+        </w:rPr>
+        <w:t xml:space="preserve">เมนูรวมแสดงเฉพาะระบบที่แต่ละคนมีสิทธิ์ · แดชบอร์ดการเงินและ JR 360 จำกัดเฉพาะผู้บริหาร/บัญชี</w:t>
       </w:r>
     </w:p>
     <w:p>

</xml_diff>

<commit_message>
Update Word summary: payroll (HR), OT rates, holidays, require-JR
Adds section 3.9 (HR payroll: normal/OT×1/×1.5/×3 + salary + Business Plus
export), require-JR note in 3.8, OT-rate and public-holiday rows in the
policy table, rsc_payroll in the data table, and HR-only salary note.

Co-Authored-By: Claude Opus 4.8 <noreply@anthropic.com>
Claude-Session: https://claude.ai/code/session_01ArsoFtzBDrJZ1pV8kUFrfD
</commit_message>
<xml_diff>
--- a/RSC-Connect-สรุประบบ.docx
+++ b/RSC-Connect-สรุประบบ.docx
@@ -3373,6 +3373,285 @@
       </w:r>
     </w:p>
     <w:p>
+      <w:pPr>
+        <w:spacing w:after="130" w:line="330"/>
+      </w:pPr>
+      <w:r>
+        <w:rPr>
+          <w:rFonts w:ascii="Sarabun" w:cs="Sarabun" w:eastAsia="Sarabun" w:hAnsi="Sarabun"/>
+          <w:b/>
+          <w:bCs/>
+          <w:sz w:val="23"/>
+          <w:szCs w:val="23"/>
+        </w:rPr>
+        <w:t xml:space="preserve">บังคับลง JR: </w:t>
+      </w:r>
+      <w:r>
+        <w:rPr>
+          <w:rFonts w:ascii="Sarabun" w:cs="Sarabun" w:eastAsia="Sarabun" w:hAnsi="Sarabun"/>
+          <w:sz w:val="23"/>
+          <w:szCs w:val="23"/>
+        </w:rPr>
+        <w:t xml:space="preserve">ตั้งค่าให้พนักงาน “ต้องบันทึกเวลาตาม JR ก่อนเช็คเอาท์” ได้ (งานออฟฟิศเลือก JR OFFICE) • ลงย้อนหลังได้ · แก้ไข/ลบรายการของตัวเองได้ · ลงวันอนาคตไม่ได้</w:t>
+      </w:r>
+    </w:p>
+    <w:p>
+      <w:r>
+        <w:br w:type="page"/>
+      </w:r>
+    </w:p>
+    <w:p>
+      <w:pPr>
+        <w:pStyle w:val="Heading2"/>
+        <w:spacing w:after="120" w:before="260"/>
+      </w:pPr>
+      <w:r>
+        <w:rPr>
+          <w:rFonts w:ascii="Sarabun" w:cs="Sarabun" w:eastAsia="Sarabun" w:hAnsi="Sarabun"/>
+          <w:b/>
+          <w:bCs/>
+          <w:color w:val="1A1A1A"/>
+          <w:sz w:val="27"/>
+          <w:szCs w:val="27"/>
+        </w:rPr>
+        <w:t xml:space="preserve">3.9 สรุปเงินเดือน &amp; ชั่วโมง (เฉพาะ HR)</w:t>
+      </w:r>
+    </w:p>
+    <w:p>
+      <w:pPr>
+        <w:spacing w:after="130" w:line="330"/>
+      </w:pPr>
+      <w:r>
+        <w:rPr>
+          <w:rFonts w:ascii="Sarabun" w:cs="Sarabun" w:eastAsia="Sarabun" w:hAnsi="Sarabun"/>
+          <w:sz w:val="23"/>
+          <w:szCs w:val="23"/>
+        </w:rPr>
+        <w:t xml:space="preserve">เมนูนี้เห็นเฉพาะ HR — สรุปชั่วโมงรายคนแยกตามอัตราค่าแรง พร้อมเงินเดือน เพื่อส่งออกไปคิดจริงต่อในโปรแกรมเงินเดือน (Business Plus)</w:t>
+      </w:r>
+    </w:p>
+    <w:p>
+      <w:pPr>
+        <w:pStyle w:val="ListParagraph"/>
+        <w:numPr>
+          <w:ilvl w:val="0"/>
+          <w:numId w:val="1"/>
+        </w:numPr>
+        <w:spacing w:after="80" w:line="312"/>
+      </w:pPr>
+      <w:r>
+        <w:rPr>
+          <w:rFonts w:ascii="Sarabun" w:cs="Sarabun" w:eastAsia="Sarabun" w:hAnsi="Sarabun"/>
+          <w:b/>
+          <w:bCs/>
+          <w:sz w:val="23"/>
+          <w:szCs w:val="23"/>
+        </w:rPr>
+        <w:t xml:space="preserve">ชม.ปกติ </w:t>
+      </w:r>
+      <w:r>
+        <w:rPr>
+          <w:rFonts w:ascii="Sarabun" w:cs="Sarabun" w:eastAsia="Sarabun" w:hAnsi="Sarabun"/>
+          <w:sz w:val="23"/>
+          <w:szCs w:val="23"/>
+        </w:rPr>
+        <w:t xml:space="preserve">— ชั่วโมงจริงจากเช็คอินวันทำงาน (ไม่เกิน 8 ชม./วัน)</w:t>
+      </w:r>
+    </w:p>
+    <w:p>
+      <w:pPr>
+        <w:pStyle w:val="ListParagraph"/>
+        <w:numPr>
+          <w:ilvl w:val="0"/>
+          <w:numId w:val="1"/>
+        </w:numPr>
+        <w:spacing w:after="80" w:line="312"/>
+      </w:pPr>
+      <w:r>
+        <w:rPr>
+          <w:rFonts w:ascii="Sarabun" w:cs="Sarabun" w:eastAsia="Sarabun" w:hAnsi="Sarabun"/>
+          <w:b/>
+          <w:bCs/>
+          <w:sz w:val="23"/>
+          <w:szCs w:val="23"/>
+        </w:rPr>
+        <w:t xml:space="preserve">OT ×1.5 </w:t>
+      </w:r>
+      <w:r>
+        <w:rPr>
+          <w:rFonts w:ascii="Sarabun" w:cs="Sarabun" w:eastAsia="Sarabun" w:hAnsi="Sarabun"/>
+          <w:sz w:val="23"/>
+          <w:szCs w:val="23"/>
+        </w:rPr>
+        <w:t xml:space="preserve">— OT วันทำงาน (จ–ศ)</w:t>
+      </w:r>
+    </w:p>
+    <w:p>
+      <w:pPr>
+        <w:pStyle w:val="ListParagraph"/>
+        <w:numPr>
+          <w:ilvl w:val="0"/>
+          <w:numId w:val="1"/>
+        </w:numPr>
+        <w:spacing w:after="80" w:line="312"/>
+      </w:pPr>
+      <w:r>
+        <w:rPr>
+          <w:rFonts w:ascii="Sarabun" w:cs="Sarabun" w:eastAsia="Sarabun" w:hAnsi="Sarabun"/>
+          <w:b/>
+          <w:bCs/>
+          <w:sz w:val="23"/>
+          <w:szCs w:val="23"/>
+        </w:rPr>
+        <w:t xml:space="preserve">OT ×1 </w:t>
+      </w:r>
+      <w:r>
+        <w:rPr>
+          <w:rFonts w:ascii="Sarabun" w:cs="Sarabun" w:eastAsia="Sarabun" w:hAnsi="Sarabun"/>
+          <w:sz w:val="23"/>
+          <w:szCs w:val="23"/>
+        </w:rPr>
+        <w:t xml:space="preserve">— เสาร์/อาทิตย์ ช่วงเวลาปกติ (≤ 8 ชม.)</w:t>
+      </w:r>
+    </w:p>
+    <w:p>
+      <w:pPr>
+        <w:pStyle w:val="ListParagraph"/>
+        <w:numPr>
+          <w:ilvl w:val="0"/>
+          <w:numId w:val="1"/>
+        </w:numPr>
+        <w:spacing w:after="80" w:line="312"/>
+      </w:pPr>
+      <w:r>
+        <w:rPr>
+          <w:rFonts w:ascii="Sarabun" w:cs="Sarabun" w:eastAsia="Sarabun" w:hAnsi="Sarabun"/>
+          <w:b/>
+          <w:bCs/>
+          <w:sz w:val="23"/>
+          <w:szCs w:val="23"/>
+        </w:rPr>
+        <w:t xml:space="preserve">OT ×3 </w:t>
+      </w:r>
+      <w:r>
+        <w:rPr>
+          <w:rFonts w:ascii="Sarabun" w:cs="Sarabun" w:eastAsia="Sarabun" w:hAnsi="Sarabun"/>
+          <w:sz w:val="23"/>
+          <w:szCs w:val="23"/>
+        </w:rPr>
+        <w:t xml:space="preserve">— เสาร์/อาทิตย์ส่วนที่เกิน 8 ชม. และวันหยุดนักขัตฤกษ์ทั้งหมด</w:t>
+      </w:r>
+    </w:p>
+    <w:p>
+      <w:pPr>
+        <w:spacing w:after="120" w:before="120"/>
+        <w:jc w:val="center"/>
+      </w:pPr>
+      <w:r>
+        <w:drawing>
+          <wp:inline distT="0" distB="0" distL="0" distR="0">
+            <wp:extent cx="5715000" cy="2809875"/>
+            <wp:effectExtent t="0" r="0" b="0" l="0"/>
+            <wp:docPr id="1" name="" descr="" title=""/>
+            <wp:cNvGraphicFramePr>
+              <a:graphicFrameLocks xmlns:a="http://schemas.openxmlformats.org/drawingml/2006/main" noChangeAspect="1"/>
+            </wp:cNvGraphicFramePr>
+            <a:graphic xmlns:a="http://schemas.openxmlformats.org/drawingml/2006/main">
+              <a:graphicData uri="http://schemas.openxmlformats.org/drawingml/2006/picture">
+                <pic:pic xmlns:pic="http://schemas.openxmlformats.org/drawingml/2006/picture">
+                  <pic:nvPicPr>
+                    <pic:cNvPr id="0" name="" descr=""/>
+                    <pic:cNvPicPr>
+                      <a:picLocks noChangeAspect="1" noChangeArrowheads="1"/>
+                    </pic:cNvPicPr>
+                  </pic:nvPicPr>
+                  <pic:blipFill>
+                    <a:blip r:embed="rId24" cstate="none"/>
+                    <a:srcRect/>
+                    <a:stretch>
+                      <a:fillRect/>
+                    </a:stretch>
+                  </pic:blipFill>
+                  <pic:spPr bwMode="auto">
+                    <a:xfrm>
+                      <a:off x="0" y="0"/>
+                      <a:ext cx="5715000" cy="2809875"/>
+                    </a:xfrm>
+                    <a:prstGeom prst="rect">
+                      <a:avLst/>
+                    </a:prstGeom>
+                  </pic:spPr>
+                </pic:pic>
+              </a:graphicData>
+            </a:graphic>
+          </wp:inline>
+        </w:drawing>
+      </w:r>
+    </w:p>
+    <w:p>
+      <w:pPr>
+        <w:spacing w:after="220"/>
+        <w:jc w:val="center"/>
+      </w:pPr>
+      <w:r>
+        <w:rPr>
+          <w:rFonts w:ascii="Sarabun" w:cs="Sarabun" w:eastAsia="Sarabun" w:hAnsi="Sarabun"/>
+          <w:i/>
+          <w:iCs/>
+          <w:color w:val="666666"/>
+          <w:sz w:val="19"/>
+          <w:szCs w:val="19"/>
+        </w:rPr>
+        <w:t xml:space="preserve">สรุปเงินเดือน &amp; ชั่วโมง (HR) — ปกติ / OT×1 / OT×1.5 / OT×3 + เงินเดือน + ส่งออก Excel/CSV</w:t>
+      </w:r>
+    </w:p>
+    <w:p>
+      <w:pPr>
+        <w:spacing w:after="130" w:line="330"/>
+      </w:pPr>
+      <w:r>
+        <w:rPr>
+          <w:rFonts w:ascii="Sarabun" w:cs="Sarabun" w:eastAsia="Sarabun" w:hAnsi="Sarabun"/>
+          <w:b/>
+          <w:bCs/>
+          <w:sz w:val="23"/>
+          <w:szCs w:val="23"/>
+        </w:rPr>
+        <w:t xml:space="preserve">ความปลอดภัยข้อมูลเงินเดือน: </w:t>
+      </w:r>
+      <w:r>
+        <w:rPr>
+          <w:rFonts w:ascii="Sarabun" w:cs="Sarabun" w:eastAsia="Sarabun" w:hAnsi="Sarabun"/>
+          <w:sz w:val="23"/>
+          <w:szCs w:val="23"/>
+        </w:rPr>
+        <w:t xml:space="preserve">เก็บแยกจากทะเบียนพนักงาน (คนละชุดข้อมูล) และเห็นเฉพาะ HR — ผู้จัดการ/ผู้อำนวยการเข้าไม่ถึง</w:t>
+      </w:r>
+    </w:p>
+    <w:p>
+      <w:pPr>
+        <w:spacing w:after="130" w:line="330"/>
+      </w:pPr>
+      <w:r>
+        <w:rPr>
+          <w:rFonts w:ascii="Sarabun" w:cs="Sarabun" w:eastAsia="Sarabun" w:hAnsi="Sarabun"/>
+          <w:b/>
+          <w:bCs/>
+          <w:sz w:val="23"/>
+          <w:szCs w:val="23"/>
+        </w:rPr>
+        <w:t xml:space="preserve">ส่งออก: </w:t>
+      </w:r>
+      <w:r>
+        <w:rPr>
+          <w:rFonts w:ascii="Sarabun" w:cs="Sarabun" w:eastAsia="Sarabun" w:hAnsi="Sarabun"/>
+          <w:sz w:val="23"/>
+          <w:szCs w:val="23"/>
+        </w:rPr>
+        <w:t xml:space="preserve">Excel 3 ชีท (ชั่วโมง · เงินเดือน · รวม) และ CSV (ชั่วโมง/เงิน/รวม) — นำเข้า Business Plus รายบุคคลได้ทันที</w:t>
+      </w:r>
+    </w:p>
+    <w:p>
       <w:r>
         <w:br w:type="page"/>
       </w:r>
@@ -4079,7 +4358,7 @@
                 <w:sz w:val="21"/>
                 <w:szCs w:val="21"/>
               </w:rPr>
-              <w:t xml:space="preserve">ลงชั่วโมงจริงต่อ JR (ช่วงเช้า/บ่าย/เต็มวัน หรือเลือกเวลาเอง) แยกฝั่งสำนักงาน/โรงงาน</w:t>
+              <w:t xml:space="preserve">ลงชั่วโมงจริงต่อ JR (ช่วงเช้า/บ่าย/เต็มวัน หรือเลือกเวลาเอง) แยกฝั่งสำนักงาน/โรงงาน · บังคับลงก่อนเช็คเอาท์ได้</w:t>
             </w:r>
           </w:p>
         </w:tc>
@@ -4139,7 +4418,7 @@
                 <w:sz w:val="21"/>
                 <w:szCs w:val="21"/>
               </w:rPr>
-              <w:t xml:space="preserve">จองรถ</w:t>
+              <w:t xml:space="preserve">สรุปเงินเดือน &amp; ชั่วโมง</w:t>
             </w:r>
           </w:p>
         </w:tc>
@@ -4167,7 +4446,7 @@
                 <w:sz w:val="21"/>
                 <w:szCs w:val="21"/>
               </w:rPr>
-              <w:t xml:space="preserve">จองรถบริษัทตามช่วงเวลา ผูกกับงาน กันเวลาชนกัน ผู้ดูแลย้าย/ยกเลิกได้</w:t>
+              <w:t xml:space="preserve">แยก ชม.ปกติ / OT×1 / OT×1.5 / OT×3 + เงินเดือน → ส่งออก Business Plus (เห็นเฉพาะ HR)</w:t>
             </w:r>
           </w:p>
         </w:tc>
@@ -4175,6 +4454,92 @@
           <w:tcPr>
             <w:tcW w:type="dxa" w:w="2360"/>
             <w:shd w:fill="F2F2F2" w:color="auto" w:val="clear"/>
+            <w:tcMar>
+              <w:top w:type="dxa" w:w="80"/>
+              <w:left w:type="dxa" w:w="120"/>
+              <w:bottom w:type="dxa" w:w="80"/>
+              <w:right w:type="dxa" w:w="120"/>
+            </w:tcMar>
+          </w:tcPr>
+          <w:p>
+            <w:pPr>
+              <w:spacing w:after="0" w:line="288"/>
+            </w:pPr>
+            <w:r>
+              <w:rPr>
+                <w:rFonts w:ascii="Sarabun" w:cs="Sarabun" w:eastAsia="Sarabun" w:hAnsi="Sarabun"/>
+                <w:b w:val="false"/>
+                <w:bCs w:val="false"/>
+                <w:color w:val="1A1A1A"/>
+                <w:sz w:val="21"/>
+                <w:szCs w:val="21"/>
+              </w:rPr>
+              <w:t xml:space="preserve">HR</w:t>
+            </w:r>
+          </w:p>
+        </w:tc>
+      </w:tr>
+      <w:tr>
+        <w:trPr>
+          <w:tblHeader w:val="false"/>
+        </w:trPr>
+        <w:tc>
+          <w:tcPr>
+            <w:tcW w:type="dxa" w:w="2500"/>
+            <w:tcMar>
+              <w:top w:type="dxa" w:w="80"/>
+              <w:left w:type="dxa" w:w="120"/>
+              <w:bottom w:type="dxa" w:w="80"/>
+              <w:right w:type="dxa" w:w="120"/>
+            </w:tcMar>
+          </w:tcPr>
+          <w:p>
+            <w:pPr>
+              <w:spacing w:after="0" w:line="288"/>
+            </w:pPr>
+            <w:r>
+              <w:rPr>
+                <w:rFonts w:ascii="Sarabun" w:cs="Sarabun" w:eastAsia="Sarabun" w:hAnsi="Sarabun"/>
+                <w:b w:val="false"/>
+                <w:bCs w:val="false"/>
+                <w:color w:val="1A1A1A"/>
+                <w:sz w:val="21"/>
+                <w:szCs w:val="21"/>
+              </w:rPr>
+              <w:t xml:space="preserve">จองรถ</w:t>
+            </w:r>
+          </w:p>
+        </w:tc>
+        <w:tc>
+          <w:tcPr>
+            <w:tcW w:type="dxa" w:w="4500"/>
+            <w:tcMar>
+              <w:top w:type="dxa" w:w="80"/>
+              <w:left w:type="dxa" w:w="120"/>
+              <w:bottom w:type="dxa" w:w="80"/>
+              <w:right w:type="dxa" w:w="120"/>
+            </w:tcMar>
+          </w:tcPr>
+          <w:p>
+            <w:pPr>
+              <w:spacing w:after="0" w:line="288"/>
+            </w:pPr>
+            <w:r>
+              <w:rPr>
+                <w:rFonts w:ascii="Sarabun" w:cs="Sarabun" w:eastAsia="Sarabun" w:hAnsi="Sarabun"/>
+                <w:b w:val="false"/>
+                <w:bCs w:val="false"/>
+                <w:color w:val="1A1A1A"/>
+                <w:sz w:val="21"/>
+                <w:szCs w:val="21"/>
+              </w:rPr>
+              <w:t xml:space="preserve">จองรถบริษัทตามช่วงเวลา ผูกกับงาน กันเวลาชนกัน ผู้ดูแลย้าย/ยกเลิกได้</w:t>
+            </w:r>
+          </w:p>
+        </w:tc>
+        <w:tc>
+          <w:tcPr>
+            <w:tcW w:type="dxa" w:w="2360"/>
             <w:tcMar>
               <w:top w:type="dxa" w:w="80"/>
               <w:left w:type="dxa" w:w="120"/>
@@ -4795,6 +5160,29 @@
           <w:szCs w:val="23"/>
         </w:rPr>
         <w:t xml:space="preserve">พนักงานยื่น → รอ ลำดับ 1 (หัวหน้างาน) → รอ ลำดับ 2 (ผู้จัดการ/HR) → อนุมัติแล้ว โดยมีบันทึกว่าใครอนุมัติลำดับไหน</w:t>
+      </w:r>
+    </w:p>
+    <w:p>
+      <w:pPr>
+        <w:spacing w:after="130" w:line="330"/>
+      </w:pPr>
+      <w:r>
+        <w:rPr>
+          <w:rFonts w:ascii="Sarabun" w:cs="Sarabun" w:eastAsia="Sarabun" w:hAnsi="Sarabun"/>
+          <w:b/>
+          <w:bCs/>
+          <w:sz w:val="23"/>
+          <w:szCs w:val="23"/>
+        </w:rPr>
+        <w:t xml:space="preserve">ข้อมูลเงินเดือน: </w:t>
+      </w:r>
+      <w:r>
+        <w:rPr>
+          <w:rFonts w:ascii="Sarabun" w:cs="Sarabun" w:eastAsia="Sarabun" w:hAnsi="Sarabun"/>
+          <w:sz w:val="23"/>
+          <w:szCs w:val="23"/>
+        </w:rPr>
+        <w:t xml:space="preserve">เห็นเฉพาะ HR เท่านั้น (ผู้จัดการ/ผู้อำนวยการเข้าไม่ถึง) และเก็บแยกจากข้อมูลอื่น</w:t>
       </w:r>
     </w:p>
     <w:p>
@@ -5322,6 +5710,246 @@
                 <w:sz w:val="21"/>
                 <w:szCs w:val="21"/>
               </w:rPr>
+              <w:t xml:space="preserve">อัตรา OT</w:t>
+            </w:r>
+          </w:p>
+        </w:tc>
+        <w:tc>
+          <w:tcPr>
+            <w:tcW w:type="dxa" w:w="4680"/>
+            <w:tcMar>
+              <w:top w:type="dxa" w:w="80"/>
+              <w:left w:type="dxa" w:w="120"/>
+              <w:bottom w:type="dxa" w:w="80"/>
+              <w:right w:type="dxa" w:w="120"/>
+            </w:tcMar>
+          </w:tcPr>
+          <w:p>
+            <w:pPr>
+              <w:spacing w:after="0" w:line="288"/>
+            </w:pPr>
+            <w:r>
+              <w:rPr>
+                <w:rFonts w:ascii="Sarabun" w:cs="Sarabun" w:eastAsia="Sarabun" w:hAnsi="Sarabun"/>
+                <w:b w:val="false"/>
+                <w:bCs w:val="false"/>
+                <w:color w:val="1A1A1A"/>
+                <w:sz w:val="21"/>
+                <w:szCs w:val="21"/>
+              </w:rPr>
+              <w:t xml:space="preserve">วันทำงาน ×1.5 · เสาร์/อาทิตย์ ×1 (≤8 ชม.) และ ×3 (ส่วนเกิน) · นักขัตฤกษ์ ×3</w:t>
+            </w:r>
+          </w:p>
+        </w:tc>
+      </w:tr>
+      <w:tr>
+        <w:trPr>
+          <w:tblHeader w:val="false"/>
+        </w:trPr>
+        <w:tc>
+          <w:tcPr>
+            <w:tcW w:type="dxa" w:w="4680"/>
+            <w:shd w:fill="F2F2F2" w:color="auto" w:val="clear"/>
+            <w:tcMar>
+              <w:top w:type="dxa" w:w="80"/>
+              <w:left w:type="dxa" w:w="120"/>
+              <w:bottom w:type="dxa" w:w="80"/>
+              <w:right w:type="dxa" w:w="120"/>
+            </w:tcMar>
+          </w:tcPr>
+          <w:p>
+            <w:pPr>
+              <w:spacing w:after="0" w:line="288"/>
+            </w:pPr>
+            <w:r>
+              <w:rPr>
+                <w:rFonts w:ascii="Sarabun" w:cs="Sarabun" w:eastAsia="Sarabun" w:hAnsi="Sarabun"/>
+                <w:b w:val="false"/>
+                <w:bCs w:val="false"/>
+                <w:color w:val="1A1A1A"/>
+                <w:sz w:val="21"/>
+                <w:szCs w:val="21"/>
+              </w:rPr>
+              <w:t xml:space="preserve">วันหยุดนักขัตฤกษ์</w:t>
+            </w:r>
+          </w:p>
+        </w:tc>
+        <w:tc>
+          <w:tcPr>
+            <w:tcW w:type="dxa" w:w="4680"/>
+            <w:shd w:fill="F2F2F2" w:color="auto" w:val="clear"/>
+            <w:tcMar>
+              <w:top w:type="dxa" w:w="80"/>
+              <w:left w:type="dxa" w:w="120"/>
+              <w:bottom w:type="dxa" w:w="80"/>
+              <w:right w:type="dxa" w:w="120"/>
+            </w:tcMar>
+          </w:tcPr>
+          <w:p>
+            <w:pPr>
+              <w:spacing w:after="0" w:line="288"/>
+            </w:pPr>
+            <w:r>
+              <w:rPr>
+                <w:rFonts w:ascii="Sarabun" w:cs="Sarabun" w:eastAsia="Sarabun" w:hAnsi="Sarabun"/>
+                <w:b w:val="false"/>
+                <w:bCs w:val="false"/>
+                <w:color w:val="1A1A1A"/>
+                <w:sz w:val="21"/>
+                <w:szCs w:val="21"/>
+              </w:rPr>
+              <w:t xml:space="preserve">14 วัน/ปี (ตามประกาศ HR) — OT ×3 และไม่นับขาดงาน</w:t>
+            </w:r>
+          </w:p>
+        </w:tc>
+      </w:tr>
+      <w:tr>
+        <w:trPr>
+          <w:tblHeader w:val="false"/>
+        </w:trPr>
+        <w:tc>
+          <w:tcPr>
+            <w:tcW w:type="dxa" w:w="4680"/>
+            <w:tcMar>
+              <w:top w:type="dxa" w:w="80"/>
+              <w:left w:type="dxa" w:w="120"/>
+              <w:bottom w:type="dxa" w:w="80"/>
+              <w:right w:type="dxa" w:w="120"/>
+            </w:tcMar>
+          </w:tcPr>
+          <w:p>
+            <w:pPr>
+              <w:spacing w:after="0" w:line="288"/>
+            </w:pPr>
+            <w:r>
+              <w:rPr>
+                <w:rFonts w:ascii="Sarabun" w:cs="Sarabun" w:eastAsia="Sarabun" w:hAnsi="Sarabun"/>
+                <w:b w:val="false"/>
+                <w:bCs w:val="false"/>
+                <w:color w:val="1A1A1A"/>
+                <w:sz w:val="21"/>
+                <w:szCs w:val="21"/>
+              </w:rPr>
+              <w:t xml:space="preserve">ค่าจ้าง/ชม. (คำนวณ OT)</w:t>
+            </w:r>
+          </w:p>
+        </w:tc>
+        <w:tc>
+          <w:tcPr>
+            <w:tcW w:type="dxa" w:w="4680"/>
+            <w:tcMar>
+              <w:top w:type="dxa" w:w="80"/>
+              <w:left w:type="dxa" w:w="120"/>
+              <w:bottom w:type="dxa" w:w="80"/>
+              <w:right w:type="dxa" w:w="120"/>
+            </w:tcMar>
+          </w:tcPr>
+          <w:p>
+            <w:pPr>
+              <w:spacing w:after="0" w:line="288"/>
+            </w:pPr>
+            <w:r>
+              <w:rPr>
+                <w:rFonts w:ascii="Sarabun" w:cs="Sarabun" w:eastAsia="Sarabun" w:hAnsi="Sarabun"/>
+                <w:b w:val="false"/>
+                <w:bCs w:val="false"/>
+                <w:color w:val="1A1A1A"/>
+                <w:sz w:val="21"/>
+                <w:szCs w:val="21"/>
+              </w:rPr>
+              <w:t xml:space="preserve">เงินเดือน ÷ 240 (30 วัน × 8 ชม.)</w:t>
+            </w:r>
+          </w:p>
+        </w:tc>
+      </w:tr>
+      <w:tr>
+        <w:trPr>
+          <w:tblHeader w:val="false"/>
+        </w:trPr>
+        <w:tc>
+          <w:tcPr>
+            <w:tcW w:type="dxa" w:w="4680"/>
+            <w:shd w:fill="F2F2F2" w:color="auto" w:val="clear"/>
+            <w:tcMar>
+              <w:top w:type="dxa" w:w="80"/>
+              <w:left w:type="dxa" w:w="120"/>
+              <w:bottom w:type="dxa" w:w="80"/>
+              <w:right w:type="dxa" w:w="120"/>
+            </w:tcMar>
+          </w:tcPr>
+          <w:p>
+            <w:pPr>
+              <w:spacing w:after="0" w:line="288"/>
+            </w:pPr>
+            <w:r>
+              <w:rPr>
+                <w:rFonts w:ascii="Sarabun" w:cs="Sarabun" w:eastAsia="Sarabun" w:hAnsi="Sarabun"/>
+                <w:b w:val="false"/>
+                <w:bCs w:val="false"/>
+                <w:color w:val="1A1A1A"/>
+                <w:sz w:val="21"/>
+                <w:szCs w:val="21"/>
+              </w:rPr>
+              <w:t xml:space="preserve">บังคับลง JR</w:t>
+            </w:r>
+          </w:p>
+        </w:tc>
+        <w:tc>
+          <w:tcPr>
+            <w:tcW w:type="dxa" w:w="4680"/>
+            <w:shd w:fill="F2F2F2" w:color="auto" w:val="clear"/>
+            <w:tcMar>
+              <w:top w:type="dxa" w:w="80"/>
+              <w:left w:type="dxa" w:w="120"/>
+              <w:bottom w:type="dxa" w:w="80"/>
+              <w:right w:type="dxa" w:w="120"/>
+            </w:tcMar>
+          </w:tcPr>
+          <w:p>
+            <w:pPr>
+              <w:spacing w:after="0" w:line="288"/>
+            </w:pPr>
+            <w:r>
+              <w:rPr>
+                <w:rFonts w:ascii="Sarabun" w:cs="Sarabun" w:eastAsia="Sarabun" w:hAnsi="Sarabun"/>
+                <w:b w:val="false"/>
+                <w:bCs w:val="false"/>
+                <w:color w:val="1A1A1A"/>
+                <w:sz w:val="21"/>
+                <w:szCs w:val="21"/>
+              </w:rPr>
+              <w:t xml:space="preserve">เปิด/ปิดได้ — เปิด = ต้องบันทึกเวลาตาม JR ก่อนเช็คเอาท์</w:t>
+            </w:r>
+          </w:p>
+        </w:tc>
+      </w:tr>
+      <w:tr>
+        <w:trPr>
+          <w:tblHeader w:val="false"/>
+        </w:trPr>
+        <w:tc>
+          <w:tcPr>
+            <w:tcW w:type="dxa" w:w="4680"/>
+            <w:tcMar>
+              <w:top w:type="dxa" w:w="80"/>
+              <w:left w:type="dxa" w:w="120"/>
+              <w:bottom w:type="dxa" w:w="80"/>
+              <w:right w:type="dxa" w:w="120"/>
+            </w:tcMar>
+          </w:tcPr>
+          <w:p>
+            <w:pPr>
+              <w:spacing w:after="0" w:line="288"/>
+            </w:pPr>
+            <w:r>
+              <w:rPr>
+                <w:rFonts w:ascii="Sarabun" w:cs="Sarabun" w:eastAsia="Sarabun" w:hAnsi="Sarabun"/>
+                <w:b w:val="false"/>
+                <w:bCs w:val="false"/>
+                <w:color w:val="1A1A1A"/>
+                <w:sz w:val="21"/>
+                <w:szCs w:val="21"/>
+              </w:rPr>
               <w:t xml:space="preserve">โควตาลา/ปี</w:t>
             </w:r>
           </w:p>
@@ -5922,7 +6550,7 @@
                 <w:sz w:val="21"/>
                 <w:szCs w:val="21"/>
               </w:rPr>
-              <w:t xml:space="preserve">รถ (Fleet)</w:t>
+              <w:t xml:space="preserve">เงินเดือน (เฉพาะ HR)</w:t>
             </w:r>
           </w:p>
         </w:tc>
@@ -5949,7 +6577,7 @@
                 <w:sz w:val="21"/>
                 <w:szCs w:val="21"/>
               </w:rPr>
-              <w:t xml:space="preserve">ทะเบียน, ประเภท, จำนวนที่นั่ง, สถานะ</w:t>
+              <w:t xml:space="preserve">ชื่อพนักงาน, เงินเดือน — เก็บแยกต่างหาก เห็นเฉพาะ HR (ไม่มีเงินในชุดข้อมูลอื่น)</w:t>
             </w:r>
           </w:p>
         </w:tc>
@@ -5982,7 +6610,7 @@
                 <w:sz w:val="21"/>
                 <w:szCs w:val="21"/>
               </w:rPr>
-              <w:t xml:space="preserve">การจองรถ</w:t>
+              <w:t xml:space="preserve">รถ (Fleet)</w:t>
             </w:r>
           </w:p>
         </w:tc>
@@ -5990,6 +6618,65 @@
           <w:tcPr>
             <w:tcW w:type="dxa" w:w="6760"/>
             <w:shd w:fill="F2F2F2" w:color="auto" w:val="clear"/>
+            <w:tcMar>
+              <w:top w:type="dxa" w:w="80"/>
+              <w:left w:type="dxa" w:w="120"/>
+              <w:bottom w:type="dxa" w:w="80"/>
+              <w:right w:type="dxa" w:w="120"/>
+            </w:tcMar>
+          </w:tcPr>
+          <w:p>
+            <w:pPr>
+              <w:spacing w:after="0" w:line="288"/>
+            </w:pPr>
+            <w:r>
+              <w:rPr>
+                <w:rFonts w:ascii="Sarabun" w:cs="Sarabun" w:eastAsia="Sarabun" w:hAnsi="Sarabun"/>
+                <w:b w:val="false"/>
+                <w:bCs w:val="false"/>
+                <w:color w:val="1A1A1A"/>
+                <w:sz w:val="21"/>
+                <w:szCs w:val="21"/>
+              </w:rPr>
+              <w:t xml:space="preserve">ทะเบียน, ประเภท, จำนวนที่นั่ง, สถานะ</w:t>
+            </w:r>
+          </w:p>
+        </w:tc>
+      </w:tr>
+      <w:tr>
+        <w:trPr>
+          <w:tblHeader w:val="false"/>
+        </w:trPr>
+        <w:tc>
+          <w:tcPr>
+            <w:tcW w:type="dxa" w:w="2600"/>
+            <w:tcMar>
+              <w:top w:type="dxa" w:w="80"/>
+              <w:left w:type="dxa" w:w="120"/>
+              <w:bottom w:type="dxa" w:w="80"/>
+              <w:right w:type="dxa" w:w="120"/>
+            </w:tcMar>
+          </w:tcPr>
+          <w:p>
+            <w:pPr>
+              <w:spacing w:after="0" w:line="288"/>
+            </w:pPr>
+            <w:r>
+              <w:rPr>
+                <w:rFonts w:ascii="Sarabun" w:cs="Sarabun" w:eastAsia="Sarabun" w:hAnsi="Sarabun"/>
+                <w:b w:val="false"/>
+                <w:bCs w:val="false"/>
+                <w:color w:val="1A1A1A"/>
+                <w:sz w:val="21"/>
+                <w:szCs w:val="21"/>
+              </w:rPr>
+              <w:t xml:space="preserve">การจองรถ</w:t>
+            </w:r>
+          </w:p>
+        </w:tc>
+        <w:tc>
+          <w:tcPr>
+            <w:tcW w:type="dxa" w:w="6760"/>
             <w:tcMar>
               <w:top w:type="dxa" w:w="80"/>
               <w:left w:type="dxa" w:w="120"/>
@@ -6350,7 +7037,7 @@
           <w:sz w:val="23"/>
           <w:szCs w:val="23"/>
         </w:rPr>
-        <w:t xml:space="preserve">ระบบนี้โฟกัสที่ “เวลาทำงานและการมอบหมายงาน” ส่วนงานด้านการเงิน/ภาษี เป็นคนละระบบ:</w:t>
+        <w:t xml:space="preserve">ระบบนี้โฟกัสที่ “เวลาทำงาน การมอบหมายงาน และการเตรียมข้อมูลให้ฝ่ายบุคคล/บัญชี” — ยังไม่ใช่ระบบเงินเดือน/ภาษีเต็มรูปแบบ:</w:t>
       </w:r>
     </w:p>
     <w:p>
@@ -6368,7 +7055,7 @@
           <w:sz w:val="23"/>
           <w:szCs w:val="23"/>
         </w:rPr>
-        <w:t xml:space="preserve">ไม่รวม: คำนวณเงินเดือน / OT เป็นเงิน / สลิปเงินเดือน</w:t>
+        <w:t xml:space="preserve">ระบบสรุป ชั่วโมง (ปกติ/OT ตามอัตรา) และคำนวณค่า OT + เงินเดือนแบบ “ประมาณการ” ให้ HR — เห็นเฉพาะ HR</w:t>
       </w:r>
     </w:p>
     <w:p>
@@ -6386,7 +7073,7 @@
           <w:sz w:val="23"/>
           <w:szCs w:val="23"/>
         </w:rPr>
-        <w:t xml:space="preserve">ไม่รวม: ภาษี (ภ.ง.ด.), ประกันสังคม, กองทุนสำรองเลี้ยงชีพ</w:t>
+        <w:t xml:space="preserve">ไม่รวม: การออกสลิปเงินเดือน, ภาษี (ภ.ง.ด.), ประกันสังคม, กองทุนสำรองเลี้ยงชีพ — ทำต่อในโปรแกรมเงินเดือน (Business Plus)</w:t>
       </w:r>
     </w:p>
     <w:p>
@@ -6401,7 +7088,7 @@
           <w:sz w:val="23"/>
           <w:szCs w:val="23"/>
         </w:rPr>
-        <w:t xml:space="preserve">→ ระบบส่งออกชั่วโมงทำงาน (รวมชั่วโมงตาม JR แยกฝั่งสำนักงาน/โรงงาน) เป็น Excel และ CSV เพื่อให้ฝ่ายบัญชีนำไปแยกคิดค่าแรงทางตรงและคิดเงินเดือนในระบบอื่นต่อได้</w:t>
+        <w:t xml:space="preserve">→ ระบบส่งออกชั่วโมง (แยก ปกติ/OT×1/OT×1.5/OT×3, ตาม JR, แยกฝั่งสำนักงาน/โรงงาน) และตัวเลขเงินเดือน เป็น Excel และ CSV เพื่อนำเข้า Business Plus รายบุคคลได้ทันที</w:t>
       </w:r>
     </w:p>
     <w:p>

</xml_diff>